<commit_message>
docs: rewrite and update complete user manual and teacher guide 2027 for all new modules
</commit_message>
<xml_diff>
--- a/Class_Management_System_Teacher_Guide_2027.docx
+++ b/Class_Management_System_Teacher_Guide_2027.docx
@@ -78,9 +78,9 @@
                 <w:sz w:val="32"/>
                 <w:rFonts w:ascii="Khmer OS Muol Light" w:hAnsi="Khmer OS Muol Light" w:cs="Khmer OS Muol Light"/>
               </w:rPr>
-              <w:t>សៀវភៅមគ្គទេសក៍ និងមេរៀនលម្អិត</w:t>
+              <w:t>សៀវភៅមគ្គទេសក៍ និងមេរៀនណែនាំលម្អិត</w:t>
               <w:br/>
-              <w:t>ស្តីពីការចូលប្រើប្រាស់ និងគ្រប់គ្រងប្រព័ន្ធ</w:t>
+              <w:t>ស្តីពីការចូលប្រើប្រាស់ និងគ្រប់គ្រងប្រព័ន្ធសាថ្មី</w:t>
               <w:br/>
             </w:r>
             <w:r>
@@ -92,7 +92,7 @@
                 <w:sz w:val="24"/>
                 <w:rFonts w:ascii="Khmer OS Battambang" w:hAnsi="Khmer OS Battambang" w:cs="Khmer OS Battambang"/>
               </w:rPr>
-              <w:t>សម្រាប់លោកគ្រូ-អ្នកគ្រូបង្រៀន និងគណៈគ្រប់គ្រង</w:t>
+              <w:t>ការកែលម្អប្រព័ន្ធគ្រប់គ្រងថ្នាក់រៀនជំនាន់ចុងក្រោយ សម្រាប់លោកគ្រូ-អ្នកគ្រូបង្រៀន និងគណៈគ្រប់គ្រង</w:t>
             </w:r>
           </w:p>
         </w:tc>
@@ -118,7 +118,7 @@
         <w:br/>
         <w:t>✈️ Telegram ជំនួយបច្ចេកទេសផ្ទាល់៖ https://t.me/Kimchheng12 (ID: @Kimchheng12)</w:t>
         <w:br/>
-        <w:t>📅 ឆ្នាំសិក្សា៖ ២០២៦ - ២០២៧</w:t>
+        <w:t>📅 ឆ្នាំសិក្សា៖ ២០២៦ - ២០២៧ (ធ្វើបច្ចុប្បន្នភាពចុងក្រោយ)</w:t>
       </w:r>
     </w:p>
     <w:p>
@@ -143,7 +143,7 @@
           <w:sz w:val="27"/>
           <w:rFonts w:ascii="Khmer OS Muol Light" w:hAnsi="Khmer OS Muol Light" w:cs="Khmer OS Muol Light"/>
         </w:rPr>
-        <w:t>មាតិកានៃសៀវភៅណែនាំ (TABLE OF CONTENTS)</w:t>
+        <w:t>មាតិកានៃសៀវភៅណែនាំសាថ្មី (TABLE OF CONTENTS)</w:t>
       </w:r>
     </w:p>
     <w:tbl>
@@ -360,7 +360,7 @@
                 <w:sz w:val="21"/>
                 <w:rFonts w:ascii="Khmer OS Battambang" w:hAnsi="Khmer OS Battambang" w:cs="Khmer OS Battambang"/>
               </w:rPr>
-              <w:t>ការស្វែងយល់ពីផ្ទាំងទំព័រដើម (Dashboard Overview) និងម៉ឺនុយ</w:t>
+              <w:t>ការគ្រប់គ្រងឆ្នាំសិក្សា (Multi-Academic Year Management)</w:t>
             </w:r>
           </w:p>
         </w:tc>
@@ -412,7 +412,7 @@
                 <w:sz w:val="21"/>
                 <w:rFonts w:ascii="Khmer OS Battambang" w:hAnsi="Khmer OS Battambang" w:cs="Khmer OS Battambang"/>
               </w:rPr>
-              <w:t>ការគ្រប់គ្រងបញ្ជីថ្នាក់រៀនផ្ទាល់ខ្លួន (Classroom Management)</w:t>
+              <w:t>ការបំពេញព័ត៌មានផ្ទាល់ខ្លួនគ្រូ ហត្ថលេខា និងត្រាសាលា (Teacher Profile &amp; Signatures)</w:t>
             </w:r>
           </w:p>
         </w:tc>
@@ -464,7 +464,7 @@
                 <w:sz w:val="21"/>
                 <w:rFonts w:ascii="Khmer OS Battambang" w:hAnsi="Khmer OS Battambang" w:cs="Khmer OS Battambang"/>
               </w:rPr>
-              <w:t>ការគ្រប់គ្រងបញ្ជីឈ្មោះសិស្ស (Students Management)</w:t>
+              <w:t>ការគ្រប់គ្រងបញ្ជីថ្នាក់រៀនផ្ទាល់ខ្លួន (Classroom Management)</w:t>
             </w:r>
           </w:p>
         </w:tc>
@@ -516,7 +516,7 @@
                 <w:sz w:val="21"/>
                 <w:rFonts w:ascii="Khmer OS Battambang" w:hAnsi="Khmer OS Battambang" w:cs="Khmer OS Battambang"/>
               </w:rPr>
-              <w:t>ការកត់ត្រាវត្តមានសិស្សប្រចាំថ្ងៃ (Daily Attendance Tracking)</w:t>
+              <w:t>ការគ្រប់គ្រងបញ្ជីឈ្មោះសិស្ស (Students Management)</w:t>
             </w:r>
           </w:p>
         </w:tc>
@@ -568,7 +568,7 @@
                 <w:sz w:val="21"/>
                 <w:rFonts w:ascii="Khmer OS Battambang" w:hAnsi="Khmer OS Battambang" w:cs="Khmer OS Battambang"/>
               </w:rPr>
-              <w:t>ការបញ្ចូល និងគ្រប់គ្រងពិន្ទុសិស្ស (Scores &amp; Grading Management)</w:t>
+              <w:t>ការកត់ត្រា និងតាមដានអវត្តមានសិស្ស (Daily &amp; Monthly Attendance)</w:t>
             </w:r>
           </w:p>
         </w:tc>
@@ -620,7 +620,7 @@
                 <w:sz w:val="21"/>
                 <w:rFonts w:ascii="Khmer OS Battambang" w:hAnsi="Khmer OS Battambang" w:cs="Khmer OS Battambang"/>
               </w:rPr>
-              <w:t>ស្ថិតិ និងការវិភាគទិន្នន័យសិក្សា (Student Statistics &amp; Analytics)</w:t>
+              <w:t>ការបញ្ចូល និងគ្រប់គ្រងពិន្ទុសិស្ស (Scores &amp; Grading Rules)</w:t>
             </w:r>
           </w:p>
         </w:tc>
@@ -672,7 +672,7 @@
                 <w:sz w:val="21"/>
                 <w:rFonts w:ascii="Khmer OS Battambang" w:hAnsi="Khmer OS Battambang" w:cs="Khmer OS Battambang"/>
               </w:rPr>
-              <w:t>ការគ្រប់គ្រងវិញ្ញាសា និងការប្រឡងអនឡាញ (Online Exams)</w:t>
+              <w:t>ស្ថិតិ និងការវិភាគទិន្នន័យសិក្សា (Student Statistics &amp; Subject Breakdown)</w:t>
             </w:r>
           </w:p>
         </w:tc>
@@ -724,7 +724,7 @@
                 <w:sz w:val="21"/>
                 <w:rFonts w:ascii="Khmer OS Battambang" w:hAnsi="Khmer OS Battambang" w:cs="Khmer OS Battambang"/>
               </w:rPr>
-              <w:t>ការគ្រប់គ្រង និងចែករំលែកមេរៀន (Lesson Management)</w:t>
+              <w:t>វិញ្ញាបនបត្របញ្ជាក់ការសិក្សា និងការផ្ទៀងផ្ទាត់ QR Code (Certificates &amp; Verification)</w:t>
             </w:r>
           </w:p>
         </w:tc>
@@ -776,7 +776,7 @@
                 <w:sz w:val="21"/>
                 <w:rFonts w:ascii="Khmer OS Battambang" w:hAnsi="Khmer OS Battambang" w:cs="Khmer OS Battambang"/>
               </w:rPr>
-              <w:t>ការរៀបចំកាលវិភាគបង្រៀន (Teaching Schedule)</w:t>
+              <w:t>ការគ្រប់គ្រងវិញ្ញាសា និងការប្រឡងអនឡាញ (Online Exams)</w:t>
             </w:r>
           </w:p>
         </w:tc>
@@ -828,7 +828,7 @@
                 <w:sz w:val="21"/>
                 <w:rFonts w:ascii="Khmer OS Battambang" w:hAnsi="Khmer OS Battambang" w:cs="Khmer OS Battambang"/>
               </w:rPr>
-              <w:t>ការទាញយក និងបោះពុម្ពរបាយការណ៍សរុប (Reports &amp; Printing)</w:t>
+              <w:t>ការគ្រប់គ្រងមេរៀន និងកាលវិភាគបង្រៀន (Lessons &amp; Schedules)</w:t>
             </w:r>
           </w:p>
         </w:tc>
@@ -880,7 +880,7 @@
                 <w:sz w:val="21"/>
                 <w:rFonts w:ascii="Khmer OS Battambang" w:hAnsi="Khmer OS Battambang" w:cs="Khmer OS Battambang"/>
               </w:rPr>
-              <w:t>ផ្នែកទំនាក់ទំនង និងជំនួយបច្ចេកទេសតាម Telegram</w:t>
+              <w:t>ការទាញយក និងបោះពុម្ពរបាយការណ៍សរុប (Reports &amp; Printing)</w:t>
             </w:r>
           </w:p>
         </w:tc>
@@ -932,7 +932,59 @@
                 <w:sz w:val="21"/>
                 <w:rFonts w:ascii="Khmer OS Battambang" w:hAnsi="Khmer OS Battambang" w:cs="Khmer OS Battambang"/>
               </w:rPr>
-              <w:t>សុវត្ថិភាពគណនី និងគន្លឹះដោះស្រាយបញ្ហាបច្ចេកទេស</w:t>
+              <w:t>ការគ្រប់គ្រងគណនីគ្រូបង្រៀនសម្រាប់ Admin (Admin Accounts Management)</w:t>
+            </w:r>
+          </w:p>
+        </w:tc>
+      </w:tr>
+      <w:tr>
+        <w:tc>
+          <w:tcPr>
+            <w:tcW w:type="dxa" w:w="2592"/>
+            <w:shd w:fill="F8FAFC"/>
+            <w:tcMar>
+              <w:top w:w="80" w:type="dxa"/>
+              <w:bottom w:w="80" w:type="dxa"/>
+              <w:left w:w="120" w:type="dxa"/>
+              <w:right w:w="120" w:type="dxa"/>
+            </w:tcMar>
+          </w:tcPr>
+          <w:p>
+            <w:r>
+              <w:rPr>
+                <w:rFonts w:ascii="Khmer OS Battambang" w:hAnsi="Khmer OS Battambang"/>
+                <w:b/>
+                <w:i w:val="0"/>
+                <w:color w:val="1E293B"/>
+                <w:sz w:val="21"/>
+                <w:rFonts w:ascii="Khmer OS Battambang" w:hAnsi="Khmer OS Battambang" w:cs="Khmer OS Battambang"/>
+              </w:rPr>
+              <w:t>ជំពូកទី ១៥</w:t>
+            </w:r>
+          </w:p>
+        </w:tc>
+        <w:tc>
+          <w:tcPr>
+            <w:tcW w:type="dxa" w:w="6768"/>
+            <w:shd w:fill="F8FAFC"/>
+            <w:tcMar>
+              <w:top w:w="80" w:type="dxa"/>
+              <w:bottom w:w="80" w:type="dxa"/>
+              <w:left w:w="120" w:type="dxa"/>
+              <w:right w:w="120" w:type="dxa"/>
+            </w:tcMar>
+          </w:tcPr>
+          <w:p>
+            <w:r>
+              <w:rPr>
+                <w:rFonts w:ascii="Khmer OS Battambang" w:hAnsi="Khmer OS Battambang"/>
+                <w:b w:val="0"/>
+                <w:i w:val="0"/>
+                <w:color w:val="1E293B"/>
+                <w:sz w:val="21"/>
+                <w:rFonts w:ascii="Khmer OS Battambang" w:hAnsi="Khmer OS Battambang" w:cs="Khmer OS Battambang"/>
+              </w:rPr>
+              <w:t>ផ្នែកទំនាក់ទំនង ជំនួយបច្ចេកទេស និងសុវត្ថិភាព (Support &amp; Security)</w:t>
             </w:r>
           </w:p>
         </w:tc>
@@ -971,7 +1023,7 @@
           <w:sz w:val="22"/>
           <w:rFonts w:ascii="Khmer OS Battambang" w:hAnsi="Khmer OS Battambang" w:cs="Khmer OS Battambang"/>
         </w:rPr>
-        <w:t>ប្រព័ន្ធគ្រប់គ្រងថ្នាក់រៀនអនឡាញ (Class Management System 2027) ត្រូវបានបង្កើតឡើងក្នុងគោលបំណងធ្វើទំនើបកម្ម និងសម្រួលដល់ការងារប្រចាំថ្ងៃរបស់លោកគ្រូ-អ្នកគ្រូ ក្នុងការគ្រប់គ្រងសិស្ស វត្តមាន ពិន្ទុ វិញ្ញាសាប្រឡង មេរៀន កាលវិភាគ និងរបាយការណ៍សរុបប្រចាំខែ ដោយរហ័ស ត្រឹមត្រូវ និងមានសុវត្ថិភាពខ្ពស់។</w:t>
+        <w:t>ប្រព័ន្ធគ្រប់គ្រងថ្នាក់រៀនអនឡាញ (Class Management System 2027) ត្រូវបានអភិវឌ្ឍ និងកែលម្អសាថ្មីយ៉ាងទូលំទូលាយ ដើម្បីផ្តល់ជូនលោកគ្រូ-អ្នកគ្រូវិធីសាស្ត្រគ្រប់គ្រងថ្នាក់រៀនដ៏ទំនើប រហ័ស និងមានប្រសិទ្ធភាពខ្ពស់បំផុត។ កំណែថ្មីនេះបានពង្រឹងនូវប្រព័ន្ធសុវត្ថិភាពទិន្នន័យឯកោដាច់ដោយឡែករវាងគ្រូម្នាក់ៗ ការគ្រប់គ្រងឆ្នាំសិក្សាចម្រុះ ការស្រង់អវត្តមាន និងពិន្ទុច្បាស់លាស់ ព្រមទាំងការចេញវិញ្ញាបនបត្រស្វ័យប្រវត្តិជាមួយប្រព័ន្ធ QR Code ផ្ទៀងផ្ទាត់សច្ចភាព។</w:t>
       </w:r>
     </w:p>
     <w:p>
@@ -988,7 +1040,7 @@
           <w:sz w:val="24"/>
           <w:rFonts w:ascii="Khmer OS Battambang" w:hAnsi="Khmer OS Battambang" w:cs="Khmer OS Battambang"/>
         </w:rPr>
-        <w:t>១.១. អាសយដ្ឋានតំណភ្ជាប់ផ្លូវការ (Official URL)</w:t>
+        <w:t>១.១. អាសយដ្ឋានតំណភ្ជាប់ផ្លូវការ (Official URLs)</w:t>
       </w:r>
     </w:p>
     <w:p>
@@ -1004,7 +1056,7 @@
           <w:sz w:val="22"/>
           <w:rFonts w:ascii="Khmer OS Battambang" w:hAnsi="Khmer OS Battambang" w:cs="Khmer OS Battambang"/>
         </w:rPr>
-        <w:t>លោកគ្រូ-អ្នកគ្រូអាចចូលប្រើប្រាស់ប្រព័ន្ធពីគ្រប់ទីកន្លែង និងគ្រប់ពេលវេលា តាមរយៈអាសយដ្ឋានគេហទំព័រផ្ទាល់៖</w:t>
+        <w:t>លោកគ្រូ-អ្នកគ្រូ និងសិស្សានុសិស្សអាចចូលប្រើប្រាស់ប្រព័ន្ធពីគ្រប់ទីកន្លែង និងគ្រប់ពេលវេលា តាមរយៈអាសយដ្ឋានផ្លូវការ៖</w:t>
       </w:r>
     </w:p>
     <w:p>
@@ -1021,7 +1073,7 @@
           <w:sz w:val="21"/>
           <w:rFonts w:ascii="Khmer OS Battambang" w:hAnsi="Khmer OS Battambang" w:cs="Khmer OS Battambang"/>
         </w:rPr>
-        <w:t xml:space="preserve">👉 Link ផ្លូវការ៖ </w:t>
+        <w:t xml:space="preserve">👉 គេហទំព័រផ្លូវការ៖ </w:t>
       </w:r>
       <w:r>
         <w:rPr>
@@ -1032,7 +1084,7 @@
           <w:sz w:val="21"/>
           <w:rFonts w:ascii="Khmer OS Battambang" w:hAnsi="Khmer OS Battambang" w:cs="Khmer OS Battambang"/>
         </w:rPr>
-        <w:t>https://class.mitpukae.com (សម្រាប់ទំព័រទូទៅ និងការ Login)</w:t>
+        <w:t>https://class.mitpukae.com (ទំព័រទូទៅ និងការចូលរួម)</w:t>
       </w:r>
     </w:p>
     <w:p>
@@ -1060,7 +1112,7 @@
           <w:sz w:val="21"/>
           <w:rFonts w:ascii="Khmer OS Battambang" w:hAnsi="Khmer OS Battambang" w:cs="Khmer OS Battambang"/>
         </w:rPr>
-        <w:t>https://class.mitpukae.com/login (សម្រាប់ចូលផ្ទាំង Login ផ្ទាល់)</w:t>
+        <w:t>https://class.mitpukae.com/login (សម្រាប់លោកគ្រូ-អ្នកគ្រូ និងគណៈគ្រប់គ្រង Login)</w:t>
       </w:r>
     </w:p>
     <w:p>
@@ -1088,7 +1140,35 @@
           <w:sz w:val="21"/>
           <w:rFonts w:ascii="Khmer OS Battambang" w:hAnsi="Khmer OS Battambang" w:cs="Khmer OS Battambang"/>
         </w:rPr>
-        <w:t>https://class.mitpukae.com/test (សម្រាប់សិស្សចូលប្រឡងអនឡាញ)</w:t>
+        <w:t>https://class.mitpukae.com/test (សម្រាប់សិស្សចូលធ្វើតេស្តប្រឡងអនឡាញ)</w:t>
+      </w:r>
+    </w:p>
+    <w:p>
+      <w:pPr>
+        <w:pStyle w:val="ListBullet"/>
+        <w:spacing w:before="20" w:after="60" w:line="300" w:lineRule="auto"/>
+      </w:pPr>
+      <w:r>
+        <w:rPr>
+          <w:rFonts w:ascii="Khmer OS Battambang" w:hAnsi="Khmer OS Battambang"/>
+          <w:b/>
+          <w:i w:val="0"/>
+          <w:color w:val="0F172A"/>
+          <w:sz w:val="21"/>
+          <w:rFonts w:ascii="Khmer OS Battambang" w:hAnsi="Khmer OS Battambang" w:cs="Khmer OS Battambang"/>
+        </w:rPr>
+        <w:t xml:space="preserve">👉 Link ផ្ទៀងផ្ទាត់វិញ្ញាបនបត្រ៖ </w:t>
+      </w:r>
+      <w:r>
+        <w:rPr>
+          <w:rFonts w:ascii="Khmer OS Battambang" w:hAnsi="Khmer OS Battambang"/>
+          <w:b w:val="0"/>
+          <w:i w:val="0"/>
+          <w:color w:val="334155"/>
+          <w:sz w:val="21"/>
+          <w:rFonts w:ascii="Khmer OS Battambang" w:hAnsi="Khmer OS Battambang" w:cs="Khmer OS Battambang"/>
+        </w:rPr>
+        <w:t>https://class.mitpukae.com/certificate/verify/{serial} (សម្រាប់ស្កេនផ្ទៀងផ្ទាត់វិញ្ញាបនបត្រ)</w:t>
       </w:r>
     </w:p>
     <w:p>
@@ -1122,7 +1202,7 @@
           <w:sz w:val="21"/>
           <w:rFonts w:ascii="Khmer OS Battambang" w:hAnsi="Khmer OS Battambang" w:cs="Khmer OS Battambang"/>
         </w:rPr>
-        <w:t>អាចដំណើរការបានលើគ្រប់ឧបករណ៍៖ កុំព្យូទ័រលើតុ (Desktop), កុំព្យូទ័រយួរដៃ (Laptop), ថេប្លេត (iPad/Tablet), និងទូរស័ព្ទដៃឆ្លាតវៃ (Smartphone Android / iOS)។</w:t>
+        <w:t>ដំណើរការបានយ៉ាងរលូនលើគ្រប់ឧបករណ៍៖ កុំព្យូទ័រលើតុ (Desktop PC), កុំព្យូទ័រយួរដៃ (Laptop), ថេប្លេត (iPad/Tablet), និងទូរស័ព្ទដៃឆ្លាតវៃ (iOS &amp; Android)។</w:t>
       </w:r>
     </w:p>
     <w:p>
@@ -1139,7 +1219,7 @@
           <w:sz w:val="21"/>
           <w:rFonts w:ascii="Khmer OS Battambang" w:hAnsi="Khmer OS Battambang" w:cs="Khmer OS Battambang"/>
         </w:rPr>
-        <w:t>កម្មវិធីរុករក (Web Browser) ដែលណែនាំ៖ Google Chrome, Microsoft Edge, Safari, ឬ Mozilla Firefox (កំណែទម្រង់ចុងក្រោយ)។</w:t>
+        <w:t>កម្មវិធីរុករក (Web Browser) ដែលណែនាំ៖ Google Chrome, Microsoft Edge, Safari, ឬ Mozilla Firefox (កំណែទម្រង់ថ្មី)។</w:t>
       </w:r>
     </w:p>
     <w:p>
@@ -1156,7 +1236,7 @@
           <w:sz w:val="21"/>
           <w:rFonts w:ascii="Khmer OS Battambang" w:hAnsi="Khmer OS Battambang" w:cs="Khmer OS Battambang"/>
         </w:rPr>
-        <w:t>តម្រូវឱ្យមានការតភ្ជាប់បណ្តាញអ៊ីនធឺណិត (Wi-Fi ឬ 4G/5G) ដើម្បីរក្សាទុកទិន្នន័យលើពពក (Cloud Server) ភ្លាមៗ។</w:t>
+        <w:t>តម្រូវឱ្យមានការតភ្ជាប់បណ្តាញអ៊ីនធឺណិត (Wi-Fi ឬ 4G/5G) ដើម្បីរក្សាទុក និងធ្វើបច្ចុប្បន្នភាពទិន្នន័យលើពពក (Cloud Server) ភ្លាមៗ។</w:t>
       </w:r>
     </w:p>
     <w:tbl>
@@ -1200,7 +1280,7 @@
                 <w:sz w:val="22"/>
                 <w:rFonts w:ascii="Khmer OS Battambang" w:hAnsi="Khmer OS Battambang" w:cs="Khmer OS Battambang"/>
               </w:rPr>
-              <w:t xml:space="preserve">📌 ចំណុចពិសេសនៃប្រព័ន្ធ: </w:t>
+              <w:t xml:space="preserve">📌 ចំណុចពិសេស និងការការពារទិន្នន័យ: </w:t>
             </w:r>
             <w:r>
               <w:rPr>
@@ -1211,7 +1291,7 @@
                 <w:sz w:val="21"/>
                 <w:rFonts w:ascii="Khmer OS Battambang" w:hAnsi="Khmer OS Battambang" w:cs="Khmer OS Battambang"/>
               </w:rPr>
-              <w:t>ទិន្នន័យទាំងអស់របស់លោកគ្រូ-អ្នកគ្រូត្រូវបានការពារដោយប្រព័ន្ធសុវត្ថិភាព Cloud Database ដោយមានការបម្រុងទុក (Backup) ស្វ័យប្រវត្តិ។ គ្រូនីមួយៗមានគណនីផ្ទាល់ខ្លួនដាច់ដោយឡែក មិនប៉ះពាល់ដល់ថ្នាក់រៀនរបស់គ្រូដទៃឡើយ។</w:t>
+              <w:t>ប្រព័ន្ធជំនាន់ថ្មី ២០២៧ ត្រូវបានរចនាឡើងជាមួយនឹងស្ថាបត្យកម្ម Multi-Tenant Isolation ១០០% ដែលធានាថាគ្រូនីមួយៗមានទិន្នន័យផ្ទាល់ខ្លួនដាច់ដោយឡែក មិនប៉ះពាល់ មិនឃើញ និងមិនជាន់គ្នាជាមួយគ្រូដទៃឡើយ ទោះបីជាបង្រៀនមុខវិជ្ជាដូចគ្នា ឬឈ្មោះថ្នាក់ដូចគ្នាក៏ដោយ។</w:t>
             </w:r>
           </w:p>
         </w:tc>
@@ -1255,7 +1335,7 @@
           <w:sz w:val="22"/>
           <w:rFonts w:ascii="Khmer OS Battambang" w:hAnsi="Khmer OS Battambang" w:cs="Khmer OS Battambang"/>
         </w:rPr>
-        <w:t>ដើម្បីធានាសុវត្ថិភាពទិន្នន័យពិន្ទុ និងវត្តមានរបស់សិស្ស មានតែលោកគ្រូ-អ្នកគ្រូដែលមានគណនីដែលត្រូវបានផ្តល់ជូនដោយសាលាប៉ុណ្ណោះ ទើបអាចចូលប្រើប្រាស់មុខងារបង្រៀនបាន។</w:t>
+        <w:t>ដើម្បីធានាសុវត្ថិភាពព័ត៌មានផ្ទាល់ខ្លួន ពិន្ទុ និងវត្តមានរបស់សិស្ស មានតែលោកគ្រូ-អ្នកគ្រូដែលមានគណនីផ្លូវការប៉ុណ្ណោះ ទើបអាចចូលប្រើប្រាស់មុខងារបង្រៀនបាន។</w:t>
       </w:r>
     </w:p>
     <w:p>
@@ -1300,7 +1380,7 @@
           <w:sz w:val="21"/>
           <w:rFonts w:ascii="Khmer OS Battambang" w:hAnsi="Khmer OS Battambang" w:cs="Khmer OS Battambang"/>
         </w:rPr>
-        <w:t>បើកកម្មវិធី Browser (Chrome, Edge ឬ Safari) រួចវាយបញ្ចូលអាសយដ្ឋាន៖ https://class.mitpukae.com/login</w:t>
+        <w:t>បើកកម្មវិធី Browser រួចវាយអាសយដ្ឋាន៖ https://class.mitpukae.com/login</w:t>
       </w:r>
     </w:p>
     <w:p>
@@ -1328,7 +1408,7 @@
           <w:sz w:val="21"/>
           <w:rFonts w:ascii="Khmer OS Battambang" w:hAnsi="Khmer OS Battambang" w:cs="Khmer OS Battambang"/>
         </w:rPr>
-        <w:t>ប្រព័ន្ធនឹងបង្ហាញផ្ទាំង «ចូលប្រើប្រព័ន្ធគ្រប់គ្រង» ពណ៌សស្អាតនៅចំកណ្តាលអេក្រង់។</w:t>
+        <w:t>ផ្ទាំង «ចូលប្រើប្រព័ន្ធគ្រប់គ្រង» នឹងបង្ហាញនៅចំកណ្តាលអេក្រង់។</w:t>
       </w:r>
     </w:p>
     <w:p>
@@ -1356,7 +1436,7 @@
           <w:sz w:val="21"/>
           <w:rFonts w:ascii="Khmer OS Battambang" w:hAnsi="Khmer OS Battambang" w:cs="Khmer OS Battambang"/>
         </w:rPr>
-        <w:t>បញ្ចូល ឈ្មោះអ្នកប្រើប្រាស់ (Username) របស់អ្នក (ឧទាហរណ៍៖ samkimchheng ឬ teacher1001)។</w:t>
+        <w:t>បញ្ចូល ឈ្មោះអ្នកប្រើប្រាស់ (Username) របស់អ្នក (ឧទាហរណ៍៖ samkimchheng ឬ seungsomuny)។</w:t>
       </w:r>
     </w:p>
     <w:p>
@@ -1412,7 +1492,7 @@
           <w:sz w:val="21"/>
           <w:rFonts w:ascii="Khmer OS Battambang" w:hAnsi="Khmer OS Battambang" w:cs="Khmer OS Battambang"/>
         </w:rPr>
-        <w:t>អ្នកអាចចុចលើរូបសញ្ញា ភ្នែក 👁️ នៅខាងស្តាំប្រអប់លេខសម្ងាត់ ដើម្បីផ្ទៀងផ្ទាត់លេខកូដដែលបានវាយបញ្ចូលឱ្យបានត្រឹមត្រូវ។</w:t>
+        <w:t>អាចចុចលើរូបសញ្ញា ភ្នែក 👁️ នៅខាងស្តាំប្រអប់ដើម្បីផ្ទៀងផ្ទាត់លេខសម្ងាត់មុននឹងចុចចូល។</w:t>
       </w:r>
     </w:p>
     <w:p>
@@ -1457,40 +1537,7 @@
           <w:sz w:val="24"/>
           <w:rFonts w:ascii="Khmer OS Battambang" w:hAnsi="Khmer OS Battambang" w:cs="Khmer OS Battambang"/>
         </w:rPr>
-        <w:t>២.២. មុខងារចងចាំគណនីស្វ័យប្រវត្តិ (Remember Session)</w:t>
-      </w:r>
-    </w:p>
-    <w:p>
-      <w:pPr>
-        <w:spacing w:before="0" w:after="80" w:line="300" w:lineRule="auto"/>
-      </w:pPr>
-      <w:r>
-        <w:rPr>
-          <w:rFonts w:ascii="Khmer OS Battambang" w:hAnsi="Khmer OS Battambang"/>
-          <w:b w:val="0"/>
-          <w:i w:val="0"/>
-          <w:color w:val="334155"/>
-          <w:sz w:val="22"/>
-          <w:rFonts w:ascii="Khmer OS Battambang" w:hAnsi="Khmer OS Battambang" w:cs="Khmer OS Battambang"/>
-        </w:rPr>
-        <w:t>ប្រព័ន្ធមានមុខងារចងចាំការចូលប្រើប្រាស់ (Persistent Auto-login Cookie) រយៈពេលរហូតដល់ ៣០ ថ្ងៃ។ នៅពេលលោកគ្រូ-អ្នកគ្រូបាន Login ម្តងរួចហើយ លើកក្រោយបើកកម្មវិធី Browser ឡើងវិញ លោកគ្រូ-អ្នកគ្រូអាចចូលទៅកាន់ផ្ទាំងគ្រប់គ្រងបានភ្លាមៗ ដោយមិនបាច់វាយលេខសម្ងាត់ម្តងទៀតឡើយ។</w:t>
-      </w:r>
-    </w:p>
-    <w:p>
-      <w:pPr>
-        <w:keepNext/>
-        <w:spacing w:before="280" w:after="80"/>
-      </w:pPr>
-      <w:r>
-        <w:rPr>
-          <w:rFonts w:ascii="Khmer OS Battambang" w:hAnsi="Khmer OS Battambang"/>
-          <w:b/>
-          <w:i w:val="0"/>
-          <w:color w:val="0284C7"/>
-          <w:sz w:val="24"/>
-          <w:rFonts w:ascii="Khmer OS Battambang" w:hAnsi="Khmer OS Battambang" w:cs="Khmer OS Battambang"/>
-        </w:rPr>
-        <w:t>២.៣. ការដោះស្រាយបញ្ហាក្នុងការ Login</w:t>
+        <w:t>២.២. ការបែងចែកសិទ្ធិប្រើប្រាស់រវាង Admin និង Teacher</w:t>
       </w:r>
     </w:p>
     <w:p>
@@ -1507,7 +1554,7 @@
           <w:sz w:val="21"/>
           <w:rFonts w:ascii="Khmer OS Battambang" w:hAnsi="Khmer OS Battambang" w:cs="Khmer OS Battambang"/>
         </w:rPr>
-        <w:t xml:space="preserve">ករណីទី ១៖ </w:t>
+        <w:t xml:space="preserve">១. ROLE_ADMIN៖ </w:t>
       </w:r>
       <w:r>
         <w:rPr>
@@ -1518,7 +1565,7 @@
           <w:sz w:val="21"/>
           <w:rFonts w:ascii="Khmer OS Battambang" w:hAnsi="Khmer OS Battambang" w:cs="Khmer OS Battambang"/>
         </w:rPr>
-        <w:t>សារ «ឈ្មោះអ្នកប្រើប្រាស់ ឬលេខសម្ងាត់មិនត្រឹមត្រូវ!»៖ សូមពិនិត្យមើលអក្សរតូច-ធំ (Caps Lock) ឬដកឃ្លាដែលច្រឡំវាយលើក្តារចុច។</w:t>
+        <w:t>គណនីអ្នកគ្រប់គ្រង (Admin)៖ មានសិទ្ធិគ្រប់គ្រងគណនីគ្រូទាំងអស់ បង្កើតគ្រូថ្មី បើក/ផ្អាកគណនី និងមើលស្ថិតិរួមនៃប្រព័ន្ធ។</w:t>
       </w:r>
     </w:p>
     <w:p>
@@ -1535,7 +1582,7 @@
           <w:sz w:val="21"/>
           <w:rFonts w:ascii="Khmer OS Battambang" w:hAnsi="Khmer OS Battambang" w:cs="Khmer OS Battambang"/>
         </w:rPr>
-        <w:t xml:space="preserve">ករណីទី ២៖ </w:t>
+        <w:t xml:space="preserve">២. ROLE_TEACHER៖ </w:t>
       </w:r>
       <w:r>
         <w:rPr>
@@ -1546,25 +1593,116 @@
           <w:sz w:val="21"/>
           <w:rFonts w:ascii="Khmer OS Battambang" w:hAnsi="Khmer OS Battambang" w:cs="Khmer OS Battambang"/>
         </w:rPr>
-        <w:t>សារ «គណនីនេះត្រូវបានផ្អាក ឬបិទសិទ្ធិជាបណ្តោះអាសន្ន! សូមទាក់ទង Admin»៖ មានន័យថាគណនីត្រូវបានផ្អាកដោយ Admin។ សូមទាក់ទង Admin ដើម្បីបើកសិទ្ធិឡើងវិញ។</w:t>
+        <w:t>គណនីគ្រូបង្រៀន (Teacher)៖ គ្រប់គ្រងថ្នាក់រៀនផ្ទាល់ខ្លួន បញ្ជីសិស្ស វត្តមាន ពិន្ទុ វិញ្ញាសា កាលវិភាគ និងវិញ្ញាបនបត្ររបស់ខ្លួន។</w:t>
       </w:r>
     </w:p>
     <w:p>
       <w:pPr>
-        <w:pStyle w:val="ListBullet"/>
-        <w:spacing w:before="20" w:after="60" w:line="300" w:lineRule="auto"/>
+        <w:keepNext/>
+        <w:spacing w:before="280" w:after="80"/>
       </w:pPr>
       <w:r>
         <w:rPr>
           <w:rFonts w:ascii="Khmer OS Battambang" w:hAnsi="Khmer OS Battambang"/>
           <w:b/>
           <w:i w:val="0"/>
-          <w:color w:val="0F172A"/>
-          <w:sz w:val="21"/>
+          <w:color w:val="0284C7"/>
+          <w:sz w:val="24"/>
           <w:rFonts w:ascii="Khmer OS Battambang" w:hAnsi="Khmer OS Battambang" w:cs="Khmer OS Battambang"/>
         </w:rPr>
-        <w:t xml:space="preserve">ករណីទី ៣៖ </w:t>
+        <w:t>២.៣. មុខងារចងចាំការចូលប្រើប្រាស់ (Persistent Session)</w:t>
       </w:r>
+    </w:p>
+    <w:p>
+      <w:pPr>
+        <w:spacing w:before="0" w:after="80" w:line="300" w:lineRule="auto"/>
+      </w:pPr>
+      <w:r>
+        <w:rPr>
+          <w:rFonts w:ascii="Khmer OS Battambang" w:hAnsi="Khmer OS Battambang"/>
+          <w:b w:val="0"/>
+          <w:i w:val="0"/>
+          <w:color w:val="334155"/>
+          <w:sz w:val="22"/>
+          <w:rFonts w:ascii="Khmer OS Battambang" w:hAnsi="Khmer OS Battambang" w:cs="Khmer OS Battambang"/>
+        </w:rPr>
+        <w:t>ប្រព័ន្ធបានបំពាក់មុខងារចងចាំគណនីស្វ័យប្រវត្តិតាម Cookie រយៈពេល ៣០ ថ្ងៃ។ នៅពេលលោកគ្រូ-អ្នកគ្រូបាន Login ម្តងរួចហើយ លើកក្រោយបើក Browser ឡើងវិញ អាចចូលធ្វើការបានភ្លាមៗដោយមិនបាច់វាយលេខសម្ងាត់ម្តងទៀតឡើយ។</w:t>
+      </w:r>
+    </w:p>
+    <w:p>
+      <w:pPr>
+        <w:keepNext/>
+        <w:spacing w:before="400" w:after="120"/>
+        <w:pBdr>
+          <w:bottom w:val="single" w:sz="16" w:space="4" w:color="0284C7"/>
+        </w:pBdr>
+      </w:pPr>
+      <w:r>
+        <w:rPr>
+          <w:rFonts w:ascii="Khmer OS Muol Light" w:hAnsi="Khmer OS Muol Light"/>
+          <w:b/>
+          <w:i w:val="0"/>
+          <w:color w:val="0F172A"/>
+          <w:sz w:val="27"/>
+          <w:rFonts w:ascii="Khmer OS Muol Light" w:hAnsi="Khmer OS Muol Light" w:cs="Khmer OS Muol Light"/>
+        </w:rPr>
+        <w:t>ជំពូកទី ៣៖ ការគ្រប់គ្រងឆ្នាំសិក្សា (Multi-Academic Year Management)</w:t>
+      </w:r>
+    </w:p>
+    <w:p>
+      <w:pPr>
+        <w:spacing w:before="0" w:after="80" w:line="300" w:lineRule="auto"/>
+      </w:pPr>
+      <w:r>
+        <w:rPr>
+          <w:rFonts w:ascii="Khmer OS Battambang" w:hAnsi="Khmer OS Battambang"/>
+          <w:b w:val="0"/>
+          <w:i w:val="0"/>
+          <w:color w:val="334155"/>
+          <w:sz w:val="22"/>
+          <w:rFonts w:ascii="Khmer OS Battambang" w:hAnsi="Khmer OS Battambang" w:cs="Khmer OS Battambang"/>
+        </w:rPr>
+        <w:t>ប្រព័ន្ធគ្រប់គ្រងថ្នាក់រៀន ២០២៧ គាំទ្រការគ្រប់គ្រងទិន្នន័យច្រើនឆ្នាំសិក្សា (Multi-Academic Year) ដោយរលូន និងមានសុវត្ថិភាពខ្ពស់។ មុខងារនេះជួយឱ្យលោកគ្រូ-អ្នកគ្រូអាចរក្សាទុកទិន្នន័យចាស់ៗបានគង់វង្ស និងចាប់ផ្តើមឆ្នាំសិក្សាថ្មីដោយមិនបាត់បង់ទិន្នន័យឆ្នាំមុនឡើយ។</w:t>
+      </w:r>
+    </w:p>
+    <w:p>
+      <w:pPr>
+        <w:keepNext/>
+        <w:spacing w:before="280" w:after="80"/>
+      </w:pPr>
+      <w:r>
+        <w:rPr>
+          <w:rFonts w:ascii="Khmer OS Battambang" w:hAnsi="Khmer OS Battambang"/>
+          <w:b/>
+          <w:i w:val="0"/>
+          <w:color w:val="0284C7"/>
+          <w:sz w:val="24"/>
+          <w:rFonts w:ascii="Khmer OS Battambang" w:hAnsi="Khmer OS Battambang" w:cs="Khmer OS Battambang"/>
+        </w:rPr>
+        <w:t>៣.១. របារជ្រើសរើសឆ្នាំសិក្សា (Top Bar Academic Year Selector)</w:t>
+      </w:r>
+    </w:p>
+    <w:p>
+      <w:pPr>
+        <w:spacing w:before="0" w:after="80" w:line="300" w:lineRule="auto"/>
+      </w:pPr>
+      <w:r>
+        <w:rPr>
+          <w:rFonts w:ascii="Khmer OS Battambang" w:hAnsi="Khmer OS Battambang"/>
+          <w:b w:val="0"/>
+          <w:i w:val="0"/>
+          <w:color w:val="334155"/>
+          <w:sz w:val="22"/>
+          <w:rFonts w:ascii="Khmer OS Battambang" w:hAnsi="Khmer OS Battambang" w:cs="Khmer OS Battambang"/>
+        </w:rPr>
+        <w:t>នៅផ្នែកខាងលើនៃអេក្រង់ (Top Navigation Bar) លើគ្រប់ទំព័រទាំងអស់ មានប្រអប់ជ្រើសរើសឆ្នាំសិក្សា៖</w:t>
+      </w:r>
+    </w:p>
+    <w:p>
+      <w:pPr>
+        <w:pStyle w:val="ListBullet"/>
+        <w:spacing w:before="20" w:after="60" w:line="300" w:lineRule="auto"/>
+      </w:pPr>
       <w:r>
         <w:rPr>
           <w:rFonts w:ascii="Khmer OS Battambang" w:hAnsi="Khmer OS Battambang"/>
@@ -1574,27 +1712,58 @@
           <w:sz w:val="21"/>
           <w:rFonts w:ascii="Khmer OS Battambang" w:hAnsi="Khmer OS Battambang" w:cs="Khmer OS Battambang"/>
         </w:rPr>
-        <w:t>ភ្លេចលេខសម្ងាត់៖ សូមចុចលើតំណភ្ជាប់ Telegram ជំនួយបច្ចេកទេសនៅផ្នែកខាងក្រោមនៃផ្ទាំង Login ដើម្បីស្នើសុំកំណត់លេខសម្ងាត់ថ្មី។</w:t>
+        <w:t>បង្ហាញឆ្នាំសិក្សាបច្ចុប្បន្ន (ឧទាហរណ៍៖ ២០២៦-២០២៧)។</w:t>
       </w:r>
     </w:p>
     <w:p>
       <w:pPr>
-        <w:keepNext/>
-        <w:spacing w:before="400" w:after="120"/>
-        <w:pBdr>
-          <w:bottom w:val="single" w:sz="16" w:space="4" w:color="0284C7"/>
-        </w:pBdr>
+        <w:pStyle w:val="ListBullet"/>
+        <w:spacing w:before="20" w:after="60" w:line="300" w:lineRule="auto"/>
       </w:pPr>
       <w:r>
         <w:rPr>
-          <w:rFonts w:ascii="Khmer OS Muol Light" w:hAnsi="Khmer OS Muol Light"/>
+          <w:rFonts w:ascii="Khmer OS Battambang" w:hAnsi="Khmer OS Battambang"/>
+          <w:b w:val="0"/>
+          <w:i w:val="0"/>
+          <w:color w:val="334155"/>
+          <w:sz w:val="21"/>
+          <w:rFonts w:ascii="Khmer OS Battambang" w:hAnsi="Khmer OS Battambang" w:cs="Khmer OS Battambang"/>
+        </w:rPr>
+        <w:t>លោកគ្រូ-អ្នកគ្រូអាចចុចលើប្រអប់ទម្លាក់ចុះ (Dropdown) ដើម្បីជ្រើសរើសឆ្នាំសិក្សាផ្សេងទៀត (ឧទាហរណ៍៖ ២០២៥-២០២៦) ដើម្បីពិនិត្យឡើងវិញនូវថ្នាក់រៀន សិស្ស វត្តមាន និងពិន្ទុចាស់ៗ។</w:t>
+      </w:r>
+    </w:p>
+    <w:p>
+      <w:pPr>
+        <w:pStyle w:val="ListBullet"/>
+        <w:spacing w:before="20" w:after="60" w:line="300" w:lineRule="auto"/>
+      </w:pPr>
+      <w:r>
+        <w:rPr>
+          <w:rFonts w:ascii="Khmer OS Battambang" w:hAnsi="Khmer OS Battambang"/>
+          <w:b w:val="0"/>
+          <w:i w:val="0"/>
+          <w:color w:val="334155"/>
+          <w:sz w:val="21"/>
+          <w:rFonts w:ascii="Khmer OS Battambang" w:hAnsi="Khmer OS Battambang" w:cs="Khmer OS Battambang"/>
+        </w:rPr>
+        <w:t>នៅពេលលោកគ្រូ-អ្នកគ្រូជ្រើសរើសឆ្នាំណាមួយ ប្រព័ន្ធនឹងផ្លាស់ប្តូរទិន្នន័យទាំងស្រុងទៅតាមឆ្នាំសិក្សានោះដោយស្វ័យប្រវត្តិ។</w:t>
+      </w:r>
+    </w:p>
+    <w:p>
+      <w:pPr>
+        <w:keepNext/>
+        <w:spacing w:before="280" w:after="80"/>
+      </w:pPr>
+      <w:r>
+        <w:rPr>
+          <w:rFonts w:ascii="Khmer OS Battambang" w:hAnsi="Khmer OS Battambang"/>
           <w:b/>
           <w:i w:val="0"/>
-          <w:color w:val="0F172A"/>
-          <w:sz w:val="27"/>
-          <w:rFonts w:ascii="Khmer OS Muol Light" w:hAnsi="Khmer OS Muol Light" w:cs="Khmer OS Muol Light"/>
+          <w:color w:val="0284C7"/>
+          <w:sz w:val="24"/>
+          <w:rFonts w:ascii="Khmer OS Battambang" w:hAnsi="Khmer OS Battambang" w:cs="Khmer OS Battambang"/>
         </w:rPr>
-        <w:t>ជំពូកទី ៣៖ ការស្វែងយល់ពីផ្ទាំងទំព័រដើម (Dashboard Overview) និងម៉ឺនុយ</w:t>
+        <w:t>៣.២. ការបង្កើតឆ្នាំសិក្សាថ្មី (+ បង្កើតឆ្នាំសិក្សាថ្មី)</w:t>
       </w:r>
     </w:p>
     <w:p>
@@ -1610,442 +1779,7 @@
           <w:sz w:val="22"/>
           <w:rFonts w:ascii="Khmer OS Battambang" w:hAnsi="Khmer OS Battambang" w:cs="Khmer OS Battambang"/>
         </w:rPr>
-        <w:t>បន្ទាប់ពី Login បានជោគជ័យ ប្រព័ន្ធនឹងនាំលោកគ្រូ-អ្នកគ្រូមកកាន់ទំព័រដើម (Dashboard) ភ្លាមៗ។</w:t>
-      </w:r>
-    </w:p>
-    <w:p>
-      <w:pPr>
-        <w:keepNext/>
-        <w:spacing w:before="280" w:after="80"/>
-      </w:pPr>
-      <w:r>
-        <w:rPr>
-          <w:rFonts w:ascii="Khmer OS Battambang" w:hAnsi="Khmer OS Battambang"/>
-          <w:b/>
-          <w:i w:val="0"/>
-          <w:color w:val="0284C7"/>
-          <w:sz w:val="24"/>
-          <w:rFonts w:ascii="Khmer OS Battambang" w:hAnsi="Khmer OS Battambang" w:cs="Khmer OS Battambang"/>
-        </w:rPr>
-        <w:t>៣.១. ផ្ទាំងស្ថិតិសង្ខេប (Summary Cards)</w:t>
-      </w:r>
-    </w:p>
-    <w:p>
-      <w:pPr>
-        <w:spacing w:before="0" w:after="80" w:line="300" w:lineRule="auto"/>
-      </w:pPr>
-      <w:r>
-        <w:rPr>
-          <w:rFonts w:ascii="Khmer OS Battambang" w:hAnsi="Khmer OS Battambang"/>
-          <w:b w:val="0"/>
-          <w:i w:val="0"/>
-          <w:color w:val="334155"/>
-          <w:sz w:val="22"/>
-          <w:rFonts w:ascii="Khmer OS Battambang" w:hAnsi="Khmer OS Battambang" w:cs="Khmer OS Battambang"/>
-        </w:rPr>
-        <w:t>នៅផ្នែកខាងលើនៃទំព័រដើម មានប្រអប់ព័ត៌មានសំខាន់ៗចំនួន ៤៖</w:t>
-      </w:r>
-    </w:p>
-    <w:p>
-      <w:pPr>
-        <w:pStyle w:val="ListBullet"/>
-        <w:spacing w:before="20" w:after="60" w:line="300" w:lineRule="auto"/>
-      </w:pPr>
-      <w:r>
-        <w:rPr>
-          <w:rFonts w:ascii="Khmer OS Battambang" w:hAnsi="Khmer OS Battambang"/>
-          <w:b/>
-          <w:i w:val="0"/>
-          <w:color w:val="0F172A"/>
-          <w:sz w:val="21"/>
-          <w:rFonts w:ascii="Khmer OS Battambang" w:hAnsi="Khmer OS Battambang" w:cs="Khmer OS Battambang"/>
-        </w:rPr>
-        <w:t xml:space="preserve">១. ចំនួនសិស្សសរុប (Total Students)៖ </w:t>
-      </w:r>
-      <w:r>
-        <w:rPr>
-          <w:rFonts w:ascii="Khmer OS Battambang" w:hAnsi="Khmer OS Battambang"/>
-          <w:b w:val="0"/>
-          <w:i w:val="0"/>
-          <w:color w:val="334155"/>
-          <w:sz w:val="21"/>
-          <w:rFonts w:ascii="Khmer OS Battambang" w:hAnsi="Khmer OS Battambang" w:cs="Khmer OS Battambang"/>
-        </w:rPr>
-        <w:t>បង្ហាញចំនួនសិស្សទាំងអស់ដែលស្ថិតក្រោមការគ្រប់គ្រងរបស់គ្រូ។</w:t>
-      </w:r>
-    </w:p>
-    <w:p>
-      <w:pPr>
-        <w:pStyle w:val="ListBullet"/>
-        <w:spacing w:before="20" w:after="60" w:line="300" w:lineRule="auto"/>
-      </w:pPr>
-      <w:r>
-        <w:rPr>
-          <w:rFonts w:ascii="Khmer OS Battambang" w:hAnsi="Khmer OS Battambang"/>
-          <w:b/>
-          <w:i w:val="0"/>
-          <w:color w:val="0F172A"/>
-          <w:sz w:val="21"/>
-          <w:rFonts w:ascii="Khmer OS Battambang" w:hAnsi="Khmer OS Battambang" w:cs="Khmer OS Battambang"/>
-        </w:rPr>
-        <w:t xml:space="preserve">២. សិស្សស្រីសរុប (Total Female)៖ </w:t>
-      </w:r>
-      <w:r>
-        <w:rPr>
-          <w:rFonts w:ascii="Khmer OS Battambang" w:hAnsi="Khmer OS Battambang"/>
-          <w:b w:val="0"/>
-          <w:i w:val="0"/>
-          <w:color w:val="334155"/>
-          <w:sz w:val="21"/>
-          <w:rFonts w:ascii="Khmer OS Battambang" w:hAnsi="Khmer OS Battambang" w:cs="Khmer OS Battambang"/>
-        </w:rPr>
-        <w:t>បង្ហាញចំនួនសិស្សជានារី ដើម្បីងាយស្រួលតាមដានសមភាពយេនឌ័រ។</w:t>
-      </w:r>
-    </w:p>
-    <w:p>
-      <w:pPr>
-        <w:pStyle w:val="ListBullet"/>
-        <w:spacing w:before="20" w:after="60" w:line="300" w:lineRule="auto"/>
-      </w:pPr>
-      <w:r>
-        <w:rPr>
-          <w:rFonts w:ascii="Khmer OS Battambang" w:hAnsi="Khmer OS Battambang"/>
-          <w:b/>
-          <w:i w:val="0"/>
-          <w:color w:val="0F172A"/>
-          <w:sz w:val="21"/>
-          <w:rFonts w:ascii="Khmer OS Battambang" w:hAnsi="Khmer OS Battambang" w:cs="Khmer OS Battambang"/>
-        </w:rPr>
-        <w:t xml:space="preserve">៣. វត្តមានថ្ងៃនេះ (Present Today)៖ </w:t>
-      </w:r>
-      <w:r>
-        <w:rPr>
-          <w:rFonts w:ascii="Khmer OS Battambang" w:hAnsi="Khmer OS Battambang"/>
-          <w:b w:val="0"/>
-          <w:i w:val="0"/>
-          <w:color w:val="334155"/>
-          <w:sz w:val="21"/>
-          <w:rFonts w:ascii="Khmer OS Battambang" w:hAnsi="Khmer OS Battambang" w:cs="Khmer OS Battambang"/>
-        </w:rPr>
-        <w:t>បង្ហាញចំនួនសិស្សដែលបានចូលរៀនជាក់ស្តែងក្នុងថ្ងៃនេះ។</w:t>
-      </w:r>
-    </w:p>
-    <w:p>
-      <w:pPr>
-        <w:pStyle w:val="ListBullet"/>
-        <w:spacing w:before="20" w:after="60" w:line="300" w:lineRule="auto"/>
-      </w:pPr>
-      <w:r>
-        <w:rPr>
-          <w:rFonts w:ascii="Khmer OS Battambang" w:hAnsi="Khmer OS Battambang"/>
-          <w:b/>
-          <w:i w:val="0"/>
-          <w:color w:val="0F172A"/>
-          <w:sz w:val="21"/>
-          <w:rFonts w:ascii="Khmer OS Battambang" w:hAnsi="Khmer OS Battambang" w:cs="Khmer OS Battambang"/>
-        </w:rPr>
-        <w:t xml:space="preserve">៤. សិស្សស្រីមានវត្តមាន (Female Present)៖ </w:t>
-      </w:r>
-      <w:r>
-        <w:rPr>
-          <w:rFonts w:ascii="Khmer OS Battambang" w:hAnsi="Khmer OS Battambang"/>
-          <w:b w:val="0"/>
-          <w:i w:val="0"/>
-          <w:color w:val="334155"/>
-          <w:sz w:val="21"/>
-          <w:rFonts w:ascii="Khmer OS Battambang" w:hAnsi="Khmer OS Battambang" w:cs="Khmer OS Battambang"/>
-        </w:rPr>
-        <w:t>បង្ហាញចំនួនសិស្សស្រីដែលមានវត្តមានរៀនថ្ងៃនេះ។</w:t>
-      </w:r>
-    </w:p>
-    <w:p>
-      <w:pPr>
-        <w:keepNext/>
-        <w:spacing w:before="280" w:after="80"/>
-      </w:pPr>
-      <w:r>
-        <w:rPr>
-          <w:rFonts w:ascii="Khmer OS Battambang" w:hAnsi="Khmer OS Battambang"/>
-          <w:b/>
-          <w:i w:val="0"/>
-          <w:color w:val="0284C7"/>
-          <w:sz w:val="24"/>
-          <w:rFonts w:ascii="Khmer OS Battambang" w:hAnsi="Khmer OS Battambang" w:cs="Khmer OS Battambang"/>
-        </w:rPr>
-        <w:t>៣.២. ការស្វែងយល់ពីរចនាសម្ព័ន្ធម៉ឺនុយចំហៀង (Sidebar Navigation Menu)</w:t>
-      </w:r>
-    </w:p>
-    <w:p>
-      <w:pPr>
-        <w:spacing w:before="0" w:after="80" w:line="300" w:lineRule="auto"/>
-      </w:pPr>
-      <w:r>
-        <w:rPr>
-          <w:rFonts w:ascii="Khmer OS Battambang" w:hAnsi="Khmer OS Battambang"/>
-          <w:b w:val="0"/>
-          <w:i w:val="0"/>
-          <w:color w:val="334155"/>
-          <w:sz w:val="22"/>
-          <w:rFonts w:ascii="Khmer OS Battambang" w:hAnsi="Khmer OS Battambang" w:cs="Khmer OS Battambang"/>
-        </w:rPr>
-        <w:t>នៅផ្នែកខាងឆ្វេងដៃនៃអេក្រង់ មានម៉ឺនុយរៀបចំតាមលំដាប់លំដោយយ៉ាងងាយស្រួល៖</w:t>
-      </w:r>
-    </w:p>
-    <w:p>
-      <w:pPr>
-        <w:pStyle w:val="ListBullet"/>
-        <w:spacing w:before="20" w:after="60" w:line="300" w:lineRule="auto"/>
-      </w:pPr>
-      <w:r>
-        <w:rPr>
-          <w:rFonts w:ascii="Khmer OS Battambang" w:hAnsi="Khmer OS Battambang"/>
-          <w:b w:val="0"/>
-          <w:i w:val="0"/>
-          <w:color w:val="334155"/>
-          <w:sz w:val="21"/>
-          <w:rFonts w:ascii="Khmer OS Battambang" w:hAnsi="Khmer OS Battambang" w:cs="Khmer OS Battambang"/>
-        </w:rPr>
-        <w:t>ទំព័រដើម (Dashboard) - មើលស្ថិតិសង្ខេបទូទៅ។</w:t>
-      </w:r>
-    </w:p>
-    <w:p>
-      <w:pPr>
-        <w:pStyle w:val="ListBullet"/>
-        <w:spacing w:before="20" w:after="60" w:line="300" w:lineRule="auto"/>
-      </w:pPr>
-      <w:r>
-        <w:rPr>
-          <w:rFonts w:ascii="Khmer OS Battambang" w:hAnsi="Khmer OS Battambang"/>
-          <w:b w:val="0"/>
-          <w:i w:val="0"/>
-          <w:color w:val="334155"/>
-          <w:sz w:val="21"/>
-          <w:rFonts w:ascii="Khmer OS Battambang" w:hAnsi="Khmer OS Battambang" w:cs="Khmer OS Battambang"/>
-        </w:rPr>
-        <w:t>បញ្ជីថ្នាក់រៀនខ្ញុំ (Classrooms) - គ្រប់គ្រងថ្នាក់រៀនផ្ទាល់ខ្លួន។</w:t>
-      </w:r>
-    </w:p>
-    <w:p>
-      <w:pPr>
-        <w:pStyle w:val="ListBullet"/>
-        <w:spacing w:before="20" w:after="60" w:line="300" w:lineRule="auto"/>
-      </w:pPr>
-      <w:r>
-        <w:rPr>
-          <w:rFonts w:ascii="Khmer OS Battambang" w:hAnsi="Khmer OS Battambang"/>
-          <w:b w:val="0"/>
-          <w:i w:val="0"/>
-          <w:color w:val="334155"/>
-          <w:sz w:val="21"/>
-          <w:rFonts w:ascii="Khmer OS Battambang" w:hAnsi="Khmer OS Battambang" w:cs="Khmer OS Battambang"/>
-        </w:rPr>
-        <w:t>បញ្ជីឈ្មោះសិស្ស (Students) - មើល និងបន្ថែមឈ្មោះសិស្ស។</w:t>
-      </w:r>
-    </w:p>
-    <w:p>
-      <w:pPr>
-        <w:pStyle w:val="ListBullet"/>
-        <w:spacing w:before="20" w:after="60" w:line="300" w:lineRule="auto"/>
-      </w:pPr>
-      <w:r>
-        <w:rPr>
-          <w:rFonts w:ascii="Khmer OS Battambang" w:hAnsi="Khmer OS Battambang"/>
-          <w:b w:val="0"/>
-          <w:i w:val="0"/>
-          <w:color w:val="334155"/>
-          <w:sz w:val="21"/>
-          <w:rFonts w:ascii="Khmer OS Battambang" w:hAnsi="Khmer OS Battambang" w:cs="Khmer OS Battambang"/>
-        </w:rPr>
-        <w:t>បញ្ជីវត្តមាន (Attendance) - កត់ត្រាវត្តមានសិស្សប្រចាំថ្ងៃ។</w:t>
-      </w:r>
-    </w:p>
-    <w:p>
-      <w:pPr>
-        <w:pStyle w:val="ListBullet"/>
-        <w:spacing w:before="20" w:after="60" w:line="300" w:lineRule="auto"/>
-      </w:pPr>
-      <w:r>
-        <w:rPr>
-          <w:rFonts w:ascii="Khmer OS Battambang" w:hAnsi="Khmer OS Battambang"/>
-          <w:b w:val="0"/>
-          <w:i w:val="0"/>
-          <w:color w:val="334155"/>
-          <w:sz w:val="21"/>
-          <w:rFonts w:ascii="Khmer OS Battambang" w:hAnsi="Khmer OS Battambang" w:cs="Khmer OS Battambang"/>
-        </w:rPr>
-        <w:t>បញ្ជីពិន្ទុ (Scores) - បញ្ចូល និងគណនាពិន្ទុសិស្ស។</w:t>
-      </w:r>
-    </w:p>
-    <w:p>
-      <w:pPr>
-        <w:pStyle w:val="ListBullet"/>
-        <w:spacing w:before="20" w:after="60" w:line="300" w:lineRule="auto"/>
-      </w:pPr>
-      <w:r>
-        <w:rPr>
-          <w:rFonts w:ascii="Khmer OS Battambang" w:hAnsi="Khmer OS Battambang"/>
-          <w:b w:val="0"/>
-          <w:i w:val="0"/>
-          <w:color w:val="334155"/>
-          <w:sz w:val="21"/>
-          <w:rFonts w:ascii="Khmer OS Battambang" w:hAnsi="Khmer OS Battambang" w:cs="Khmer OS Battambang"/>
-        </w:rPr>
-        <w:t>ស្ថិតិសិស្ស (Statistics) - មើលក្រាហ្វិក និងការវិភាគនិទ្ទេស។</w:t>
-      </w:r>
-    </w:p>
-    <w:p>
-      <w:pPr>
-        <w:pStyle w:val="ListBullet"/>
-        <w:spacing w:before="20" w:after="60" w:line="300" w:lineRule="auto"/>
-      </w:pPr>
-      <w:r>
-        <w:rPr>
-          <w:rFonts w:ascii="Khmer OS Battambang" w:hAnsi="Khmer OS Battambang"/>
-          <w:b w:val="0"/>
-          <w:i w:val="0"/>
-          <w:color w:val="334155"/>
-          <w:sz w:val="21"/>
-          <w:rFonts w:ascii="Khmer OS Battambang" w:hAnsi="Khmer OS Battambang" w:cs="Khmer OS Battambang"/>
-        </w:rPr>
-        <w:t>វិញ្ញាសាប្រឡង (Exams) - បង្កើត និងគ្រប់គ្រងវិញ្ញាសាប្រឡង។</w:t>
-      </w:r>
-    </w:p>
-    <w:p>
-      <w:pPr>
-        <w:pStyle w:val="ListBullet"/>
-        <w:spacing w:before="20" w:after="60" w:line="300" w:lineRule="auto"/>
-      </w:pPr>
-      <w:r>
-        <w:rPr>
-          <w:rFonts w:ascii="Khmer OS Battambang" w:hAnsi="Khmer OS Battambang"/>
-          <w:b w:val="0"/>
-          <w:i w:val="0"/>
-          <w:color w:val="334155"/>
-          <w:sz w:val="21"/>
-          <w:rFonts w:ascii="Khmer OS Battambang" w:hAnsi="Khmer OS Battambang" w:cs="Khmer OS Battambang"/>
-        </w:rPr>
-        <w:t>មើលមេរៀន (Lessons) - បង្ហោះ និងអានមេរៀន។</w:t>
-      </w:r>
-    </w:p>
-    <w:p>
-      <w:pPr>
-        <w:pStyle w:val="ListBullet"/>
-        <w:spacing w:before="20" w:after="60" w:line="300" w:lineRule="auto"/>
-      </w:pPr>
-      <w:r>
-        <w:rPr>
-          <w:rFonts w:ascii="Khmer OS Battambang" w:hAnsi="Khmer OS Battambang"/>
-          <w:b w:val="0"/>
-          <w:i w:val="0"/>
-          <w:color w:val="334155"/>
-          <w:sz w:val="21"/>
-          <w:rFonts w:ascii="Khmer OS Battambang" w:hAnsi="Khmer OS Battambang" w:cs="Khmer OS Battambang"/>
-        </w:rPr>
-        <w:t>កាលវិភាគ (Schedule) - មើល និងរៀបចំកាលវិភាគបង្រៀន។</w:t>
-      </w:r>
-    </w:p>
-    <w:p>
-      <w:pPr>
-        <w:pStyle w:val="ListBullet"/>
-        <w:spacing w:before="20" w:after="60" w:line="300" w:lineRule="auto"/>
-      </w:pPr>
-      <w:r>
-        <w:rPr>
-          <w:rFonts w:ascii="Khmer OS Battambang" w:hAnsi="Khmer OS Battambang"/>
-          <w:b w:val="0"/>
-          <w:i w:val="0"/>
-          <w:color w:val="334155"/>
-          <w:sz w:val="21"/>
-          <w:rFonts w:ascii="Khmer OS Battambang" w:hAnsi="Khmer OS Battambang" w:cs="Khmer OS Battambang"/>
-        </w:rPr>
-        <w:t>របាយការណ៍ (Report) - បោះពុម្ពតារាងចំណាត់ថ្នាក់ និងលទ្ធផលសរុប។</w:t>
-      </w:r>
-    </w:p>
-    <w:p>
-      <w:pPr>
-        <w:pStyle w:val="ListBullet"/>
-        <w:spacing w:before="20" w:after="60" w:line="300" w:lineRule="auto"/>
-      </w:pPr>
-      <w:r>
-        <w:rPr>
-          <w:rFonts w:ascii="Khmer OS Battambang" w:hAnsi="Khmer OS Battambang"/>
-          <w:b w:val="0"/>
-          <w:i w:val="0"/>
-          <w:color w:val="334155"/>
-          <w:sz w:val="21"/>
-          <w:rFonts w:ascii="Khmer OS Battambang" w:hAnsi="Khmer OS Battambang" w:cs="Khmer OS Battambang"/>
-        </w:rPr>
-        <w:t>✈️ ទាក់ទងខ្ញុំ (Telegram) - ចុចឆាតផ្ទាល់ទៅកាន់អ្នកបច្ចេកទេស។</w:t>
-      </w:r>
-    </w:p>
-    <w:p>
-      <w:pPr>
-        <w:pStyle w:val="ListBullet"/>
-        <w:spacing w:before="20" w:after="60" w:line="300" w:lineRule="auto"/>
-      </w:pPr>
-      <w:r>
-        <w:rPr>
-          <w:rFonts w:ascii="Khmer OS Battambang" w:hAnsi="Khmer OS Battambang"/>
-          <w:b w:val="0"/>
-          <w:i w:val="0"/>
-          <w:color w:val="334155"/>
-          <w:sz w:val="21"/>
-          <w:rFonts w:ascii="Khmer OS Battambang" w:hAnsi="Khmer OS Battambang" w:cs="Khmer OS Battambang"/>
-        </w:rPr>
-        <w:t>ចាកចេញ (Logout 🚪) - ចាកចេញពីគណនីប្រកបដោយសុវត្ថិភាព។</w:t>
-      </w:r>
-    </w:p>
-    <w:p>
-      <w:pPr>
-        <w:keepNext/>
-        <w:spacing w:before="400" w:after="120"/>
-        <w:pBdr>
-          <w:bottom w:val="single" w:sz="16" w:space="4" w:color="0284C7"/>
-        </w:pBdr>
-      </w:pPr>
-      <w:r>
-        <w:rPr>
-          <w:rFonts w:ascii="Khmer OS Muol Light" w:hAnsi="Khmer OS Muol Light"/>
-          <w:b/>
-          <w:i w:val="0"/>
-          <w:color w:val="0F172A"/>
-          <w:sz w:val="27"/>
-          <w:rFonts w:ascii="Khmer OS Muol Light" w:hAnsi="Khmer OS Muol Light" w:cs="Khmer OS Muol Light"/>
-        </w:rPr>
-        <w:t>ជំពូកទី ៤៖ ការគ្រប់គ្រងបញ្ជីថ្នាក់រៀនផ្ទាល់ខ្លួន (Classroom Management)</w:t>
-      </w:r>
-    </w:p>
-    <w:p>
-      <w:pPr>
-        <w:spacing w:before="0" w:after="80" w:line="300" w:lineRule="auto"/>
-      </w:pPr>
-      <w:r>
-        <w:rPr>
-          <w:rFonts w:ascii="Khmer OS Battambang" w:hAnsi="Khmer OS Battambang"/>
-          <w:b w:val="0"/>
-          <w:i w:val="0"/>
-          <w:color w:val="334155"/>
-          <w:sz w:val="22"/>
-          <w:rFonts w:ascii="Khmer OS Battambang" w:hAnsi="Khmer OS Battambang" w:cs="Khmer OS Battambang"/>
-        </w:rPr>
-        <w:t>លោកគ្រូ-អ្នកគ្រូអាចបង្រៀនច្រើនថ្នាក់ក្នុងពេលតែមួយ (ឧទាហរណ៍៖ ថ្នាក់ ១០A, ១០B, ១១A, ១២A...)។ មុខងារនេះជួយឱ្យគ្រូបែងចែកសិស្សតាមថ្នាក់នីមួយៗបានយ៉ាងច្បាស់លាស់។</w:t>
-      </w:r>
-    </w:p>
-    <w:p>
-      <w:pPr>
-        <w:keepNext/>
-        <w:spacing w:before="280" w:after="80"/>
-      </w:pPr>
-      <w:r>
-        <w:rPr>
-          <w:rFonts w:ascii="Khmer OS Battambang" w:hAnsi="Khmer OS Battambang"/>
-          <w:b/>
-          <w:i w:val="0"/>
-          <w:color w:val="0284C7"/>
-          <w:sz w:val="24"/>
-          <w:rFonts w:ascii="Khmer OS Battambang" w:hAnsi="Khmer OS Battambang" w:cs="Khmer OS Battambang"/>
-        </w:rPr>
-        <w:t>៤.១. ការបន្ថែមថ្នាក់រៀនថ្មី</w:t>
+        <w:t>នៅពេលឈានចូលឆ្នាំសិក្សាថ្មី លោកគ្រូ-អ្នកគ្រូអាចបង្កើតឆ្នាំសិក្សាថ្មីបានយ៉ាងងាយស្រួល៖</w:t>
       </w:r>
     </w:p>
     <w:p>
@@ -2073,7 +1807,7 @@
           <w:sz w:val="21"/>
           <w:rFonts w:ascii="Khmer OS Battambang" w:hAnsi="Khmer OS Battambang" w:cs="Khmer OS Battambang"/>
         </w:rPr>
-        <w:t>ចុចលើម៉ឺនុយ «បញ្ជីថ្នាក់រៀនខ្ញុំ» នៅលើ Sidebar ខាងឆ្វេង។</w:t>
+        <w:t>ចូលទៅកាន់ទំព័រ «បញ្ជីថ្នាក់រៀនខ្ញុំ» ឬចុចលើប៊ូតុង «+ បង្កើតឆ្នាំសិក្សាថ្មី»។</w:t>
       </w:r>
     </w:p>
     <w:p>
@@ -2101,7 +1835,7 @@
           <w:sz w:val="21"/>
           <w:rFonts w:ascii="Khmer OS Battambang" w:hAnsi="Khmer OS Battambang" w:cs="Khmer OS Battambang"/>
         </w:rPr>
-        <w:t>ចុចលើប៊ូតុងពណ៌ខៀវ «+ បន្ថែមថ្នាក់រៀនថ្មី»។</w:t>
+        <w:t>វាយបញ្ចូលឈ្មោះឆ្នាំសិក្សាថ្មី (ឧទាហរណ៍៖ ២០២៧-២០២៨)។</w:t>
       </w:r>
     </w:p>
     <w:p>
@@ -2129,25 +1863,47 @@
           <w:sz w:val="21"/>
           <w:rFonts w:ascii="Khmer OS Battambang" w:hAnsi="Khmer OS Battambang" w:cs="Khmer OS Battambang"/>
         </w:rPr>
-        <w:t>បញ្ចូល ឈ្មោះថ្នាក់រៀន (ឧទាហរណ៍៖ ថ្នាក់ទី១០ A ឬ Grade 10-A)។</w:t>
+        <w:t>ចុច «រក្សាទុក»។ ឆ្នាំសិក្សាថ្មីនឹងត្រូវបានបង្កើតឡើងភ្លាមៗ។</w:t>
       </w:r>
     </w:p>
     <w:p>
       <w:pPr>
-        <w:pStyle w:val="ListBullet"/>
-        <w:spacing w:before="20" w:after="60" w:line="300" w:lineRule="auto"/>
+        <w:keepNext/>
+        <w:spacing w:before="280" w:after="80"/>
       </w:pPr>
       <w:r>
         <w:rPr>
           <w:rFonts w:ascii="Khmer OS Battambang" w:hAnsi="Khmer OS Battambang"/>
           <w:b/>
           <w:i w:val="0"/>
-          <w:color w:val="0F172A"/>
-          <w:sz w:val="21"/>
+          <w:color w:val="0284C7"/>
+          <w:sz w:val="24"/>
           <w:rFonts w:ascii="Khmer OS Battambang" w:hAnsi="Khmer OS Battambang" w:cs="Khmer OS Battambang"/>
         </w:rPr>
-        <w:t xml:space="preserve">ជំហានទី ៤៖ </w:t>
+        <w:t>៣.៣. មុខងារថតចម្លងថ្នាក់រៀនពីឆ្នាំមុន (Copy Classrooms to New Year)</w:t>
       </w:r>
+    </w:p>
+    <w:p>
+      <w:pPr>
+        <w:spacing w:before="0" w:after="80" w:line="300" w:lineRule="auto"/>
+      </w:pPr>
+      <w:r>
+        <w:rPr>
+          <w:rFonts w:ascii="Khmer OS Battambang" w:hAnsi="Khmer OS Battambang"/>
+          <w:b w:val="0"/>
+          <w:i w:val="0"/>
+          <w:color w:val="334155"/>
+          <w:sz w:val="22"/>
+          <w:rFonts w:ascii="Khmer OS Battambang" w:hAnsi="Khmer OS Battambang" w:cs="Khmer OS Battambang"/>
+        </w:rPr>
+        <w:t>ដើម្បីកុំឱ្យលោកគ្រូ-អ្នកគ្រូចំណាយពេលវាយបញ្ចូលឈ្មោះថ្នាក់រៀនសាឡើងវិញនៅឆ្នាំថ្មី ប្រព័ន្ធមានប៊ូតុង «ថតចម្លងថ្នាក់ពីឆ្នាំមុន»៖</w:t>
+      </w:r>
+    </w:p>
+    <w:p>
+      <w:pPr>
+        <w:pStyle w:val="ListBullet"/>
+        <w:spacing w:before="20" w:after="60" w:line="300" w:lineRule="auto"/>
+      </w:pPr>
       <w:r>
         <w:rPr>
           <w:rFonts w:ascii="Khmer OS Battambang" w:hAnsi="Khmer OS Battambang"/>
@@ -2157,7 +1913,7 @@
           <w:sz w:val="21"/>
           <w:rFonts w:ascii="Khmer OS Battambang" w:hAnsi="Khmer OS Battambang" w:cs="Khmer OS Battambang"/>
         </w:rPr>
-        <w:t>បញ្ចូល បន្ទប់សិក្សា ឬវេនសិក្សា (បើមាន)។</w:t>
+        <w:t>ប្រព័ន្ធនឹងទាញយកឈ្មោះថ្នាក់រៀនទាំងអស់ពីឆ្នាំសិក្សាចាស់ មកបង្កើតក្នុងឆ្នាំសិក្សាថ្មីជូនលោកគ្រូ-អ្នកគ្រូដោយស្វ័យប្រវត្តិ។</w:t>
       </w:r>
     </w:p>
     <w:p>
@@ -2165,17 +1921,6 @@
         <w:pStyle w:val="ListBullet"/>
         <w:spacing w:before="20" w:after="60" w:line="300" w:lineRule="auto"/>
       </w:pPr>
-      <w:r>
-        <w:rPr>
-          <w:rFonts w:ascii="Khmer OS Battambang" w:hAnsi="Khmer OS Battambang"/>
-          <w:b/>
-          <w:i w:val="0"/>
-          <w:color w:val="0F172A"/>
-          <w:sz w:val="21"/>
-          <w:rFonts w:ascii="Khmer OS Battambang" w:hAnsi="Khmer OS Battambang" w:cs="Khmer OS Battambang"/>
-        </w:rPr>
-        <w:t xml:space="preserve">ជំហានទី ៥៖ </w:t>
-      </w:r>
       <w:r>
         <w:rPr>
           <w:rFonts w:ascii="Khmer OS Battambang" w:hAnsi="Khmer OS Battambang"/>
@@ -2185,7 +1930,43 @@
           <w:sz w:val="21"/>
           <w:rFonts w:ascii="Khmer OS Battambang" w:hAnsi="Khmer OS Battambang" w:cs="Khmer OS Battambang"/>
         </w:rPr>
-        <w:t>ចុចលើប៊ូតុង «រក្សាទុក (Save)»។ ថ្នាក់រៀនថ្មីនឹងបង្ហាញភ្លាមៗក្នុងបញ្ជី។</w:t>
+        <w:t>បញ្ជីឈ្មោះសិស្ស វត្តមាន និងពិន្ទុនៃឆ្នាំថ្មី នឹងចាប់ផ្តើមជាទំព័រស្អាត (Clean Slate) ដើម្បីឱ្យគ្រូបន្ថែមសិស្សថ្មីចូលរៀន។</w:t>
+      </w:r>
+    </w:p>
+    <w:p>
+      <w:pPr>
+        <w:keepNext/>
+        <w:spacing w:before="400" w:after="120"/>
+        <w:pBdr>
+          <w:bottom w:val="single" w:sz="16" w:space="4" w:color="0284C7"/>
+        </w:pBdr>
+      </w:pPr>
+      <w:r>
+        <w:rPr>
+          <w:rFonts w:ascii="Khmer OS Muol Light" w:hAnsi="Khmer OS Muol Light"/>
+          <w:b/>
+          <w:i w:val="0"/>
+          <w:color w:val="0F172A"/>
+          <w:sz w:val="27"/>
+          <w:rFonts w:ascii="Khmer OS Muol Light" w:hAnsi="Khmer OS Muol Light" w:cs="Khmer OS Muol Light"/>
+        </w:rPr>
+        <w:t>ជំពូកទី ៤៖ ការបំពេញព័ត៌មានផ្ទាល់ខ្លួនគ្រូ ហត្ថលេខា និងត្រាសាលា</w:t>
+      </w:r>
+    </w:p>
+    <w:p>
+      <w:pPr>
+        <w:spacing w:before="0" w:after="80" w:line="300" w:lineRule="auto"/>
+      </w:pPr>
+      <w:r>
+        <w:rPr>
+          <w:rFonts w:ascii="Khmer OS Battambang" w:hAnsi="Khmer OS Battambang"/>
+          <w:b w:val="0"/>
+          <w:i w:val="0"/>
+          <w:color w:val="334155"/>
+          <w:sz w:val="22"/>
+          <w:rFonts w:ascii="Khmer OS Battambang" w:hAnsi="Khmer OS Battambang" w:cs="Khmer OS Battambang"/>
+        </w:rPr>
+        <w:t>ទំព័រ «បំពេញព័ត៌មានផ្ទាល់ខ្លួន (/profile)» គឺជាចំណុចស្នូលក្នុងការកំណត់អត្តសញ្ញាណរបស់លោកគ្រូ-អ្នកគ្រូ និងស្ថាប័នអប់រំ។ ព័ត៌មានដែលបានបំពេញនៅទីនេះ នឹងត្រូវយកទៅប្រើប្រាស់ស្វ័យប្រវត្តិនៅលើក្បាលរបាយការណ៍ វិញ្ញាបនបត្រ និងទំនាក់ទំនង។</w:t>
       </w:r>
     </w:p>
     <w:p>
@@ -2202,7 +1983,7 @@
           <w:sz w:val="24"/>
           <w:rFonts w:ascii="Khmer OS Battambang" w:hAnsi="Khmer OS Battambang" w:cs="Khmer OS Battambang"/>
         </w:rPr>
-        <w:t>៤.២. ការកែសម្រួល ឬលុបថ្នាក់រៀន</w:t>
+        <w:t>៤.១. ព័ត៌មានទូទៅរបស់គ្រូបង្រៀន</w:t>
       </w:r>
     </w:p>
     <w:p>
@@ -2219,150 +2000,7 @@
           <w:sz w:val="21"/>
           <w:rFonts w:ascii="Khmer OS Battambang" w:hAnsi="Khmer OS Battambang" w:cs="Khmer OS Battambang"/>
         </w:rPr>
-        <w:t>ការកែប្រែ (Edit)៖ ចុចលើប៊ូតុង «កែប្រែ ✏️» នៅជួរថ្នាក់រៀនដែលចង់ប្តូរឈ្មោះ រួចចុច Save។</w:t>
-      </w:r>
-    </w:p>
-    <w:p>
-      <w:pPr>
-        <w:pStyle w:val="ListBullet"/>
-        <w:spacing w:before="20" w:after="60" w:line="300" w:lineRule="auto"/>
-      </w:pPr>
-      <w:r>
-        <w:rPr>
-          <w:rFonts w:ascii="Khmer OS Battambang" w:hAnsi="Khmer OS Battambang"/>
-          <w:b w:val="0"/>
-          <w:i w:val="0"/>
-          <w:color w:val="334155"/>
-          <w:sz w:val="21"/>
-          <w:rFonts w:ascii="Khmer OS Battambang" w:hAnsi="Khmer OS Battambang" w:cs="Khmer OS Battambang"/>
-        </w:rPr>
-        <w:t>ការលុប (Delete)៖ ចុចលើប៊ូតុង «លុប 🗑️» ក្នុងករណីបញ្ចប់ការបង្រៀនថ្នាក់នោះ។ (ប្រព័ន្ធនឹងបញ្ជាក់ការយល់ព្រមមុននឹងលុប)។</w:t>
-      </w:r>
-    </w:p>
-    <w:p>
-      <w:pPr>
-        <w:keepNext/>
-        <w:spacing w:before="400" w:after="120"/>
-        <w:pBdr>
-          <w:bottom w:val="single" w:sz="16" w:space="4" w:color="0284C7"/>
-        </w:pBdr>
-      </w:pPr>
-      <w:r>
-        <w:rPr>
-          <w:rFonts w:ascii="Khmer OS Muol Light" w:hAnsi="Khmer OS Muol Light"/>
-          <w:b/>
-          <w:i w:val="0"/>
-          <w:color w:val="0F172A"/>
-          <w:sz w:val="27"/>
-          <w:rFonts w:ascii="Khmer OS Muol Light" w:hAnsi="Khmer OS Muol Light" w:cs="Khmer OS Muol Light"/>
-        </w:rPr>
-        <w:t>ជំពូកទី ៥៖ ការគ្រប់គ្រងបញ្ជីឈ្មោះសិស្ស (Students Management)</w:t>
-      </w:r>
-    </w:p>
-    <w:p>
-      <w:pPr>
-        <w:spacing w:before="0" w:after="80" w:line="300" w:lineRule="auto"/>
-      </w:pPr>
-      <w:r>
-        <w:rPr>
-          <w:rFonts w:ascii="Khmer OS Battambang" w:hAnsi="Khmer OS Battambang"/>
-          <w:b w:val="0"/>
-          <w:i w:val="0"/>
-          <w:color w:val="334155"/>
-          <w:sz w:val="22"/>
-          <w:rFonts w:ascii="Khmer OS Battambang" w:hAnsi="Khmer OS Battambang" w:cs="Khmer OS Battambang"/>
-        </w:rPr>
-        <w:t>ការគ្រប់គ្រងទិន្នន័យសិស្សគឺជាមូលដ្ឋានគ្រឹះក្នុងការស្រង់វត្តមាន និងបញ្ចូលពិន្ទុ។</w:t>
-      </w:r>
-    </w:p>
-    <w:p>
-      <w:pPr>
-        <w:keepNext/>
-        <w:spacing w:before="280" w:after="80"/>
-      </w:pPr>
-      <w:r>
-        <w:rPr>
-          <w:rFonts w:ascii="Khmer OS Battambang" w:hAnsi="Khmer OS Battambang"/>
-          <w:b/>
-          <w:i w:val="0"/>
-          <w:color w:val="0284C7"/>
-          <w:sz w:val="24"/>
-          <w:rFonts w:ascii="Khmer OS Battambang" w:hAnsi="Khmer OS Battambang" w:cs="Khmer OS Battambang"/>
-        </w:rPr>
-        <w:t>៥.១. របៀបបន្ថែមសិស្សថ្មីចូលក្នុងថ្នាក់</w:t>
-      </w:r>
-    </w:p>
-    <w:p>
-      <w:pPr>
-        <w:pStyle w:val="ListBullet"/>
-        <w:spacing w:before="20" w:after="60" w:line="300" w:lineRule="auto"/>
-      </w:pPr>
-      <w:r>
-        <w:rPr>
-          <w:rFonts w:ascii="Khmer OS Battambang" w:hAnsi="Khmer OS Battambang"/>
-          <w:b/>
-          <w:i w:val="0"/>
-          <w:color w:val="0F172A"/>
-          <w:sz w:val="21"/>
-          <w:rFonts w:ascii="Khmer OS Battambang" w:hAnsi="Khmer OS Battambang" w:cs="Khmer OS Battambang"/>
-        </w:rPr>
-        <w:t xml:space="preserve">ជំហានទី ១៖ </w:t>
-      </w:r>
-      <w:r>
-        <w:rPr>
-          <w:rFonts w:ascii="Khmer OS Battambang" w:hAnsi="Khmer OS Battambang"/>
-          <w:b w:val="0"/>
-          <w:i w:val="0"/>
-          <w:color w:val="334155"/>
-          <w:sz w:val="21"/>
-          <w:rFonts w:ascii="Khmer OS Battambang" w:hAnsi="Khmer OS Battambang" w:cs="Khmer OS Battambang"/>
-        </w:rPr>
-        <w:t>ចុចលើម៉ឺនុយ «បញ្ជីឈ្មោះសិស្ស» -&gt; រួចចុចប៊ូតុង «+ បន្ថែមសិស្សថ្មី»។</w:t>
-      </w:r>
-    </w:p>
-    <w:p>
-      <w:pPr>
-        <w:pStyle w:val="ListBullet"/>
-        <w:spacing w:before="20" w:after="60" w:line="300" w:lineRule="auto"/>
-      </w:pPr>
-      <w:r>
-        <w:rPr>
-          <w:rFonts w:ascii="Khmer OS Battambang" w:hAnsi="Khmer OS Battambang"/>
-          <w:b/>
-          <w:i w:val="0"/>
-          <w:color w:val="0F172A"/>
-          <w:sz w:val="21"/>
-          <w:rFonts w:ascii="Khmer OS Battambang" w:hAnsi="Khmer OS Battambang" w:cs="Khmer OS Battambang"/>
-        </w:rPr>
-        <w:t xml:space="preserve">ជំហានទី ២ (ព័ត៌មានសិស្ស)៖ </w:t>
-      </w:r>
-      <w:r>
-        <w:rPr>
-          <w:rFonts w:ascii="Khmer OS Battambang" w:hAnsi="Khmer OS Battambang"/>
-          <w:b w:val="0"/>
-          <w:i w:val="0"/>
-          <w:color w:val="334155"/>
-          <w:sz w:val="21"/>
-          <w:rFonts w:ascii="Khmer OS Battambang" w:hAnsi="Khmer OS Battambang" w:cs="Khmer OS Battambang"/>
-        </w:rPr>
-        <w:t>លេខសម្គាល់សិស្ស (Student ID / Code)៖ ឧទាហរណ៍ STU-001 (ជាលេខកូដដែលសិស្សប្រើសម្រាប់ចូលប្រឡងអនឡាញ)។</w:t>
-      </w:r>
-    </w:p>
-    <w:p>
-      <w:pPr>
-        <w:pStyle w:val="ListBullet"/>
-        <w:spacing w:before="20" w:after="60" w:line="300" w:lineRule="auto"/>
-      </w:pPr>
-      <w:r>
-        <w:rPr>
-          <w:rFonts w:ascii="Khmer OS Battambang" w:hAnsi="Khmer OS Battambang"/>
-          <w:b w:val="0"/>
-          <w:i w:val="0"/>
-          <w:color w:val="334155"/>
-          <w:sz w:val="21"/>
-          <w:rFonts w:ascii="Khmer OS Battambang" w:hAnsi="Khmer OS Battambang" w:cs="Khmer OS Battambang"/>
-        </w:rPr>
-        <w:t>គោត្តនាម និងនាម (FullName)៖ វាយបញ្ចូលឈ្មោះជាភាសាខ្មែរ (ឧទាហរណ៍៖ សុខ សុភា)។</w:t>
+        <w:t>គោត្តនាម និងនាម (FullName)៖ បញ្ចូលឈ្មោះពេញរបស់គ្រូជាភាសាខ្មែរ (ឧទាហរណ៍៖ សំ គឹមឆេង)។</w:t>
       </w:r>
     </w:p>
     <w:p>
@@ -2396,7 +2034,7 @@
           <w:sz w:val="21"/>
           <w:rFonts w:ascii="Khmer OS Battambang" w:hAnsi="Khmer OS Battambang" w:cs="Khmer OS Battambang"/>
         </w:rPr>
-        <w:t>ថ្ងៃខែឆ្នាំកំណើត (Date of Birth)៖ ជ្រើសរើសតាមប្រតិទិន។</w:t>
+        <w:t>ឈ្មោះគ្រឹះស្ថានសិក្សា / សាលារៀន (School Name)៖ បញ្ចូលឈ្មោះសាលា (ឧទាហរណ៍៖ វិទ្យាល័យ នេត យ៉ង់ ឬ សាកលវិទ្យាល័យជាតិបាត់ដំបង)។</w:t>
       </w:r>
     </w:p>
     <w:p>
@@ -2413,7 +2051,7 @@
           <w:sz w:val="21"/>
           <w:rFonts w:ascii="Khmer OS Battambang" w:hAnsi="Khmer OS Battambang" w:cs="Khmer OS Battambang"/>
         </w:rPr>
-        <w:t>ថ្នាក់រៀន (Classroom)៖ ជ្រើសរើសថ្នាក់ដែលសិស្សនោះកំពុងរៀន។</w:t>
+        <w:t>រាជធានី / ខេត្ត (Province)៖ បញ្ចូលទីតាំងខេត្ត (ឧទាហរណ៍៖ ខេត្តបាត់ដំបង)។</w:t>
       </w:r>
     </w:p>
     <w:p>
@@ -2430,7 +2068,7 @@
           <w:sz w:val="21"/>
           <w:rFonts w:ascii="Khmer OS Battambang" w:hAnsi="Khmer OS Battambang" w:cs="Khmer OS Battambang"/>
         </w:rPr>
-        <w:t>លេខទូរស័ព្ទអាណាព្យាបាល (Parent Contact)៖ សម្រាប់ទាក់ទងករណីចាំបាច់។</w:t>
+        <w:t>មុខវិជ្ជាបង្រៀន (Teaching Subject)៖ ឧទាហរណ៍៖ រូបវិទ្យា, គណិតវិទ្យា, ព័ត៌មានវិទ្យា។</w:t>
       </w:r>
     </w:p>
     <w:p>
@@ -2438,17 +2076,6 @@
         <w:pStyle w:val="ListBullet"/>
         <w:spacing w:before="20" w:after="60" w:line="300" w:lineRule="auto"/>
       </w:pPr>
-      <w:r>
-        <w:rPr>
-          <w:rFonts w:ascii="Khmer OS Battambang" w:hAnsi="Khmer OS Battambang"/>
-          <w:b/>
-          <w:i w:val="0"/>
-          <w:color w:val="0F172A"/>
-          <w:sz w:val="21"/>
-          <w:rFonts w:ascii="Khmer OS Battambang" w:hAnsi="Khmer OS Battambang" w:cs="Khmer OS Battambang"/>
-        </w:rPr>
-        <w:t xml:space="preserve">ជំហានទី ៣៖ </w:t>
-      </w:r>
       <w:r>
         <w:rPr>
           <w:rFonts w:ascii="Khmer OS Battambang" w:hAnsi="Khmer OS Battambang"/>
@@ -2458,7 +2085,24 @@
           <w:sz w:val="21"/>
           <w:rFonts w:ascii="Khmer OS Battambang" w:hAnsi="Khmer OS Battambang" w:cs="Khmer OS Battambang"/>
         </w:rPr>
-        <w:t>ចុចប៊ូតុង «រក្សាទុកសិស្ស (Save Student)»។</w:t>
+        <w:t>ថ្នាក់បង្រៀន (Teaching Classes)៖ បញ្ជាក់ថ្នាក់ដែលទទួលបន្ទុក (ឧទាហរណ៍៖ ថ្នាក់ទី១០ A, ១១ B)។</w:t>
+      </w:r>
+    </w:p>
+    <w:p>
+      <w:pPr>
+        <w:pStyle w:val="ListBullet"/>
+        <w:spacing w:before="20" w:after="60" w:line="300" w:lineRule="auto"/>
+      </w:pPr>
+      <w:r>
+        <w:rPr>
+          <w:rFonts w:ascii="Khmer OS Battambang" w:hAnsi="Khmer OS Battambang"/>
+          <w:b w:val="0"/>
+          <w:i w:val="0"/>
+          <w:color w:val="334155"/>
+          <w:sz w:val="21"/>
+          <w:rFonts w:ascii="Khmer OS Battambang" w:hAnsi="Khmer OS Battambang" w:cs="Khmer OS Battambang"/>
+        </w:rPr>
+        <w:t>លេខទូរស័ព្ទ (Phone Number)៖ សម្រាប់ទំនាក់ទំនងការងារ។</w:t>
       </w:r>
     </w:p>
     <w:p>
@@ -2475,7 +2119,7 @@
           <w:sz w:val="24"/>
           <w:rFonts w:ascii="Khmer OS Battambang" w:hAnsi="Khmer OS Battambang" w:cs="Khmer OS Battambang"/>
         </w:rPr>
-        <w:t>៥.២. ការស្វែងរក និងច្រោះមើលឈ្មោះសិស្ស</w:t>
+        <w:t>៤.២. ការភ្ជាប់គណនីតេឡេក្រាមផ្ទាល់ខ្លួន (Personal Telegram Integration)</w:t>
       </w:r>
     </w:p>
     <w:p>
@@ -2491,27 +2135,58 @@
           <w:sz w:val="22"/>
           <w:rFonts w:ascii="Khmer OS Battambang" w:hAnsi="Khmer OS Battambang" w:cs="Khmer OS Battambang"/>
         </w:rPr>
-        <w:t>លោកគ្រូ-អ្នកគ្រូអាចប្រើប្រអប់ជ្រើសរើសថ្នាក់រៀន (Filter by Class) ដើម្បីបង្ហាញតែឈ្មោះសិស្សក្នុងថ្នាក់ដែលចង់មើលបានយ៉ាងរហ័ស ដោយមិនបាច់រកមើលក្នុងចំណោមសិស្សទាំងអស់ឡើយ។</w:t>
+        <w:t>គ្រូនីមួយៗអាចបញ្ចូល គណនីតេឡេក្រាមផ្ទាល់ខ្លួន របស់គាត់បាន (ឧទាហរណ៍៖ Kimchheng12 ឬ somuny_teacher)៖</w:t>
       </w:r>
     </w:p>
     <w:p>
       <w:pPr>
-        <w:keepNext/>
-        <w:spacing w:before="400" w:after="120"/>
-        <w:pBdr>
-          <w:bottom w:val="single" w:sz="16" w:space="4" w:color="0284C7"/>
-        </w:pBdr>
+        <w:pStyle w:val="ListBullet"/>
+        <w:spacing w:before="20" w:after="60" w:line="300" w:lineRule="auto"/>
       </w:pPr>
       <w:r>
         <w:rPr>
-          <w:rFonts w:ascii="Khmer OS Muol Light" w:hAnsi="Khmer OS Muol Light"/>
+          <w:rFonts w:ascii="Khmer OS Battambang" w:hAnsi="Khmer OS Battambang"/>
+          <w:b w:val="0"/>
+          <w:i w:val="0"/>
+          <w:color w:val="334155"/>
+          <w:sz w:val="21"/>
+          <w:rFonts w:ascii="Khmer OS Battambang" w:hAnsi="Khmer OS Battambang" w:cs="Khmer OS Battambang"/>
+        </w:rPr>
+        <w:t>នៅពេលគ្រូបានបញ្ចូលគណនី Telegram របស់គាត់ហើយ ប្រព័ន្ធនឹងធ្វើបច្ចុប្បន្នភាពតំណភ្ជាប់ Telegram នៅលើ Sidebar ខាងឆ្វេង និងផ្ទាំង Dashboard របស់គ្រូនោះដោយស្វ័យប្រវត្តិ។</w:t>
+      </w:r>
+    </w:p>
+    <w:p>
+      <w:pPr>
+        <w:pStyle w:val="ListBullet"/>
+        <w:spacing w:before="20" w:after="60" w:line="300" w:lineRule="auto"/>
+      </w:pPr>
+      <w:r>
+        <w:rPr>
+          <w:rFonts w:ascii="Khmer OS Battambang" w:hAnsi="Khmer OS Battambang"/>
+          <w:b w:val="0"/>
+          <w:i w:val="0"/>
+          <w:color w:val="334155"/>
+          <w:sz w:val="21"/>
+          <w:rFonts w:ascii="Khmer OS Battambang" w:hAnsi="Khmer OS Battambang" w:cs="Khmer OS Battambang"/>
+        </w:rPr>
+        <w:t>គ្រូផ្សេងៗទៀតនឹងមិនជាប់តេឡេក្រាមរបស់គ្រូដទៃឡើយ ដោយគ្រូនីមួយៗមានគណនីតេឡេក្រាមរៀងៗខ្លួន។</w:t>
+      </w:r>
+    </w:p>
+    <w:p>
+      <w:pPr>
+        <w:keepNext/>
+        <w:spacing w:before="280" w:after="80"/>
+      </w:pPr>
+      <w:r>
+        <w:rPr>
+          <w:rFonts w:ascii="Khmer OS Battambang" w:hAnsi="Khmer OS Battambang"/>
           <w:b/>
           <w:i w:val="0"/>
-          <w:color w:val="0F172A"/>
-          <w:sz w:val="27"/>
-          <w:rFonts w:ascii="Khmer OS Muol Light" w:hAnsi="Khmer OS Muol Light" w:cs="Khmer OS Muol Light"/>
+          <w:color w:val="0284C7"/>
+          <w:sz w:val="24"/>
+          <w:rFonts w:ascii="Khmer OS Battambang" w:hAnsi="Khmer OS Battambang" w:cs="Khmer OS Battambang"/>
         </w:rPr>
-        <w:t>ជំពូកទី ៦៖ ការកត់ត្រាវត្តមានសិស្សប្រចាំថ្ងៃ (Daily Attendance Tracking)</w:t>
+        <w:t>៤.៣. ការបញ្ចូលហត្ថលេខាគ្រូ ហត្ថលេខានាយក និងត្រាសាលា</w:t>
       </w:r>
     </w:p>
     <w:p>
@@ -2527,42 +2202,14 @@
           <w:sz w:val="22"/>
           <w:rFonts w:ascii="Khmer OS Battambang" w:hAnsi="Khmer OS Battambang" w:cs="Khmer OS Battambang"/>
         </w:rPr>
-        <w:t>ការកត់ត្រាវត្តមានត្រូវបានរៀបចំឡើងជាទម្រង់ឌីជីថល ដោយគ្រាន់តែចុច Check លើស្ថានភាពវត្តមានរបស់សិស្សម្នាក់ៗ។</w:t>
+        <w:t>ប្រព័ន្ធបានរៀបចំផ្ទាំងគូរ និង Upload ឌីជីថលយ៉ាងទំនើប៖</w:t>
       </w:r>
     </w:p>
     <w:p>
       <w:pPr>
-        <w:keepNext/>
-        <w:spacing w:before="280" w:after="80"/>
-      </w:pPr>
-      <w:r>
-        <w:rPr>
-          <w:rFonts w:ascii="Khmer OS Battambang" w:hAnsi="Khmer OS Battambang"/>
-          <w:b/>
-          <w:i w:val="0"/>
-          <w:color w:val="0284C7"/>
-          <w:sz w:val="24"/>
-          <w:rFonts w:ascii="Khmer OS Battambang" w:hAnsi="Khmer OS Battambang" w:cs="Khmer OS Battambang"/>
-        </w:rPr>
-        <w:t>៦.១. និមិត្តសញ្ញាវត្តមាន</w:t>
-      </w:r>
-    </w:p>
-    <w:p>
-      <w:pPr>
         <w:pStyle w:val="ListBullet"/>
         <w:spacing w:before="20" w:after="60" w:line="300" w:lineRule="auto"/>
       </w:pPr>
-      <w:r>
-        <w:rPr>
-          <w:rFonts w:ascii="Khmer OS Battambang" w:hAnsi="Khmer OS Battambang"/>
-          <w:b/>
-          <w:i w:val="0"/>
-          <w:color w:val="0F172A"/>
-          <w:sz w:val="21"/>
-          <w:rFonts w:ascii="Khmer OS Battambang" w:hAnsi="Khmer OS Battambang" w:cs="Khmer OS Battambang"/>
-        </w:rPr>
-        <w:t xml:space="preserve">✔️ P (Present)៖ </w:t>
-      </w:r>
       <w:r>
         <w:rPr>
           <w:rFonts w:ascii="Khmer OS Battambang" w:hAnsi="Khmer OS Battambang"/>
@@ -2572,7 +2219,7 @@
           <w:sz w:val="21"/>
           <w:rFonts w:ascii="Khmer OS Battambang" w:hAnsi="Khmer OS Battambang" w:cs="Khmer OS Battambang"/>
         </w:rPr>
-        <w:t>វត្តមាន (Present - ពណ៌បៃតង)៖ សិស្សបានចូលរៀនពេញលេញ។</w:t>
+        <w:t>ហត្ថលេខាគ្រូបង្រៀន (Teacher Signature)៖ អាចគូសដោយផ្ទាល់ដៃលើអេក្រង់ (Signature Drawing Pad) ឬចុច Upload ជារូបភាពហត្ថលេខាដែលមានស្រាប់។</w:t>
       </w:r>
     </w:p>
     <w:p>
@@ -2580,17 +2227,6 @@
         <w:pStyle w:val="ListBullet"/>
         <w:spacing w:before="20" w:after="60" w:line="300" w:lineRule="auto"/>
       </w:pPr>
-      <w:r>
-        <w:rPr>
-          <w:rFonts w:ascii="Khmer OS Battambang" w:hAnsi="Khmer OS Battambang"/>
-          <w:b/>
-          <w:i w:val="0"/>
-          <w:color w:val="0F172A"/>
-          <w:sz w:val="21"/>
-          <w:rFonts w:ascii="Khmer OS Battambang" w:hAnsi="Khmer OS Battambang" w:cs="Khmer OS Battambang"/>
-        </w:rPr>
-        <w:t xml:space="preserve">❌ A (Absent)៖ </w:t>
-      </w:r>
       <w:r>
         <w:rPr>
           <w:rFonts w:ascii="Khmer OS Battambang" w:hAnsi="Khmer OS Battambang"/>
@@ -2600,7 +2236,7 @@
           <w:sz w:val="21"/>
           <w:rFonts w:ascii="Khmer OS Battambang" w:hAnsi="Khmer OS Battambang" w:cs="Khmer OS Battambang"/>
         </w:rPr>
-        <w:t>អវត្តមានឥតច្បាប់ (Absent - ពណ៌ក្រហម)៖ សិស្សឈប់រៀនដោយគ្មានការសុំច្បាប់។</w:t>
+        <w:t>ហត្ថលេខានាយកសាលា (Principal Signature)៖ អាចគូស ឬ Upload រូបភាពហត្ថលេខានាយកសាលា។</w:t>
       </w:r>
     </w:p>
     <w:p>
@@ -2608,17 +2244,6 @@
         <w:pStyle w:val="ListBullet"/>
         <w:spacing w:before="20" w:after="60" w:line="300" w:lineRule="auto"/>
       </w:pPr>
-      <w:r>
-        <w:rPr>
-          <w:rFonts w:ascii="Khmer OS Battambang" w:hAnsi="Khmer OS Battambang"/>
-          <w:b/>
-          <w:i w:val="0"/>
-          <w:color w:val="0F172A"/>
-          <w:sz w:val="21"/>
-          <w:rFonts w:ascii="Khmer OS Battambang" w:hAnsi="Khmer OS Battambang" w:cs="Khmer OS Battambang"/>
-        </w:rPr>
-        <w:t xml:space="preserve">⚠️ L (Permission)៖ </w:t>
-      </w:r>
       <w:r>
         <w:rPr>
           <w:rFonts w:ascii="Khmer OS Battambang" w:hAnsi="Khmer OS Battambang"/>
@@ -2628,42 +2253,14 @@
           <w:sz w:val="21"/>
           <w:rFonts w:ascii="Khmer OS Battambang" w:hAnsi="Khmer OS Battambang" w:cs="Khmer OS Battambang"/>
         </w:rPr>
-        <w:t>អវត្តមានមានច្បាប់ (Permission/Leave - ពណ៌លឿង)៖ សិស្សមានលិខិតសុំច្បាប់ ឬអាណាព្យាបាលបានជូនដំណឹង។</w:t>
+        <w:t>ត្រាសាលារៀន (Official School Stamp)៖ Upload រូបភាពត្រាមូល ឬត្រាផ្លូវការរបស់សាលារៀន (ទម្រង់ PNG ឬ JPG)។</w:t>
       </w:r>
     </w:p>
     <w:p>
       <w:pPr>
-        <w:keepNext/>
-        <w:spacing w:before="280" w:after="80"/>
-      </w:pPr>
-      <w:r>
-        <w:rPr>
-          <w:rFonts w:ascii="Khmer OS Battambang" w:hAnsi="Khmer OS Battambang"/>
-          <w:b/>
-          <w:i w:val="0"/>
-          <w:color w:val="0284C7"/>
-          <w:sz w:val="24"/>
-          <w:rFonts w:ascii="Khmer OS Battambang" w:hAnsi="Khmer OS Battambang" w:cs="Khmer OS Battambang"/>
-        </w:rPr>
-        <w:t>៦.២. ជំហានកត់ត្រាវត្តមាន</w:t>
-      </w:r>
-    </w:p>
-    <w:p>
-      <w:pPr>
         <w:pStyle w:val="ListBullet"/>
         <w:spacing w:before="20" w:after="60" w:line="300" w:lineRule="auto"/>
       </w:pPr>
-      <w:r>
-        <w:rPr>
-          <w:rFonts w:ascii="Khmer OS Battambang" w:hAnsi="Khmer OS Battambang"/>
-          <w:b/>
-          <w:i w:val="0"/>
-          <w:color w:val="0F172A"/>
-          <w:sz w:val="21"/>
-          <w:rFonts w:ascii="Khmer OS Battambang" w:hAnsi="Khmer OS Battambang" w:cs="Khmer OS Battambang"/>
-        </w:rPr>
-        <w:t xml:space="preserve">ជំហានទី ១៖ </w:t>
-      </w:r>
       <w:r>
         <w:rPr>
           <w:rFonts w:ascii="Khmer OS Battambang" w:hAnsi="Khmer OS Battambang"/>
@@ -2673,119 +2270,7 @@
           <w:sz w:val="21"/>
           <w:rFonts w:ascii="Khmer OS Battambang" w:hAnsi="Khmer OS Battambang" w:cs="Khmer OS Battambang"/>
         </w:rPr>
-        <w:t>ចូលទៅកាន់ម៉ឺនុយ «បញ្ជីវត្តមាន (Attendance)»។</w:t>
-      </w:r>
-    </w:p>
-    <w:p>
-      <w:pPr>
-        <w:pStyle w:val="ListBullet"/>
-        <w:spacing w:before="20" w:after="60" w:line="300" w:lineRule="auto"/>
-      </w:pPr>
-      <w:r>
-        <w:rPr>
-          <w:rFonts w:ascii="Khmer OS Battambang" w:hAnsi="Khmer OS Battambang"/>
-          <w:b/>
-          <w:i w:val="0"/>
-          <w:color w:val="0F172A"/>
-          <w:sz w:val="21"/>
-          <w:rFonts w:ascii="Khmer OS Battambang" w:hAnsi="Khmer OS Battambang" w:cs="Khmer OS Battambang"/>
-        </w:rPr>
-        <w:t xml:space="preserve">ជំហានទី ២៖ </w:t>
-      </w:r>
-      <w:r>
-        <w:rPr>
-          <w:rFonts w:ascii="Khmer OS Battambang" w:hAnsi="Khmer OS Battambang"/>
-          <w:b w:val="0"/>
-          <w:i w:val="0"/>
-          <w:color w:val="334155"/>
-          <w:sz w:val="21"/>
-          <w:rFonts w:ascii="Khmer OS Battambang" w:hAnsi="Khmer OS Battambang" w:cs="Khmer OS Battambang"/>
-        </w:rPr>
-        <w:t>ជ្រើសរើស ថ្នាក់រៀន (ឧទាហរណ៍៖ ថ្នាក់ទី១០ A)។</w:t>
-      </w:r>
-    </w:p>
-    <w:p>
-      <w:pPr>
-        <w:pStyle w:val="ListBullet"/>
-        <w:spacing w:before="20" w:after="60" w:line="300" w:lineRule="auto"/>
-      </w:pPr>
-      <w:r>
-        <w:rPr>
-          <w:rFonts w:ascii="Khmer OS Battambang" w:hAnsi="Khmer OS Battambang"/>
-          <w:b/>
-          <w:i w:val="0"/>
-          <w:color w:val="0F172A"/>
-          <w:sz w:val="21"/>
-          <w:rFonts w:ascii="Khmer OS Battambang" w:hAnsi="Khmer OS Battambang" w:cs="Khmer OS Battambang"/>
-        </w:rPr>
-        <w:t xml:space="preserve">ជំហានទី ៣៖ </w:t>
-      </w:r>
-      <w:r>
-        <w:rPr>
-          <w:rFonts w:ascii="Khmer OS Battambang" w:hAnsi="Khmer OS Battambang"/>
-          <w:b w:val="0"/>
-          <w:i w:val="0"/>
-          <w:color w:val="334155"/>
-          <w:sz w:val="21"/>
-          <w:rFonts w:ascii="Khmer OS Battambang" w:hAnsi="Khmer OS Battambang" w:cs="Khmer OS Battambang"/>
-        </w:rPr>
-        <w:t>ជ្រើសរើស កាលបរិច្ឆេទ (ថ្ងៃ ខែ ឆ្នាំ ដែលត្រូវកត់ត្រា)។</w:t>
-      </w:r>
-    </w:p>
-    <w:p>
-      <w:pPr>
-        <w:pStyle w:val="ListBullet"/>
-        <w:spacing w:before="20" w:after="60" w:line="300" w:lineRule="auto"/>
-      </w:pPr>
-      <w:r>
-        <w:rPr>
-          <w:rFonts w:ascii="Khmer OS Battambang" w:hAnsi="Khmer OS Battambang"/>
-          <w:b/>
-          <w:i w:val="0"/>
-          <w:color w:val="0F172A"/>
-          <w:sz w:val="21"/>
-          <w:rFonts w:ascii="Khmer OS Battambang" w:hAnsi="Khmer OS Battambang" w:cs="Khmer OS Battambang"/>
-        </w:rPr>
-        <w:t xml:space="preserve">ជំហានទី ៤៖ </w:t>
-      </w:r>
-      <w:r>
-        <w:rPr>
-          <w:rFonts w:ascii="Khmer OS Battambang" w:hAnsi="Khmer OS Battambang"/>
-          <w:b w:val="0"/>
-          <w:i w:val="0"/>
-          <w:color w:val="334155"/>
-          <w:sz w:val="21"/>
-          <w:rFonts w:ascii="Khmer OS Battambang" w:hAnsi="Khmer OS Battambang" w:cs="Khmer OS Battambang"/>
-        </w:rPr>
-        <w:t>ប្រព័ន្ធនឹងរាយនាមសិស្សទាំងអស់ក្នុងថ្នាក់នោះដោយស្វ័យប្រវត្តិ។ លោកគ្រូ-អ្នកគ្រូគ្រាន់តែចុចជ្រើសរើសលើជម្រើស P, A ឬ L សម្រាប់សិស្សម្នាក់ៗ។</w:t>
-      </w:r>
-    </w:p>
-    <w:p>
-      <w:pPr>
-        <w:pStyle w:val="ListBullet"/>
-        <w:spacing w:before="20" w:after="60" w:line="300" w:lineRule="auto"/>
-      </w:pPr>
-      <w:r>
-        <w:rPr>
-          <w:rFonts w:ascii="Khmer OS Battambang" w:hAnsi="Khmer OS Battambang"/>
-          <w:b/>
-          <w:i w:val="0"/>
-          <w:color w:val="0F172A"/>
-          <w:sz w:val="21"/>
-          <w:rFonts w:ascii="Khmer OS Battambang" w:hAnsi="Khmer OS Battambang" w:cs="Khmer OS Battambang"/>
-        </w:rPr>
-        <w:t xml:space="preserve">ជំហានទី ៥៖ </w:t>
-      </w:r>
-      <w:r>
-        <w:rPr>
-          <w:rFonts w:ascii="Khmer OS Battambang" w:hAnsi="Khmer OS Battambang"/>
-          <w:b w:val="0"/>
-          <w:i w:val="0"/>
-          <w:color w:val="334155"/>
-          <w:sz w:val="21"/>
-          <w:rFonts w:ascii="Khmer OS Battambang" w:hAnsi="Khmer OS Battambang" w:cs="Khmer OS Battambang"/>
-        </w:rPr>
-        <w:t>ចុចលើប៊ូតុង «រក្សាទុកវត្តមាន (Save Attendance)»។</w:t>
+        <w:t>បន្ទាប់ពីបំពេញរួចរាល់ ចុចប៊ូតុង «រក្សាទុកព័ត៌មានផ្ទាល់ខ្លួន»។ ប្រព័ន្ធនឹងជូនដំណឹងជោគជ័យភ្លាមៗ។</w:t>
       </w:r>
     </w:p>
     <w:tbl>
@@ -2829,7 +2314,7 @@
                 <w:sz w:val="22"/>
                 <w:rFonts w:ascii="Khmer OS Battambang" w:hAnsi="Khmer OS Battambang" w:cs="Khmer OS Battambang"/>
               </w:rPr>
-              <w:t xml:space="preserve">📌 គន្លឹះរហ័សក្នុងការកត់វត្តមាន: </w:t>
+              <w:t xml:space="preserve">📌 អត្ថប្រយោជន៍នៃត្រា និងហត្ថលេខាឌីជីថល: </w:t>
             </w:r>
             <w:r>
               <w:rPr>
@@ -2840,7 +2325,7 @@
                 <w:sz w:val="21"/>
                 <w:rFonts w:ascii="Khmer OS Battambang" w:hAnsi="Khmer OS Battambang" w:cs="Khmer OS Battambang"/>
               </w:rPr>
-              <w:t>ប្រព័ន្ធបានកំណត់លំនាំដើម (Default) ឱ្យសិស្សទាំងអស់មាន «វត្តមាន (P)» ជាស្រេច។ ដូច្នេះ លោកគ្រូ-អ្នកគ្រូគ្រាន់តែចុចប្តូរតែលើសិស្សណាដែលអវត្តមាន (A) ឬមានច្បាប់ (L) ប៉ុណ្ណោះ ដែលចំណាយពេលមិនដល់ ១ នាទីឡើយក្នុងមួយថ្នាក់!</w:t>
+              <w:t>រូបភាពត្រាសាលា និងហត្ថលេខាដែលលោកគ្រូ-អ្នកគ្រូបានរក្សាទុកក្នុងទំព័រព័ត៌មានផ្ទាល់ខ្លួន នឹងត្រូវបានតភ្ជាប់ដោយស្វ័យប្រវត្តិចូលទៅកាន់ «វិញ្ញាបនបត្របញ្ជាក់ការសិក្សា» របស់សិស្ស ដោយមិនចាំបាច់បោះត្រា ឬស៊ីញ៉េដោយដៃម្តងមួយៗលើក្រដាសឡើយ!</w:t>
             </w:r>
           </w:p>
         </w:tc>
@@ -2868,7 +2353,7 @@
           <w:sz w:val="27"/>
           <w:rFonts w:ascii="Khmer OS Muol Light" w:hAnsi="Khmer OS Muol Light" w:cs="Khmer OS Muol Light"/>
         </w:rPr>
-        <w:t>ជំពូកទី ៧៖ ការបញ្ចូល និងគ្រប់គ្រងពិន្ទុសិស្ស (Scores &amp; Grading Management)</w:t>
+        <w:t>ជំពូកទី ៥៖ ការគ្រប់គ្រងបញ្ជីថ្នាក់រៀនផ្ទាល់ខ្លួន (Classroom Management)</w:t>
       </w:r>
     </w:p>
     <w:p>
@@ -2884,7 +2369,7 @@
           <w:sz w:val="22"/>
           <w:rFonts w:ascii="Khmer OS Battambang" w:hAnsi="Khmer OS Battambang" w:cs="Khmer OS Battambang"/>
         </w:rPr>
-        <w:t>ប្រព័ន្ធគាំទ្រការគណនាពិន្ទុចម្រុះប្រកបដោយស្តង់ដារគរុកោសល្យខ្ពស់ ដោយរួមបញ្ចូលគ្នារវាងពិន្ទុតេស្តប្រចាំខែ ពិន្ទុវត្តមាន និងពិន្ទុកិច្ចការផ្ទះ។</w:t>
+        <w:t>លោកគ្រូ-អ្នកគ្រូអាចបង្រៀនច្រើនថ្នាក់ក្នុងពេលតែមួយ។ ប្រព័ន្ធគ្រប់គ្រងថ្នាក់រៀន ២០២៧ ធានាថាគ្រូនីមួយៗមានបញ្ជីថ្នាក់រៀនផ្ទាល់ខ្លួនដាច់ដោយឡែក ១០០%។</w:t>
       </w:r>
     </w:p>
     <w:p>
@@ -2901,7 +2386,218 @@
           <w:sz w:val="24"/>
           <w:rFonts w:ascii="Khmer OS Battambang" w:hAnsi="Khmer OS Battambang" w:cs="Khmer OS Battambang"/>
         </w:rPr>
-        <w:t>៧.១. ការកំណត់លក្ខខណ្ឌពិន្ទុ (Score Rules)</w:t>
+        <w:t>៥.១. ការបន្ថែមថ្នាក់រៀនថ្មី</w:t>
+      </w:r>
+    </w:p>
+    <w:p>
+      <w:pPr>
+        <w:pStyle w:val="ListBullet"/>
+        <w:spacing w:before="20" w:after="60" w:line="300" w:lineRule="auto"/>
+      </w:pPr>
+      <w:r>
+        <w:rPr>
+          <w:rFonts w:ascii="Khmer OS Battambang" w:hAnsi="Khmer OS Battambang"/>
+          <w:b/>
+          <w:i w:val="0"/>
+          <w:color w:val="0F172A"/>
+          <w:sz w:val="21"/>
+          <w:rFonts w:ascii="Khmer OS Battambang" w:hAnsi="Khmer OS Battambang" w:cs="Khmer OS Battambang"/>
+        </w:rPr>
+        <w:t xml:space="preserve">ជំហានទី ១៖ </w:t>
+      </w:r>
+      <w:r>
+        <w:rPr>
+          <w:rFonts w:ascii="Khmer OS Battambang" w:hAnsi="Khmer OS Battambang"/>
+          <w:b w:val="0"/>
+          <w:i w:val="0"/>
+          <w:color w:val="334155"/>
+          <w:sz w:val="21"/>
+          <w:rFonts w:ascii="Khmer OS Battambang" w:hAnsi="Khmer OS Battambang" w:cs="Khmer OS Battambang"/>
+        </w:rPr>
+        <w:t>ចូលទៅកាន់ម៉ឺនុយ «បញ្ជីថ្នាក់រៀនខ្ញុំ (Classrooms)»។</w:t>
+      </w:r>
+    </w:p>
+    <w:p>
+      <w:pPr>
+        <w:pStyle w:val="ListBullet"/>
+        <w:spacing w:before="20" w:after="60" w:line="300" w:lineRule="auto"/>
+      </w:pPr>
+      <w:r>
+        <w:rPr>
+          <w:rFonts w:ascii="Khmer OS Battambang" w:hAnsi="Khmer OS Battambang"/>
+          <w:b/>
+          <w:i w:val="0"/>
+          <w:color w:val="0F172A"/>
+          <w:sz w:val="21"/>
+          <w:rFonts w:ascii="Khmer OS Battambang" w:hAnsi="Khmer OS Battambang" w:cs="Khmer OS Battambang"/>
+        </w:rPr>
+        <w:t xml:space="preserve">ជំហានទី ២៖ </w:t>
+      </w:r>
+      <w:r>
+        <w:rPr>
+          <w:rFonts w:ascii="Khmer OS Battambang" w:hAnsi="Khmer OS Battambang"/>
+          <w:b w:val="0"/>
+          <w:i w:val="0"/>
+          <w:color w:val="334155"/>
+          <w:sz w:val="21"/>
+          <w:rFonts w:ascii="Khmer OS Battambang" w:hAnsi="Khmer OS Battambang" w:cs="Khmer OS Battambang"/>
+        </w:rPr>
+        <w:t>ចុចលើប៊ូតុងពណ៌ខៀវ «+ បន្ថែមថ្នាក់រៀនថ្មី»។</w:t>
+      </w:r>
+    </w:p>
+    <w:p>
+      <w:pPr>
+        <w:pStyle w:val="ListBullet"/>
+        <w:spacing w:before="20" w:after="60" w:line="300" w:lineRule="auto"/>
+      </w:pPr>
+      <w:r>
+        <w:rPr>
+          <w:rFonts w:ascii="Khmer OS Battambang" w:hAnsi="Khmer OS Battambang"/>
+          <w:b/>
+          <w:i w:val="0"/>
+          <w:color w:val="0F172A"/>
+          <w:sz w:val="21"/>
+          <w:rFonts w:ascii="Khmer OS Battambang" w:hAnsi="Khmer OS Battambang" w:cs="Khmer OS Battambang"/>
+        </w:rPr>
+        <w:t xml:space="preserve">ជំហានទី ៣៖ </w:t>
+      </w:r>
+      <w:r>
+        <w:rPr>
+          <w:rFonts w:ascii="Khmer OS Battambang" w:hAnsi="Khmer OS Battambang"/>
+          <w:b w:val="0"/>
+          <w:i w:val="0"/>
+          <w:color w:val="334155"/>
+          <w:sz w:val="21"/>
+          <w:rFonts w:ascii="Khmer OS Battambang" w:hAnsi="Khmer OS Battambang" w:cs="Khmer OS Battambang"/>
+        </w:rPr>
+        <w:t>វាយបញ្ចូល ឈ្មោះថ្នាក់រៀន (ឧទាហរណ៍៖ ថ្នាក់ទី១០ A, ថ្នាក់ទី១១ វិទ្យាសាស្ត្រ, ឬ IT-Year3)។</w:t>
+      </w:r>
+    </w:p>
+    <w:p>
+      <w:pPr>
+        <w:pStyle w:val="ListBullet"/>
+        <w:spacing w:before="20" w:after="60" w:line="300" w:lineRule="auto"/>
+      </w:pPr>
+      <w:r>
+        <w:rPr>
+          <w:rFonts w:ascii="Khmer OS Battambang" w:hAnsi="Khmer OS Battambang"/>
+          <w:b/>
+          <w:i w:val="0"/>
+          <w:color w:val="0F172A"/>
+          <w:sz w:val="21"/>
+          <w:rFonts w:ascii="Khmer OS Battambang" w:hAnsi="Khmer OS Battambang" w:cs="Khmer OS Battambang"/>
+        </w:rPr>
+        <w:t xml:space="preserve">ជំហានទី ៤៖ </w:t>
+      </w:r>
+      <w:r>
+        <w:rPr>
+          <w:rFonts w:ascii="Khmer OS Battambang" w:hAnsi="Khmer OS Battambang"/>
+          <w:b w:val="0"/>
+          <w:i w:val="0"/>
+          <w:color w:val="334155"/>
+          <w:sz w:val="21"/>
+          <w:rFonts w:ascii="Khmer OS Battambang" w:hAnsi="Khmer OS Battambang" w:cs="Khmer OS Battambang"/>
+        </w:rPr>
+        <w:t>វាយបញ្ចូល បន្ទប់សិក្សា ឬវេនសិក្សា (បើមាន)។</w:t>
+      </w:r>
+    </w:p>
+    <w:p>
+      <w:pPr>
+        <w:pStyle w:val="ListBullet"/>
+        <w:spacing w:before="20" w:after="60" w:line="300" w:lineRule="auto"/>
+      </w:pPr>
+      <w:r>
+        <w:rPr>
+          <w:rFonts w:ascii="Khmer OS Battambang" w:hAnsi="Khmer OS Battambang"/>
+          <w:b/>
+          <w:i w:val="0"/>
+          <w:color w:val="0F172A"/>
+          <w:sz w:val="21"/>
+          <w:rFonts w:ascii="Khmer OS Battambang" w:hAnsi="Khmer OS Battambang" w:cs="Khmer OS Battambang"/>
+        </w:rPr>
+        <w:t xml:space="preserve">ជំហានទី ៥៖ </w:t>
+      </w:r>
+      <w:r>
+        <w:rPr>
+          <w:rFonts w:ascii="Khmer OS Battambang" w:hAnsi="Khmer OS Battambang"/>
+          <w:b w:val="0"/>
+          <w:i w:val="0"/>
+          <w:color w:val="334155"/>
+          <w:sz w:val="21"/>
+          <w:rFonts w:ascii="Khmer OS Battambang" w:hAnsi="Khmer OS Battambang" w:cs="Khmer OS Battambang"/>
+        </w:rPr>
+        <w:t>ចុច «រក្សាទុក (Save)»។ ថ្នាក់រៀននឹងបង្ហាញក្នុងបញ្ជីភ្លាមៗ។</w:t>
+      </w:r>
+    </w:p>
+    <w:p>
+      <w:pPr>
+        <w:keepNext/>
+        <w:spacing w:before="280" w:after="80"/>
+      </w:pPr>
+      <w:r>
+        <w:rPr>
+          <w:rFonts w:ascii="Khmer OS Battambang" w:hAnsi="Khmer OS Battambang"/>
+          <w:b/>
+          <w:i w:val="0"/>
+          <w:color w:val="0284C7"/>
+          <w:sz w:val="24"/>
+          <w:rFonts w:ascii="Khmer OS Battambang" w:hAnsi="Khmer OS Battambang" w:cs="Khmer OS Battambang"/>
+        </w:rPr>
+        <w:t>៥.២. ការកែសម្រួល ឬលុបថ្នាក់រៀន</w:t>
+      </w:r>
+    </w:p>
+    <w:p>
+      <w:pPr>
+        <w:pStyle w:val="ListBullet"/>
+        <w:spacing w:before="20" w:after="60" w:line="300" w:lineRule="auto"/>
+      </w:pPr>
+      <w:r>
+        <w:rPr>
+          <w:rFonts w:ascii="Khmer OS Battambang" w:hAnsi="Khmer OS Battambang"/>
+          <w:b w:val="0"/>
+          <w:i w:val="0"/>
+          <w:color w:val="334155"/>
+          <w:sz w:val="21"/>
+          <w:rFonts w:ascii="Khmer OS Battambang" w:hAnsi="Khmer OS Battambang" w:cs="Khmer OS Battambang"/>
+        </w:rPr>
+        <w:t>ការកែប្រែ (Edit)៖ ចុចលើប៊ូតុង «កែប្រែ ✏️» ដើម្បីផ្លាស់ប្តូរឈ្មោះថ្នាក់ ឬបន្ទប់សិក្សា។</w:t>
+      </w:r>
+    </w:p>
+    <w:p>
+      <w:pPr>
+        <w:pStyle w:val="ListBullet"/>
+        <w:spacing w:before="20" w:after="60" w:line="300" w:lineRule="auto"/>
+      </w:pPr>
+      <w:r>
+        <w:rPr>
+          <w:rFonts w:ascii="Khmer OS Battambang" w:hAnsi="Khmer OS Battambang"/>
+          <w:b w:val="0"/>
+          <w:i w:val="0"/>
+          <w:color w:val="334155"/>
+          <w:sz w:val="21"/>
+          <w:rFonts w:ascii="Khmer OS Battambang" w:hAnsi="Khmer OS Battambang" w:cs="Khmer OS Battambang"/>
+        </w:rPr>
+        <w:t>ការលុប (Delete)៖ ចុចលើប៊ូតុង «លុប 🗑️» ប្រសិនបើលែងបង្រៀនថ្នាក់នោះ។ (ប្រព័ន្ធនឹងស្នើសុំការបញ្ជាក់មុននឹងលុប ដើម្បីជៀសវាងការច្រឡំដៃ)។</w:t>
+      </w:r>
+    </w:p>
+    <w:p>
+      <w:pPr>
+        <w:keepNext/>
+        <w:spacing w:before="400" w:after="120"/>
+        <w:pBdr>
+          <w:bottom w:val="single" w:sz="16" w:space="4" w:color="0284C7"/>
+        </w:pBdr>
+      </w:pPr>
+      <w:r>
+        <w:rPr>
+          <w:rFonts w:ascii="Khmer OS Muol Light" w:hAnsi="Khmer OS Muol Light"/>
+          <w:b/>
+          <w:i w:val="0"/>
+          <w:color w:val="0F172A"/>
+          <w:sz w:val="27"/>
+          <w:rFonts w:ascii="Khmer OS Muol Light" w:hAnsi="Khmer OS Muol Light" w:cs="Khmer OS Muol Light"/>
+        </w:rPr>
+        <w:t>ជំពូកទី ៦៖ ការគ្រប់គ្រងបញ្ជីឈ្មោះសិស្ស (Students Management)</w:t>
       </w:r>
     </w:p>
     <w:p>
@@ -2917,14 +2613,42 @@
           <w:sz w:val="22"/>
           <w:rFonts w:ascii="Khmer OS Battambang" w:hAnsi="Khmer OS Battambang" w:cs="Khmer OS Battambang"/>
         </w:rPr>
-        <w:t>មុនពេលបញ្ចូលពិន្ទុ លោកគ្រូ-អ្នកគ្រូអាចកំណត់ទម្ងន់ពិន្ទុតាមមុខវិជ្ជានីមួយៗបាន៖</w:t>
+        <w:t>ទិន្នន័យសិស្សគឺជាមូលដ្ឋានគ្រឹះសម្រាប់ដំណើរការស្រង់វត្តមាន បញ្ចូលពិន្ទុ និងការចេញវិញ្ញាបនបត្រ។ ក្នុងប្រព័ន្ធជំនាន់ថ្មី ទិន្នន័យគំរូចាស់ៗត្រូវបានលុបចេញស្អាត ដើម្បីឱ្យលោកគ្រូ-អ្នកគ្រូបញ្ចូលសិស្សពិតប្រាកដរបស់ខ្លួន។</w:t>
       </w:r>
     </w:p>
     <w:p>
       <w:pPr>
+        <w:keepNext/>
+        <w:spacing w:before="280" w:after="80"/>
+      </w:pPr>
+      <w:r>
+        <w:rPr>
+          <w:rFonts w:ascii="Khmer OS Battambang" w:hAnsi="Khmer OS Battambang"/>
+          <w:b/>
+          <w:i w:val="0"/>
+          <w:color w:val="0284C7"/>
+          <w:sz w:val="24"/>
+          <w:rFonts w:ascii="Khmer OS Battambang" w:hAnsi="Khmer OS Battambang" w:cs="Khmer OS Battambang"/>
+        </w:rPr>
+        <w:t>៦.១. របៀបបន្ថែមសិស្សថ្មី</w:t>
+      </w:r>
+    </w:p>
+    <w:p>
+      <w:pPr>
         <w:pStyle w:val="ListBullet"/>
         <w:spacing w:before="20" w:after="60" w:line="300" w:lineRule="auto"/>
       </w:pPr>
+      <w:r>
+        <w:rPr>
+          <w:rFonts w:ascii="Khmer OS Battambang" w:hAnsi="Khmer OS Battambang"/>
+          <w:b/>
+          <w:i w:val="0"/>
+          <w:color w:val="0F172A"/>
+          <w:sz w:val="21"/>
+          <w:rFonts w:ascii="Khmer OS Battambang" w:hAnsi="Khmer OS Battambang" w:cs="Khmer OS Battambang"/>
+        </w:rPr>
+        <w:t xml:space="preserve">ជំហានទី ១៖ </w:t>
+      </w:r>
       <w:r>
         <w:rPr>
           <w:rFonts w:ascii="Khmer OS Battambang" w:hAnsi="Khmer OS Battambang"/>
@@ -2934,7 +2658,7 @@
           <w:sz w:val="21"/>
           <w:rFonts w:ascii="Khmer OS Battambang" w:hAnsi="Khmer OS Battambang" w:cs="Khmer OS Battambang"/>
         </w:rPr>
-        <w:t>ពិន្ទុតេស្តប្រចាំខែ (Monthly Test Max Score)៖ ឧទាហរណ៍ ៧០ ពិន្ទុ។</w:t>
+        <w:t>ចុចលើម៉ឺនុយ «បញ្ជីឈ្មោះសិស្ស (Students)» -&gt; រួចចុចប៊ូតុង «+ បន្ថែមសិស្សថ្មី»។</w:t>
       </w:r>
     </w:p>
     <w:p>
@@ -2942,6 +2666,17 @@
         <w:pStyle w:val="ListBullet"/>
         <w:spacing w:before="20" w:after="60" w:line="300" w:lineRule="auto"/>
       </w:pPr>
+      <w:r>
+        <w:rPr>
+          <w:rFonts w:ascii="Khmer OS Battambang" w:hAnsi="Khmer OS Battambang"/>
+          <w:b/>
+          <w:i w:val="0"/>
+          <w:color w:val="0F172A"/>
+          <w:sz w:val="21"/>
+          <w:rFonts w:ascii="Khmer OS Battambang" w:hAnsi="Khmer OS Battambang" w:cs="Khmer OS Battambang"/>
+        </w:rPr>
+        <w:t xml:space="preserve">ជំហានទី ២ (បំពេញព័ត៌មាន)៖ </w:t>
+      </w:r>
       <w:r>
         <w:rPr>
           <w:rFonts w:ascii="Khmer OS Battambang" w:hAnsi="Khmer OS Battambang"/>
@@ -2951,7 +2686,7 @@
           <w:sz w:val="21"/>
           <w:rFonts w:ascii="Khmer OS Battambang" w:hAnsi="Khmer OS Battambang" w:cs="Khmer OS Battambang"/>
         </w:rPr>
-        <w:t>ពិន្ទុវត្តមាន (Attendance Max Score)៖ ឧទាហរណ៍ ១៥ ពិន្ទុ។</w:t>
+        <w:t>លេខសម្គាល់សិស្ស (Student ID / Code)៖ ឧទាហរណ៍ STU-001 (ជាលេខកូដដែលសិស្សប្រើសម្រាប់ចូលប្រឡងអនឡាញ)។</w:t>
       </w:r>
     </w:p>
     <w:p>
@@ -2968,7 +2703,7 @@
           <w:sz w:val="21"/>
           <w:rFonts w:ascii="Khmer OS Battambang" w:hAnsi="Khmer OS Battambang" w:cs="Khmer OS Battambang"/>
         </w:rPr>
-        <w:t>ពិន្ទុកិច្ចការផ្ទះ/ស្វ័យសិក្សា (Assignment Max Score)៖ ឧទាហរណ៍ ១៥ ពិន្ទុ។</w:t>
+        <w:t>គោត្តនាម និងនាម៖ វាយបញ្ចូលឈ្មោះជាភាសាខ្មែរ (ឧទាហរណ៍៖ កែវ វិសាល)។</w:t>
       </w:r>
     </w:p>
     <w:p>
@@ -2985,7 +2720,86 @@
           <w:sz w:val="21"/>
           <w:rFonts w:ascii="Khmer OS Battambang" w:hAnsi="Khmer OS Battambang" w:cs="Khmer OS Battambang"/>
         </w:rPr>
-        <w:t>ពិន្ទុសរុបអតិបរមា = ១០០ ពិន្ទុ។</w:t>
+        <w:t>ភេទ៖ ជ្រើសរើស ប្រុស ឬ ស្រី។</w:t>
+      </w:r>
+    </w:p>
+    <w:p>
+      <w:pPr>
+        <w:pStyle w:val="ListBullet"/>
+        <w:spacing w:before="20" w:after="60" w:line="300" w:lineRule="auto"/>
+      </w:pPr>
+      <w:r>
+        <w:rPr>
+          <w:rFonts w:ascii="Khmer OS Battambang" w:hAnsi="Khmer OS Battambang"/>
+          <w:b w:val="0"/>
+          <w:i w:val="0"/>
+          <w:color w:val="334155"/>
+          <w:sz w:val="21"/>
+          <w:rFonts w:ascii="Khmer OS Battambang" w:hAnsi="Khmer OS Battambang" w:cs="Khmer OS Battambang"/>
+        </w:rPr>
+        <w:t>ថ្ងៃខែឆ្នាំកំណើត៖ ជ្រើសរើសតាមប្រតិទិន។</w:t>
+      </w:r>
+    </w:p>
+    <w:p>
+      <w:pPr>
+        <w:pStyle w:val="ListBullet"/>
+        <w:spacing w:before="20" w:after="60" w:line="300" w:lineRule="auto"/>
+      </w:pPr>
+      <w:r>
+        <w:rPr>
+          <w:rFonts w:ascii="Khmer OS Battambang" w:hAnsi="Khmer OS Battambang"/>
+          <w:b w:val="0"/>
+          <w:i w:val="0"/>
+          <w:color w:val="334155"/>
+          <w:sz w:val="21"/>
+          <w:rFonts w:ascii="Khmer OS Battambang" w:hAnsi="Khmer OS Battambang" w:cs="Khmer OS Battambang"/>
+        </w:rPr>
+        <w:t>ថ្នាក់រៀន៖ ជ្រើសរើសថ្នាក់ដែលសិស្សនោះកំពុងរៀន។</w:t>
+      </w:r>
+    </w:p>
+    <w:p>
+      <w:pPr>
+        <w:pStyle w:val="ListBullet"/>
+        <w:spacing w:before="20" w:after="60" w:line="300" w:lineRule="auto"/>
+      </w:pPr>
+      <w:r>
+        <w:rPr>
+          <w:rFonts w:ascii="Khmer OS Battambang" w:hAnsi="Khmer OS Battambang"/>
+          <w:b w:val="0"/>
+          <w:i w:val="0"/>
+          <w:color w:val="334155"/>
+          <w:sz w:val="21"/>
+          <w:rFonts w:ascii="Khmer OS Battambang" w:hAnsi="Khmer OS Battambang" w:cs="Khmer OS Battambang"/>
+        </w:rPr>
+        <w:t>លេខទូរស័ព្ទអាណាព្យាបាល៖ សម្រាប់ទំនាក់ទំនងករណីចាំបាច់។</w:t>
+      </w:r>
+    </w:p>
+    <w:p>
+      <w:pPr>
+        <w:pStyle w:val="ListBullet"/>
+        <w:spacing w:before="20" w:after="60" w:line="300" w:lineRule="auto"/>
+      </w:pPr>
+      <w:r>
+        <w:rPr>
+          <w:rFonts w:ascii="Khmer OS Battambang" w:hAnsi="Khmer OS Battambang"/>
+          <w:b/>
+          <w:i w:val="0"/>
+          <w:color w:val="0F172A"/>
+          <w:sz w:val="21"/>
+          <w:rFonts w:ascii="Khmer OS Battambang" w:hAnsi="Khmer OS Battambang" w:cs="Khmer OS Battambang"/>
+        </w:rPr>
+        <w:t xml:space="preserve">ជំហានទី ៣៖ </w:t>
+      </w:r>
+      <w:r>
+        <w:rPr>
+          <w:rFonts w:ascii="Khmer OS Battambang" w:hAnsi="Khmer OS Battambang"/>
+          <w:b w:val="0"/>
+          <w:i w:val="0"/>
+          <w:color w:val="334155"/>
+          <w:sz w:val="21"/>
+          <w:rFonts w:ascii="Khmer OS Battambang" w:hAnsi="Khmer OS Battambang" w:cs="Khmer OS Battambang"/>
+        </w:rPr>
+        <w:t>ចុច «រក្សាទុកសិស្ស (Save Student)»។</w:t>
       </w:r>
     </w:p>
     <w:p>
@@ -3002,7 +2816,7 @@
           <w:sz w:val="24"/>
           <w:rFonts w:ascii="Khmer OS Battambang" w:hAnsi="Khmer OS Battambang" w:cs="Khmer OS Battambang"/>
         </w:rPr>
-        <w:t>៧.២. តារាងកម្រិតនិទ្ទេសស្វ័យប្រវត្តិ (Grade Scale)</w:t>
+        <w:t>៦.២. ការច្រោះមើលឈ្មោះសិស្ស</w:t>
       </w:r>
     </w:p>
     <w:p>
@@ -3018,7 +2832,615 @@
           <w:sz w:val="22"/>
           <w:rFonts w:ascii="Khmer OS Battambang" w:hAnsi="Khmer OS Battambang" w:cs="Khmer OS Battambang"/>
         </w:rPr>
-        <w:t>ប្រព័ន្ធនឹងធ្វើការបូកសរុបពិន្ទុ និងគណនានិទ្ទេសជូនសិស្សដោយស្វ័យប្រវត្តិតាមរូបមន្តស្តង់ដារជាតិ៖</w:t>
+        <w:t>លោកគ្រូ-អ្នកគ្រូអាចប្រើប្រអប់ជ្រើសរើសថ្នាក់រៀន (Filter by Class) ដើម្បីបង្ហាញតែបញ្ជីសិស្សក្នុងថ្នាក់ដែលចង់ពិនិត្យបានយ៉ាងលឿន។</w:t>
+      </w:r>
+    </w:p>
+    <w:p>
+      <w:pPr>
+        <w:keepNext/>
+        <w:spacing w:before="400" w:after="120"/>
+        <w:pBdr>
+          <w:bottom w:val="single" w:sz="16" w:space="4" w:color="0284C7"/>
+        </w:pBdr>
+      </w:pPr>
+      <w:r>
+        <w:rPr>
+          <w:rFonts w:ascii="Khmer OS Muol Light" w:hAnsi="Khmer OS Muol Light"/>
+          <w:b/>
+          <w:i w:val="0"/>
+          <w:color w:val="0F172A"/>
+          <w:sz w:val="27"/>
+          <w:rFonts w:ascii="Khmer OS Muol Light" w:hAnsi="Khmer OS Muol Light" w:cs="Khmer OS Muol Light"/>
+        </w:rPr>
+        <w:t>ជំពូកទី ៧៖ ការកត់ត្រា និងតាមដានអវត្តមានសិស្ស (Attendance Tracking)</w:t>
+      </w:r>
+    </w:p>
+    <w:p>
+      <w:pPr>
+        <w:spacing w:before="0" w:after="80" w:line="300" w:lineRule="auto"/>
+      </w:pPr>
+      <w:r>
+        <w:rPr>
+          <w:rFonts w:ascii="Khmer OS Battambang" w:hAnsi="Khmer OS Battambang"/>
+          <w:b w:val="0"/>
+          <w:i w:val="0"/>
+          <w:color w:val="334155"/>
+          <w:sz w:val="22"/>
+          <w:rFonts w:ascii="Khmer OS Battambang" w:hAnsi="Khmer OS Battambang" w:cs="Khmer OS Battambang"/>
+        </w:rPr>
+        <w:t>ការកត់ត្រាវត្តមានត្រូវបានធ្វើទំនើបកម្មឱ្យស្របតាមស្តង់ដារអប់រំនៅកម្ពុជា ដោយបែងចែកប្រភេទអវត្តមានជា «ច្បាប់» និង «គ្មានច្បាប់» យ៉ាងច្បាស់លាស់។</w:t>
+      </w:r>
+    </w:p>
+    <w:p>
+      <w:pPr>
+        <w:keepNext/>
+        <w:spacing w:before="280" w:after="80"/>
+      </w:pPr>
+      <w:r>
+        <w:rPr>
+          <w:rFonts w:ascii="Khmer OS Battambang" w:hAnsi="Khmer OS Battambang"/>
+          <w:b/>
+          <w:i w:val="0"/>
+          <w:color w:val="0284C7"/>
+          <w:sz w:val="24"/>
+          <w:rFonts w:ascii="Khmer OS Battambang" w:hAnsi="Khmer OS Battambang" w:cs="Khmer OS Battambang"/>
+        </w:rPr>
+        <w:t>៧.១. និមិត្តសញ្ញា និងប្រភេទវត្តមានថ្មី</w:t>
+      </w:r>
+    </w:p>
+    <w:p>
+      <w:pPr>
+        <w:pStyle w:val="ListBullet"/>
+        <w:spacing w:before="20" w:after="60" w:line="300" w:lineRule="auto"/>
+      </w:pPr>
+      <w:r>
+        <w:rPr>
+          <w:rFonts w:ascii="Khmer OS Battambang" w:hAnsi="Khmer OS Battambang"/>
+          <w:b/>
+          <w:i w:val="0"/>
+          <w:color w:val="0F172A"/>
+          <w:sz w:val="21"/>
+          <w:rFonts w:ascii="Khmer OS Battambang" w:hAnsi="Khmer OS Battambang" w:cs="Khmer OS Battambang"/>
+        </w:rPr>
+        <w:t xml:space="preserve">✔️ វត្តមាន (Present)៖ </w:t>
+      </w:r>
+      <w:r>
+        <w:rPr>
+          <w:rFonts w:ascii="Khmer OS Battambang" w:hAnsi="Khmer OS Battambang"/>
+          <w:b w:val="0"/>
+          <w:i w:val="0"/>
+          <w:color w:val="334155"/>
+          <w:sz w:val="21"/>
+          <w:rFonts w:ascii="Khmer OS Battambang" w:hAnsi="Khmer OS Battambang" w:cs="Khmer OS Battambang"/>
+        </w:rPr>
+        <w:t>វត្តមានពេញលេញ (Present - ពណ៌បៃតង)៖ សិស្សបានចូលរួមរៀនពេញម៉ោង។</w:t>
+      </w:r>
+    </w:p>
+    <w:p>
+      <w:pPr>
+        <w:pStyle w:val="ListBullet"/>
+        <w:spacing w:before="20" w:after="60" w:line="300" w:lineRule="auto"/>
+      </w:pPr>
+      <w:r>
+        <w:rPr>
+          <w:rFonts w:ascii="Khmer OS Battambang" w:hAnsi="Khmer OS Battambang"/>
+          <w:b/>
+          <w:i w:val="0"/>
+          <w:color w:val="0F172A"/>
+          <w:sz w:val="21"/>
+          <w:rFonts w:ascii="Khmer OS Battambang" w:hAnsi="Khmer OS Battambang" w:cs="Khmer OS Battambang"/>
+        </w:rPr>
+        <w:t xml:space="preserve">📋 ច្បាប់ (1ច / Permission)៖ </w:t>
+      </w:r>
+      <w:r>
+        <w:rPr>
+          <w:rFonts w:ascii="Khmer OS Battambang" w:hAnsi="Khmer OS Battambang"/>
+          <w:b w:val="0"/>
+          <w:i w:val="0"/>
+          <w:color w:val="334155"/>
+          <w:sz w:val="21"/>
+          <w:rFonts w:ascii="Khmer OS Battambang" w:hAnsi="Khmer OS Battambang" w:cs="Khmer OS Battambang"/>
+        </w:rPr>
+        <w:t>អវត្តមានមានច្បាប់ (Permission - សម្គាល់ដោយ «1ច» ឬ «ច»)៖ សិស្សមានលិខិតសុំច្បាប់ត្រឹមត្រូវពីអាណាព្យាបាល។</w:t>
+      </w:r>
+    </w:p>
+    <w:p>
+      <w:pPr>
+        <w:pStyle w:val="ListBullet"/>
+        <w:spacing w:before="20" w:after="60" w:line="300" w:lineRule="auto"/>
+      </w:pPr>
+      <w:r>
+        <w:rPr>
+          <w:rFonts w:ascii="Khmer OS Battambang" w:hAnsi="Khmer OS Battambang"/>
+          <w:b/>
+          <w:i w:val="0"/>
+          <w:color w:val="0F172A"/>
+          <w:sz w:val="21"/>
+          <w:rFonts w:ascii="Khmer OS Battambang" w:hAnsi="Khmer OS Battambang" w:cs="Khmer OS Battambang"/>
+        </w:rPr>
+        <w:t xml:space="preserve">❌ គ្មានច្បាប់ (1គ / Absent)៖ </w:t>
+      </w:r>
+      <w:r>
+        <w:rPr>
+          <w:rFonts w:ascii="Khmer OS Battambang" w:hAnsi="Khmer OS Battambang"/>
+          <w:b w:val="0"/>
+          <w:i w:val="0"/>
+          <w:color w:val="334155"/>
+          <w:sz w:val="21"/>
+          <w:rFonts w:ascii="Khmer OS Battambang" w:hAnsi="Khmer OS Battambang" w:cs="Khmer OS Battambang"/>
+        </w:rPr>
+        <w:t>អវត្តមានគ្មានច្បាប់ (Unexcused - សម្គាល់ដោយ «1គ» ឬ «គ»)៖ សិស្សអវត្តមានដោយគ្មានមូលហេតុ ឬគ្មានការអនុញ្ញាត។</w:t>
+      </w:r>
+    </w:p>
+    <w:p>
+      <w:pPr>
+        <w:keepNext/>
+        <w:spacing w:before="280" w:after="80"/>
+      </w:pPr>
+      <w:r>
+        <w:rPr>
+          <w:rFonts w:ascii="Khmer OS Battambang" w:hAnsi="Khmer OS Battambang"/>
+          <w:b/>
+          <w:i w:val="0"/>
+          <w:color w:val="0284C7"/>
+          <w:sz w:val="24"/>
+          <w:rFonts w:ascii="Khmer OS Battambang" w:hAnsi="Khmer OS Battambang" w:cs="Khmer OS Battambang"/>
+        </w:rPr>
+        <w:t>៧.២. ជំហានកត់ត្រាវត្តមានប្រចាំថ្ងៃ</w:t>
+      </w:r>
+    </w:p>
+    <w:p>
+      <w:pPr>
+        <w:pStyle w:val="ListBullet"/>
+        <w:spacing w:before="20" w:after="60" w:line="300" w:lineRule="auto"/>
+      </w:pPr>
+      <w:r>
+        <w:rPr>
+          <w:rFonts w:ascii="Khmer OS Battambang" w:hAnsi="Khmer OS Battambang"/>
+          <w:b/>
+          <w:i w:val="0"/>
+          <w:color w:val="0F172A"/>
+          <w:sz w:val="21"/>
+          <w:rFonts w:ascii="Khmer OS Battambang" w:hAnsi="Khmer OS Battambang" w:cs="Khmer OS Battambang"/>
+        </w:rPr>
+        <w:t xml:space="preserve">ជំហានទី ១៖ </w:t>
+      </w:r>
+      <w:r>
+        <w:rPr>
+          <w:rFonts w:ascii="Khmer OS Battambang" w:hAnsi="Khmer OS Battambang"/>
+          <w:b w:val="0"/>
+          <w:i w:val="0"/>
+          <w:color w:val="334155"/>
+          <w:sz w:val="21"/>
+          <w:rFonts w:ascii="Khmer OS Battambang" w:hAnsi="Khmer OS Battambang" w:cs="Khmer OS Battambang"/>
+        </w:rPr>
+        <w:t>ចូលទៅកាន់ម៉ឺនុយ «បញ្ជីវត្តមាន (Attendance)»។</w:t>
+      </w:r>
+    </w:p>
+    <w:p>
+      <w:pPr>
+        <w:pStyle w:val="ListBullet"/>
+        <w:spacing w:before="20" w:after="60" w:line="300" w:lineRule="auto"/>
+      </w:pPr>
+      <w:r>
+        <w:rPr>
+          <w:rFonts w:ascii="Khmer OS Battambang" w:hAnsi="Khmer OS Battambang"/>
+          <w:b/>
+          <w:i w:val="0"/>
+          <w:color w:val="0F172A"/>
+          <w:sz w:val="21"/>
+          <w:rFonts w:ascii="Khmer OS Battambang" w:hAnsi="Khmer OS Battambang" w:cs="Khmer OS Battambang"/>
+        </w:rPr>
+        <w:t xml:space="preserve">ជំហានទី ២៖ </w:t>
+      </w:r>
+      <w:r>
+        <w:rPr>
+          <w:rFonts w:ascii="Khmer OS Battambang" w:hAnsi="Khmer OS Battambang"/>
+          <w:b w:val="0"/>
+          <w:i w:val="0"/>
+          <w:color w:val="334155"/>
+          <w:sz w:val="21"/>
+          <w:rFonts w:ascii="Khmer OS Battambang" w:hAnsi="Khmer OS Battambang" w:cs="Khmer OS Battambang"/>
+        </w:rPr>
+        <w:t>ជ្រើសរើស ថ្នាក់រៀន និង កាលបរិច្ឆេទ (ថ្ងៃ ខែ ឆ្នាំ) ដែលត្រូវកត់ត្រា។</w:t>
+      </w:r>
+    </w:p>
+    <w:p>
+      <w:pPr>
+        <w:pStyle w:val="ListBullet"/>
+        <w:spacing w:before="20" w:after="60" w:line="300" w:lineRule="auto"/>
+      </w:pPr>
+      <w:r>
+        <w:rPr>
+          <w:rFonts w:ascii="Khmer OS Battambang" w:hAnsi="Khmer OS Battambang"/>
+          <w:b/>
+          <w:i w:val="0"/>
+          <w:color w:val="0F172A"/>
+          <w:sz w:val="21"/>
+          <w:rFonts w:ascii="Khmer OS Battambang" w:hAnsi="Khmer OS Battambang" w:cs="Khmer OS Battambang"/>
+        </w:rPr>
+        <w:t xml:space="preserve">ជំហានទី ៣៖ </w:t>
+      </w:r>
+      <w:r>
+        <w:rPr>
+          <w:rFonts w:ascii="Khmer OS Battambang" w:hAnsi="Khmer OS Battambang"/>
+          <w:b w:val="0"/>
+          <w:i w:val="0"/>
+          <w:color w:val="334155"/>
+          <w:sz w:val="21"/>
+          <w:rFonts w:ascii="Khmer OS Battambang" w:hAnsi="Khmer OS Battambang" w:cs="Khmer OS Battambang"/>
+        </w:rPr>
+        <w:t>ប្រព័ន្ធនឹងរាយនាមសិស្សទាំងអស់ក្នុងថ្នាក់នោះ។ លំនាំដើមសិស្សទាំងអស់ត្រូវបានកំណត់ជា «វត្តមាន» ជាស្រេច។</w:t>
+      </w:r>
+    </w:p>
+    <w:p>
+      <w:pPr>
+        <w:pStyle w:val="ListBullet"/>
+        <w:spacing w:before="20" w:after="60" w:line="300" w:lineRule="auto"/>
+      </w:pPr>
+      <w:r>
+        <w:rPr>
+          <w:rFonts w:ascii="Khmer OS Battambang" w:hAnsi="Khmer OS Battambang"/>
+          <w:b/>
+          <w:i w:val="0"/>
+          <w:color w:val="0F172A"/>
+          <w:sz w:val="21"/>
+          <w:rFonts w:ascii="Khmer OS Battambang" w:hAnsi="Khmer OS Battambang" w:cs="Khmer OS Battambang"/>
+        </w:rPr>
+        <w:t xml:space="preserve">ជំហានទី ៤៖ </w:t>
+      </w:r>
+      <w:r>
+        <w:rPr>
+          <w:rFonts w:ascii="Khmer OS Battambang" w:hAnsi="Khmer OS Battambang"/>
+          <w:b w:val="0"/>
+          <w:i w:val="0"/>
+          <w:color w:val="334155"/>
+          <w:sz w:val="21"/>
+          <w:rFonts w:ascii="Khmer OS Battambang" w:hAnsi="Khmer OS Battambang" w:cs="Khmer OS Battambang"/>
+        </w:rPr>
+        <w:t>លោកគ្រូ-អ្នកគ្រូគ្រាន់តែចុចប្តូរតែលើសិស្សណាដែល «ច្បាប់ (1ច)» ឬ «គ្មានច្បាប់ (1គ)» ប៉ុណ្ណោះ។</w:t>
+      </w:r>
+    </w:p>
+    <w:p>
+      <w:pPr>
+        <w:pStyle w:val="ListBullet"/>
+        <w:spacing w:before="20" w:after="60" w:line="300" w:lineRule="auto"/>
+      </w:pPr>
+      <w:r>
+        <w:rPr>
+          <w:rFonts w:ascii="Khmer OS Battambang" w:hAnsi="Khmer OS Battambang"/>
+          <w:b/>
+          <w:i w:val="0"/>
+          <w:color w:val="0F172A"/>
+          <w:sz w:val="21"/>
+          <w:rFonts w:ascii="Khmer OS Battambang" w:hAnsi="Khmer OS Battambang" w:cs="Khmer OS Battambang"/>
+        </w:rPr>
+        <w:t xml:space="preserve">ជំហានទី ៥៖ </w:t>
+      </w:r>
+      <w:r>
+        <w:rPr>
+          <w:rFonts w:ascii="Khmer OS Battambang" w:hAnsi="Khmer OS Battambang"/>
+          <w:b w:val="0"/>
+          <w:i w:val="0"/>
+          <w:color w:val="334155"/>
+          <w:sz w:val="21"/>
+          <w:rFonts w:ascii="Khmer OS Battambang" w:hAnsi="Khmer OS Battambang" w:cs="Khmer OS Battambang"/>
+        </w:rPr>
+        <w:t>ចុចលើប៊ូតុង «រក្សាទុកវត្តមាន (Save Attendance)»។</w:t>
+      </w:r>
+    </w:p>
+    <w:p>
+      <w:pPr>
+        <w:keepNext/>
+        <w:spacing w:before="280" w:after="80"/>
+      </w:pPr>
+      <w:r>
+        <w:rPr>
+          <w:rFonts w:ascii="Khmer OS Battambang" w:hAnsi="Khmer OS Battambang"/>
+          <w:b/>
+          <w:i w:val="0"/>
+          <w:color w:val="0284C7"/>
+          <w:sz w:val="24"/>
+          <w:rFonts w:ascii="Khmer OS Battambang" w:hAnsi="Khmer OS Battambang" w:cs="Khmer OS Battambang"/>
+        </w:rPr>
+        <w:t>៧.៣. ការបូកសរុបអវត្តមានប្រចាំខែ និងប្រចាំឆ្នាំ</w:t>
+      </w:r>
+    </w:p>
+    <w:p>
+      <w:pPr>
+        <w:spacing w:before="0" w:after="80" w:line="300" w:lineRule="auto"/>
+      </w:pPr>
+      <w:r>
+        <w:rPr>
+          <w:rFonts w:ascii="Khmer OS Battambang" w:hAnsi="Khmer OS Battambang"/>
+          <w:b w:val="0"/>
+          <w:i w:val="0"/>
+          <w:color w:val="334155"/>
+          <w:sz w:val="22"/>
+          <w:rFonts w:ascii="Khmer OS Battambang" w:hAnsi="Khmer OS Battambang" w:cs="Khmer OS Battambang"/>
+        </w:rPr>
+        <w:t>ប្រព័ន្ធនឹងធ្វើការបូកសរុបអវត្តមានដោយស្វ័យប្រវត្តិ៖</w:t>
+      </w:r>
+    </w:p>
+    <w:p>
+      <w:pPr>
+        <w:pStyle w:val="ListBullet"/>
+        <w:spacing w:before="20" w:after="60" w:line="300" w:lineRule="auto"/>
+      </w:pPr>
+      <w:r>
+        <w:rPr>
+          <w:rFonts w:ascii="Khmer OS Battambang" w:hAnsi="Khmer OS Battambang"/>
+          <w:b w:val="0"/>
+          <w:i w:val="0"/>
+          <w:color w:val="334155"/>
+          <w:sz w:val="21"/>
+          <w:rFonts w:ascii="Khmer OS Battambang" w:hAnsi="Khmer OS Battambang" w:cs="Khmer OS Battambang"/>
+        </w:rPr>
+        <w:t>អវត្តមានប្រចាំខែ៖ បង្ហាញចំនួនសរុបនៃ ច្បាប់ (ច) និង គ្មានច្បាប់ (គ) ក្នុងខែនីមួយៗ នៅលើតារាងពិន្ទុ និងរបាយការណ៍។</w:t>
+      </w:r>
+    </w:p>
+    <w:p>
+      <w:pPr>
+        <w:pStyle w:val="ListBullet"/>
+        <w:spacing w:before="20" w:after="60" w:line="300" w:lineRule="auto"/>
+      </w:pPr>
+      <w:r>
+        <w:rPr>
+          <w:rFonts w:ascii="Khmer OS Battambang" w:hAnsi="Khmer OS Battambang"/>
+          <w:b w:val="0"/>
+          <w:i w:val="0"/>
+          <w:color w:val="334155"/>
+          <w:sz w:val="21"/>
+          <w:rFonts w:ascii="Khmer OS Battambang" w:hAnsi="Khmer OS Battambang" w:cs="Khmer OS Battambang"/>
+        </w:rPr>
+        <w:t>អវត្តមានសរុបប្រចាំឆ្នាំ៖ បូកសរុបវត្តមានពេញមួយឆ្នាំសិក្សា ដើម្បីវាយតម្លៃលើលក្ខខណ្ឌសិទ្ធិប្រឡង ឬការឡើងថ្នាក់។</w:t>
+      </w:r>
+    </w:p>
+    <w:p>
+      <w:pPr>
+        <w:keepNext/>
+        <w:spacing w:before="400" w:after="120"/>
+        <w:pBdr>
+          <w:bottom w:val="single" w:sz="16" w:space="4" w:color="0284C7"/>
+        </w:pBdr>
+      </w:pPr>
+      <w:r>
+        <w:rPr>
+          <w:rFonts w:ascii="Khmer OS Muol Light" w:hAnsi="Khmer OS Muol Light"/>
+          <w:b/>
+          <w:i w:val="0"/>
+          <w:color w:val="0F172A"/>
+          <w:sz w:val="27"/>
+          <w:rFonts w:ascii="Khmer OS Muol Light" w:hAnsi="Khmer OS Muol Light" w:cs="Khmer OS Muol Light"/>
+        </w:rPr>
+        <w:t>ជំពូកទី ៨៖ ការបញ្ចូល និងគ្រប់គ្រងពិន្ទុសិស្ស (Scores &amp; Grading Management)</w:t>
+      </w:r>
+    </w:p>
+    <w:p>
+      <w:pPr>
+        <w:spacing w:before="0" w:after="80" w:line="300" w:lineRule="auto"/>
+      </w:pPr>
+      <w:r>
+        <w:rPr>
+          <w:rFonts w:ascii="Khmer OS Battambang" w:hAnsi="Khmer OS Battambang"/>
+          <w:b w:val="0"/>
+          <w:i w:val="0"/>
+          <w:color w:val="334155"/>
+          <w:sz w:val="22"/>
+          <w:rFonts w:ascii="Khmer OS Battambang" w:hAnsi="Khmer OS Battambang" w:cs="Khmer OS Battambang"/>
+        </w:rPr>
+        <w:t>ទំព័រ «បញ្ជីពិន្ទុ (Scores)» ត្រូវបានរចនាឡើងសាថ្មីជាមួយនឹងក្បាលតារាងធំ ច្បាស់ ពណ៌ដិតខ្ពស់ (High Contrast) ងាយស្រួលមើលបំផុតសម្រាប់លោកគ្រូ-អ្នកគ្រូគ្រប់វ័យ។</w:t>
+      </w:r>
+    </w:p>
+    <w:p>
+      <w:pPr>
+        <w:keepNext/>
+        <w:spacing w:before="280" w:after="80"/>
+      </w:pPr>
+      <w:r>
+        <w:rPr>
+          <w:rFonts w:ascii="Khmer OS Battambang" w:hAnsi="Khmer OS Battambang"/>
+          <w:b/>
+          <w:i w:val="0"/>
+          <w:color w:val="0284C7"/>
+          <w:sz w:val="24"/>
+          <w:rFonts w:ascii="Khmer OS Battambang" w:hAnsi="Khmer OS Battambang" w:cs="Khmer OS Battambang"/>
+        </w:rPr>
+        <w:t>៨.១. សមាសភាគពិន្ទុចម្រុះ</w:t>
+      </w:r>
+    </w:p>
+    <w:p>
+      <w:pPr>
+        <w:spacing w:before="0" w:after="80" w:line="300" w:lineRule="auto"/>
+      </w:pPr>
+      <w:r>
+        <w:rPr>
+          <w:rFonts w:ascii="Khmer OS Battambang" w:hAnsi="Khmer OS Battambang"/>
+          <w:b w:val="0"/>
+          <w:i w:val="0"/>
+          <w:color w:val="334155"/>
+          <w:sz w:val="22"/>
+          <w:rFonts w:ascii="Khmer OS Battambang" w:hAnsi="Khmer OS Battambang" w:cs="Khmer OS Battambang"/>
+        </w:rPr>
+        <w:t>ប្រព័ន្ធគាំទ្រការវាយតម្លៃពហុសមាសភាគតាមក្បួនគរុកោសល្យ៖</w:t>
+      </w:r>
+    </w:p>
+    <w:p>
+      <w:pPr>
+        <w:pStyle w:val="ListBullet"/>
+        <w:spacing w:before="20" w:after="60" w:line="300" w:lineRule="auto"/>
+      </w:pPr>
+      <w:r>
+        <w:rPr>
+          <w:rFonts w:ascii="Khmer OS Battambang" w:hAnsi="Khmer OS Battambang"/>
+          <w:b/>
+          <w:i w:val="0"/>
+          <w:color w:val="0F172A"/>
+          <w:sz w:val="21"/>
+          <w:rFonts w:ascii="Khmer OS Battambang" w:hAnsi="Khmer OS Battambang" w:cs="Khmer OS Battambang"/>
+        </w:rPr>
+        <w:t xml:space="preserve">១. </w:t>
+      </w:r>
+      <w:r>
+        <w:rPr>
+          <w:rFonts w:ascii="Khmer OS Battambang" w:hAnsi="Khmer OS Battambang"/>
+          <w:b w:val="0"/>
+          <w:i w:val="0"/>
+          <w:color w:val="334155"/>
+          <w:sz w:val="21"/>
+          <w:rFonts w:ascii="Khmer OS Battambang" w:hAnsi="Khmer OS Battambang" w:cs="Khmer OS Battambang"/>
+        </w:rPr>
+        <w:t>តេស្តដើមឆ្នាំ (Baseline Test)៖ សម្រាប់វាស់ស្ទង់សមត្ថភាពដំបូងរបស់សិស្សនៅដើមឆ្នាំសិក្សា។</w:t>
+      </w:r>
+    </w:p>
+    <w:p>
+      <w:pPr>
+        <w:pStyle w:val="ListBullet"/>
+        <w:spacing w:before="20" w:after="60" w:line="300" w:lineRule="auto"/>
+      </w:pPr>
+      <w:r>
+        <w:rPr>
+          <w:rFonts w:ascii="Khmer OS Battambang" w:hAnsi="Khmer OS Battambang"/>
+          <w:b/>
+          <w:i w:val="0"/>
+          <w:color w:val="0F172A"/>
+          <w:sz w:val="21"/>
+          <w:rFonts w:ascii="Khmer OS Battambang" w:hAnsi="Khmer OS Battambang" w:cs="Khmer OS Battambang"/>
+        </w:rPr>
+        <w:t xml:space="preserve">២. </w:t>
+      </w:r>
+      <w:r>
+        <w:rPr>
+          <w:rFonts w:ascii="Khmer OS Battambang" w:hAnsi="Khmer OS Battambang"/>
+          <w:b w:val="0"/>
+          <w:i w:val="0"/>
+          <w:color w:val="334155"/>
+          <w:sz w:val="21"/>
+          <w:rFonts w:ascii="Khmer OS Battambang" w:hAnsi="Khmer OS Battambang" w:cs="Khmer OS Battambang"/>
+        </w:rPr>
+        <w:t>ពិន្ទុប្រចាំខែ (Monthly Test Score)៖ ពិន្ទុតេស្ត ឬប្រឡងប្រចាំខែជាក់ស្តែង។</w:t>
+      </w:r>
+    </w:p>
+    <w:p>
+      <w:pPr>
+        <w:pStyle w:val="ListBullet"/>
+        <w:spacing w:before="20" w:after="60" w:line="300" w:lineRule="auto"/>
+      </w:pPr>
+      <w:r>
+        <w:rPr>
+          <w:rFonts w:ascii="Khmer OS Battambang" w:hAnsi="Khmer OS Battambang"/>
+          <w:b/>
+          <w:i w:val="0"/>
+          <w:color w:val="0F172A"/>
+          <w:sz w:val="21"/>
+          <w:rFonts w:ascii="Khmer OS Battambang" w:hAnsi="Khmer OS Battambang" w:cs="Khmer OS Battambang"/>
+        </w:rPr>
+        <w:t xml:space="preserve">៣. </w:t>
+      </w:r>
+      <w:r>
+        <w:rPr>
+          <w:rFonts w:ascii="Khmer OS Battambang" w:hAnsi="Khmer OS Battambang"/>
+          <w:b w:val="0"/>
+          <w:i w:val="0"/>
+          <w:color w:val="334155"/>
+          <w:sz w:val="21"/>
+          <w:rFonts w:ascii="Khmer OS Battambang" w:hAnsi="Khmer OS Battambang" w:cs="Khmer OS Battambang"/>
+        </w:rPr>
+        <w:t>ពិន្ទុវត្តមាន (Attendance Score)៖ គណនាផ្អែកលើការមកសាលាទៀងទាត់របស់សិស្ស។</w:t>
+      </w:r>
+    </w:p>
+    <w:p>
+      <w:pPr>
+        <w:pStyle w:val="ListBullet"/>
+        <w:spacing w:before="20" w:after="60" w:line="300" w:lineRule="auto"/>
+      </w:pPr>
+      <w:r>
+        <w:rPr>
+          <w:rFonts w:ascii="Khmer OS Battambang" w:hAnsi="Khmer OS Battambang"/>
+          <w:b/>
+          <w:i w:val="0"/>
+          <w:color w:val="0F172A"/>
+          <w:sz w:val="21"/>
+          <w:rFonts w:ascii="Khmer OS Battambang" w:hAnsi="Khmer OS Battambang" w:cs="Khmer OS Battambang"/>
+        </w:rPr>
+        <w:t xml:space="preserve">៤. </w:t>
+      </w:r>
+      <w:r>
+        <w:rPr>
+          <w:rFonts w:ascii="Khmer OS Battambang" w:hAnsi="Khmer OS Battambang"/>
+          <w:b w:val="0"/>
+          <w:i w:val="0"/>
+          <w:color w:val="334155"/>
+          <w:sz w:val="21"/>
+          <w:rFonts w:ascii="Khmer OS Battambang" w:hAnsi="Khmer OS Battambang" w:cs="Khmer OS Battambang"/>
+        </w:rPr>
+        <w:t>ពិន្ទុកិច្ចការស្រាវជ្រាវ (Assignment / Research Score)៖ ពិន្ទុកិច្ចការផ្ទះ ឬការស្រាវជ្រាវស្វ័យសិក្សា។</w:t>
+      </w:r>
+    </w:p>
+    <w:p>
+      <w:pPr>
+        <w:keepNext/>
+        <w:spacing w:before="280" w:after="80"/>
+      </w:pPr>
+      <w:r>
+        <w:rPr>
+          <w:rFonts w:ascii="Khmer OS Battambang" w:hAnsi="Khmer OS Battambang"/>
+          <w:b/>
+          <w:i w:val="0"/>
+          <w:color w:val="0284C7"/>
+          <w:sz w:val="24"/>
+          <w:rFonts w:ascii="Khmer OS Battambang" w:hAnsi="Khmer OS Battambang" w:cs="Khmer OS Battambang"/>
+        </w:rPr>
+        <w:t>៨.២. ការកំណត់ពិន្ទុពេញ (Custom Max Score Rules)</w:t>
+      </w:r>
+    </w:p>
+    <w:p>
+      <w:pPr>
+        <w:spacing w:before="0" w:after="80" w:line="300" w:lineRule="auto"/>
+      </w:pPr>
+      <w:r>
+        <w:rPr>
+          <w:rFonts w:ascii="Khmer OS Battambang" w:hAnsi="Khmer OS Battambang"/>
+          <w:b w:val="0"/>
+          <w:i w:val="0"/>
+          <w:color w:val="334155"/>
+          <w:sz w:val="22"/>
+          <w:rFonts w:ascii="Khmer OS Battambang" w:hAnsi="Khmer OS Battambang" w:cs="Khmer OS Battambang"/>
+        </w:rPr>
+        <w:t>លោកគ្រូ-អ្នកគ្រូអាចកំណត់ទម្ងន់ពិន្ទុពេញតាមមុខវិជ្ជា និងថ្នាក់រៀននីមួយៗបានដោយសេរី (ឧទាហរណ៍៖ តេស្ត ៧០, វត្តមាន ១៥, កិច្ចការ ១៥ ឬ តេស្ត ៥០, វត្តមាន ២០, កិច្ចការ ៣០)។ ប្រព័ន្ធនឹងគណនាផលបូក និងភាគរយដោយស្វ័យប្រវត្តិតាមការកំណត់ជាក់ស្តែងរបស់គ្រូ។</w:t>
+      </w:r>
+    </w:p>
+    <w:p>
+      <w:pPr>
+        <w:keepNext/>
+        <w:spacing w:before="280" w:after="80"/>
+      </w:pPr>
+      <w:r>
+        <w:rPr>
+          <w:rFonts w:ascii="Khmer OS Battambang" w:hAnsi="Khmer OS Battambang"/>
+          <w:b/>
+          <w:i w:val="0"/>
+          <w:color w:val="0284C7"/>
+          <w:sz w:val="24"/>
+          <w:rFonts w:ascii="Khmer OS Battambang" w:hAnsi="Khmer OS Battambang" w:cs="Khmer OS Battambang"/>
+        </w:rPr>
+        <w:t>៨.៣. តារាងកម្រិតនិទ្ទេស និងចំណាត់ថ្នាក់ស្វ័យប្រវត្តិ</w:t>
+      </w:r>
+    </w:p>
+    <w:p>
+      <w:pPr>
+        <w:spacing w:before="0" w:after="80" w:line="300" w:lineRule="auto"/>
+      </w:pPr>
+      <w:r>
+        <w:rPr>
+          <w:rFonts w:ascii="Khmer OS Battambang" w:hAnsi="Khmer OS Battambang"/>
+          <w:b w:val="0"/>
+          <w:i w:val="0"/>
+          <w:color w:val="334155"/>
+          <w:sz w:val="22"/>
+          <w:rFonts w:ascii="Khmer OS Battambang" w:hAnsi="Khmer OS Battambang" w:cs="Khmer OS Battambang"/>
+        </w:rPr>
+        <w:t>ប្រព័ន្ធនឹងបូកពិន្ទុសរុប រួចកំណត់និទ្ទេស (Grade A-F) និងគណនា ចំណាត់ថ្នាក់លេខ ១, ២, ៣... (Rank) ជូនសិស្សដោយស្វ័យប្រវត្តិ៖</w:t>
       </w:r>
     </w:p>
     <w:tbl>
@@ -3765,7 +4187,7 @@
           <w:sz w:val="27"/>
           <w:rFonts w:ascii="Khmer OS Muol Light" w:hAnsi="Khmer OS Muol Light" w:cs="Khmer OS Muol Light"/>
         </w:rPr>
-        <w:t>ជំពូកទី ៨៖ ស្ថិតិ និងការវិភាគទិន្នន័យសិក្សា (Student Statistics &amp; Analytics)</w:t>
+        <w:t>ជំពូកទី ៩៖ ស្ថិតិ និងការវិភាគទិន្នន័យសិក្សា (Student Statistics)</w:t>
       </w:r>
     </w:p>
     <w:p>
@@ -3781,7 +4203,40 @@
           <w:sz w:val="22"/>
           <w:rFonts w:ascii="Khmer OS Battambang" w:hAnsi="Khmer OS Battambang" w:cs="Khmer OS Battambang"/>
         </w:rPr>
-        <w:t>ទំព័រ «ស្ថិតិសិស្ស (Statistics)» ជួយឱ្យលោកគ្រូ-អ្នកគ្រូ និងគណៈគ្រប់គ្រងអាចវាយតម្លៃគុណភាពនៃការបង្រៀន និងការរៀនបានយ៉ាងស៊ីជម្រៅតាមរយៈរូបភាព និងភាគរយជាក់ស្តែង។</w:t>
+        <w:t>ទំព័រ «ស្ថិតិសិស្ស (Statistics)» ជួយឱ្យលោកគ្រូ-អ្នកគ្រូ និងគណៈគ្រប់គ្រងអាចវាយតម្លៃគុណភាពនៃការបង្រៀន និងការរៀនបានយ៉ាងស៊ីជម្រៅ តាមរយៈតារាងទិន្នន័យ និងភាគរយជាក់ស្តែង។</w:t>
+      </w:r>
+    </w:p>
+    <w:p>
+      <w:pPr>
+        <w:keepNext/>
+        <w:spacing w:before="280" w:after="80"/>
+      </w:pPr>
+      <w:r>
+        <w:rPr>
+          <w:rFonts w:ascii="Khmer OS Battambang" w:hAnsi="Khmer OS Battambang"/>
+          <w:b/>
+          <w:i w:val="0"/>
+          <w:color w:val="0284C7"/>
+          <w:sz w:val="24"/>
+          <w:rFonts w:ascii="Khmer OS Battambang" w:hAnsi="Khmer OS Battambang" w:cs="Khmer OS Battambang"/>
+        </w:rPr>
+        <w:t>៩.១. តារាងស្ថិតិតាមមុខវិជ្ជានីមួយៗប្រចាំខែ (Subject-by-Subject Monthly Breakdown)</w:t>
+      </w:r>
+    </w:p>
+    <w:p>
+      <w:pPr>
+        <w:spacing w:before="0" w:after="80" w:line="300" w:lineRule="auto"/>
+      </w:pPr>
+      <w:r>
+        <w:rPr>
+          <w:rFonts w:ascii="Khmer OS Battambang" w:hAnsi="Khmer OS Battambang"/>
+          <w:b w:val="0"/>
+          <w:i w:val="0"/>
+          <w:color w:val="334155"/>
+          <w:sz w:val="22"/>
+          <w:rFonts w:ascii="Khmer OS Battambang" w:hAnsi="Khmer OS Battambang" w:cs="Khmer OS Battambang"/>
+        </w:rPr>
+        <w:t>នៅក្នុងការកែលម្អសាថ្មី ប្រព័ន្ធបានបន្ថែម «តារាងស្ថិតិតាមមុខវិជ្ជានីមួយៗប្រចាំខែ» ដែលមានក្បាលតារាងធំ ច្បាស់ និងទិន្នន័យលម្អិត៖</w:t>
       </w:r>
     </w:p>
     <w:p>
@@ -3798,7 +4253,7 @@
           <w:sz w:val="21"/>
           <w:rFonts w:ascii="Khmer OS Battambang" w:hAnsi="Khmer OS Battambang" w:cs="Khmer OS Battambang"/>
         </w:rPr>
-        <w:t>ភាគរយសិស្សជាប់ និងធ្លាក់៖ បង្ហាញជាក្រាហ្វពណ៌បៃតង (ជាប់) និងពណ៌ក្រហម (ធ្លាក់)។</w:t>
+        <w:t>មុខវិជ្ជា និងខែសិក្សា។</w:t>
       </w:r>
     </w:p>
     <w:p>
@@ -3815,7 +4270,7 @@
           <w:sz w:val="21"/>
           <w:rFonts w:ascii="Khmer OS Battambang" w:hAnsi="Khmer OS Battambang" w:cs="Khmer OS Battambang"/>
         </w:rPr>
-        <w:t>ការបែងចែកតាមនិទ្ទេស A, B, C, D, E, F៖ ជួយឱ្យដឹងថាតើសិស្សពូកែមានចំនួនប៉ុន្មាននាក់ និងសិស្សខ្សោយដែលត្រូវជួយបំប៉នបន្ថែមមានចំនួនប៉ុន្មាននាក់។</w:t>
+        <w:t>ចំនួនសិស្សសរុប និងចំនួនសិស្សស្រី។</w:t>
       </w:r>
     </w:p>
     <w:p>
@@ -3832,7 +4287,74 @@
           <w:sz w:val="21"/>
           <w:rFonts w:ascii="Khmer OS Battambang" w:hAnsi="Khmer OS Battambang" w:cs="Khmer OS Battambang"/>
         </w:rPr>
-        <w:t>ស្ថិតិយេនឌ័រ៖ បង្ហាញពីលទ្ធផលសិក្សារបស់សិស្សស្រីប្រៀបធៀបជាមួយសិស្សប្រុស។</w:t>
+        <w:t>មធ្យមភាគពិន្ទុរួមរបស់ថ្នាក់។</w:t>
+      </w:r>
+    </w:p>
+    <w:p>
+      <w:pPr>
+        <w:pStyle w:val="ListBullet"/>
+        <w:spacing w:before="20" w:after="60" w:line="300" w:lineRule="auto"/>
+      </w:pPr>
+      <w:r>
+        <w:rPr>
+          <w:rFonts w:ascii="Khmer OS Battambang" w:hAnsi="Khmer OS Battambang"/>
+          <w:b w:val="0"/>
+          <w:i w:val="0"/>
+          <w:color w:val="334155"/>
+          <w:sz w:val="21"/>
+          <w:rFonts w:ascii="Khmer OS Battambang" w:hAnsi="Khmer OS Battambang" w:cs="Khmer OS Battambang"/>
+        </w:rPr>
+        <w:t>ចំនួនសិស្សទទួលបាននិទ្ទេស A, B, C, D, E, F (រាប់ទាំងសរុប និងសិស្សស្រី)។</w:t>
+      </w:r>
+    </w:p>
+    <w:p>
+      <w:pPr>
+        <w:pStyle w:val="ListBullet"/>
+        <w:spacing w:before="20" w:after="60" w:line="300" w:lineRule="auto"/>
+      </w:pPr>
+      <w:r>
+        <w:rPr>
+          <w:rFonts w:ascii="Khmer OS Battambang" w:hAnsi="Khmer OS Battambang"/>
+          <w:b w:val="0"/>
+          <w:i w:val="0"/>
+          <w:color w:val="334155"/>
+          <w:sz w:val="21"/>
+          <w:rFonts w:ascii="Khmer OS Battambang" w:hAnsi="Khmer OS Battambang" w:cs="Khmer OS Battambang"/>
+        </w:rPr>
+        <w:t>ចំនួនសិស្សជាប់សរុប សិស្សស្រីជាប់ និងភាគរយសិស្សជាប់ (%)។</w:t>
+      </w:r>
+    </w:p>
+    <w:p>
+      <w:pPr>
+        <w:keepNext/>
+        <w:spacing w:before="280" w:after="80"/>
+      </w:pPr>
+      <w:r>
+        <w:rPr>
+          <w:rFonts w:ascii="Khmer OS Battambang" w:hAnsi="Khmer OS Battambang"/>
+          <w:b/>
+          <w:i w:val="0"/>
+          <w:color w:val="0284C7"/>
+          <w:sz w:val="24"/>
+          <w:rFonts w:ascii="Khmer OS Battambang" w:hAnsi="Khmer OS Battambang" w:cs="Khmer OS Battambang"/>
+        </w:rPr>
+        <w:t>៩.២. ស្ថិតិអត្រាសិស្សជាប់ និងធ្លាក់</w:t>
+      </w:r>
+    </w:p>
+    <w:p>
+      <w:pPr>
+        <w:spacing w:before="0" w:after="80" w:line="300" w:lineRule="auto"/>
+      </w:pPr>
+      <w:r>
+        <w:rPr>
+          <w:rFonts w:ascii="Khmer OS Battambang" w:hAnsi="Khmer OS Battambang"/>
+          <w:b w:val="0"/>
+          <w:i w:val="0"/>
+          <w:color w:val="334155"/>
+          <w:sz w:val="22"/>
+          <w:rFonts w:ascii="Khmer OS Battambang" w:hAnsi="Khmer OS Battambang" w:cs="Khmer OS Battambang"/>
+        </w:rPr>
+        <w:t>បង្ហាញជាភាគរយជាក់ស្តែងនូវអត្រាសិស្សដែលទទួលបានពិន្ទុចាប់ពី ៥០% ឡើងទៅ (ជាប់) និងសិស្សក្រោម ៥០% (ធ្លាក់) ដើម្បីងាយស្រួលក្នុងការរៀបចំផែនការបំប៉នសិស្សខ្សោយទាន់ពេលវេលា។</w:t>
       </w:r>
     </w:p>
     <w:p>
@@ -3852,7 +4374,284 @@
           <w:sz w:val="27"/>
           <w:rFonts w:ascii="Khmer OS Muol Light" w:hAnsi="Khmer OS Muol Light" w:cs="Khmer OS Muol Light"/>
         </w:rPr>
-        <w:t>ជំពូកទី ៩៖ ការគ្រប់គ្រងវិញ្ញាសា និងការប្រឡងអនឡាញ (Online Exams)</w:t>
+        <w:t>ជំពូកទី ១០៖ វិញ្ញាបនបត្របញ្ជាក់ការសិក្សា និងការផ្ទៀងផ្ទាត់ QR Code</w:t>
+      </w:r>
+    </w:p>
+    <w:p>
+      <w:pPr>
+        <w:spacing w:before="0" w:after="80" w:line="300" w:lineRule="auto"/>
+      </w:pPr>
+      <w:r>
+        <w:rPr>
+          <w:rFonts w:ascii="Khmer OS Battambang" w:hAnsi="Khmer OS Battambang"/>
+          <w:b w:val="0"/>
+          <w:i w:val="0"/>
+          <w:color w:val="334155"/>
+          <w:sz w:val="22"/>
+          <w:rFonts w:ascii="Khmer OS Battambang" w:hAnsi="Khmer OS Battambang" w:cs="Khmer OS Battambang"/>
+        </w:rPr>
+        <w:t>ម៉ូឌុល «វិញ្ញាបនបត្រ (Certificates)» គឺជាសមិទ្ធផលដ៏លេចធ្លោនៃប្រព័ន្ធគ្រប់គ្រងថ្នាក់រៀន ២០២៧ ដែលអនុញ្ញាតឱ្យសាលារៀន និងគ្រូបង្រៀនអាចចេញវិញ្ញាបនបត្រឌីជីថលផ្លូវការប្រកបដោយស្តង់ដារអន្តរជាតិ។</w:t>
+      </w:r>
+    </w:p>
+    <w:p>
+      <w:pPr>
+        <w:keepNext/>
+        <w:spacing w:before="280" w:after="80"/>
+      </w:pPr>
+      <w:r>
+        <w:rPr>
+          <w:rFonts w:ascii="Khmer OS Battambang" w:hAnsi="Khmer OS Battambang"/>
+          <w:b/>
+          <w:i w:val="0"/>
+          <w:color w:val="0284C7"/>
+          <w:sz w:val="24"/>
+          <w:rFonts w:ascii="Khmer OS Battambang" w:hAnsi="Khmer OS Battambang" w:cs="Khmer OS Battambang"/>
+        </w:rPr>
+        <w:t>១០.១. របៀបចេញវិញ្ញាបនបត្រជូនសិស្ស</w:t>
+      </w:r>
+    </w:p>
+    <w:p>
+      <w:pPr>
+        <w:pStyle w:val="ListBullet"/>
+        <w:spacing w:before="20" w:after="60" w:line="300" w:lineRule="auto"/>
+      </w:pPr>
+      <w:r>
+        <w:rPr>
+          <w:rFonts w:ascii="Khmer OS Battambang" w:hAnsi="Khmer OS Battambang"/>
+          <w:b/>
+          <w:i w:val="0"/>
+          <w:color w:val="0F172A"/>
+          <w:sz w:val="21"/>
+          <w:rFonts w:ascii="Khmer OS Battambang" w:hAnsi="Khmer OS Battambang" w:cs="Khmer OS Battambang"/>
+        </w:rPr>
+        <w:t xml:space="preserve">ជំហានទី ១៖ </w:t>
+      </w:r>
+      <w:r>
+        <w:rPr>
+          <w:rFonts w:ascii="Khmer OS Battambang" w:hAnsi="Khmer OS Battambang"/>
+          <w:b w:val="0"/>
+          <w:i w:val="0"/>
+          <w:color w:val="334155"/>
+          <w:sz w:val="21"/>
+          <w:rFonts w:ascii="Khmer OS Battambang" w:hAnsi="Khmer OS Battambang" w:cs="Khmer OS Battambang"/>
+        </w:rPr>
+        <w:t>ចូលទៅកាន់ម៉ឺនុយ «វិញ្ញាបនបត្រ» នៅលើ Sidebar ខាងឆ្វេង។</w:t>
+      </w:r>
+    </w:p>
+    <w:p>
+      <w:pPr>
+        <w:pStyle w:val="ListBullet"/>
+        <w:spacing w:before="20" w:after="60" w:line="300" w:lineRule="auto"/>
+      </w:pPr>
+      <w:r>
+        <w:rPr>
+          <w:rFonts w:ascii="Khmer OS Battambang" w:hAnsi="Khmer OS Battambang"/>
+          <w:b/>
+          <w:i w:val="0"/>
+          <w:color w:val="0F172A"/>
+          <w:sz w:val="21"/>
+          <w:rFonts w:ascii="Khmer OS Battambang" w:hAnsi="Khmer OS Battambang" w:cs="Khmer OS Battambang"/>
+        </w:rPr>
+        <w:t xml:space="preserve">ជំហានទី ២៖ </w:t>
+      </w:r>
+      <w:r>
+        <w:rPr>
+          <w:rFonts w:ascii="Khmer OS Battambang" w:hAnsi="Khmer OS Battambang"/>
+          <w:b w:val="0"/>
+          <w:i w:val="0"/>
+          <w:color w:val="334155"/>
+          <w:sz w:val="21"/>
+          <w:rFonts w:ascii="Khmer OS Battambang" w:hAnsi="Khmer OS Battambang" w:cs="Khmer OS Battambang"/>
+        </w:rPr>
+        <w:t>ជ្រើសរើស ថ្នាក់រៀន និងជ្រើសរើស ឈ្មោះសិស្ស ដែលត្រូវទទួលវិញ្ញាបនបត្រ។</w:t>
+      </w:r>
+    </w:p>
+    <w:p>
+      <w:pPr>
+        <w:pStyle w:val="ListBullet"/>
+        <w:spacing w:before="20" w:after="60" w:line="300" w:lineRule="auto"/>
+      </w:pPr>
+      <w:r>
+        <w:rPr>
+          <w:rFonts w:ascii="Khmer OS Battambang" w:hAnsi="Khmer OS Battambang"/>
+          <w:b/>
+          <w:i w:val="0"/>
+          <w:color w:val="0F172A"/>
+          <w:sz w:val="21"/>
+          <w:rFonts w:ascii="Khmer OS Battambang" w:hAnsi="Khmer OS Battambang" w:cs="Khmer OS Battambang"/>
+        </w:rPr>
+        <w:t xml:space="preserve">ជំហានទី ៣៖ </w:t>
+      </w:r>
+      <w:r>
+        <w:rPr>
+          <w:rFonts w:ascii="Khmer OS Battambang" w:hAnsi="Khmer OS Battambang"/>
+          <w:b w:val="0"/>
+          <w:i w:val="0"/>
+          <w:color w:val="334155"/>
+          <w:sz w:val="21"/>
+          <w:rFonts w:ascii="Khmer OS Battambang" w:hAnsi="Khmer OS Battambang" w:cs="Khmer OS Battambang"/>
+        </w:rPr>
+        <w:t>ប្រព័ន្ធនឹងរៀបចំទម្រង់វិញ្ញាបនបត្រយ៉ាងស្រស់ស្អាតដោយស្វ័យប្រវត្តិ។</w:t>
+      </w:r>
+    </w:p>
+    <w:p>
+      <w:pPr>
+        <w:pStyle w:val="ListBullet"/>
+        <w:spacing w:before="20" w:after="60" w:line="300" w:lineRule="auto"/>
+      </w:pPr>
+      <w:r>
+        <w:rPr>
+          <w:rFonts w:ascii="Khmer OS Battambang" w:hAnsi="Khmer OS Battambang"/>
+          <w:b/>
+          <w:i w:val="0"/>
+          <w:color w:val="0F172A"/>
+          <w:sz w:val="21"/>
+          <w:rFonts w:ascii="Khmer OS Battambang" w:hAnsi="Khmer OS Battambang" w:cs="Khmer OS Battambang"/>
+        </w:rPr>
+        <w:t xml:space="preserve">ជំហានទី ៤៖ </w:t>
+      </w:r>
+      <w:r>
+        <w:rPr>
+          <w:rFonts w:ascii="Khmer OS Battambang" w:hAnsi="Khmer OS Battambang"/>
+          <w:b w:val="0"/>
+          <w:i w:val="0"/>
+          <w:color w:val="334155"/>
+          <w:sz w:val="21"/>
+          <w:rFonts w:ascii="Khmer OS Battambang" w:hAnsi="Khmer OS Battambang" w:cs="Khmer OS Battambang"/>
+        </w:rPr>
+        <w:t>នៅលើវិញ្ញាបនបត្រមានភ្ជាប់មកជាមួយ៖ ឈ្មោះសិស្ស, ថ្នាក់រៀន, សាលារៀន, ឆ្នាំសិក្សា, ត្រាសាលា, ហត្ថលេខានាយក, ហត្ថលេខាគ្រូ, និងលេខកូដស៊េរីវិញ្ញាបនបត្រ (Certificate Serial Number)។</w:t>
+      </w:r>
+    </w:p>
+    <w:p>
+      <w:pPr>
+        <w:pStyle w:val="ListBullet"/>
+        <w:spacing w:before="20" w:after="60" w:line="300" w:lineRule="auto"/>
+      </w:pPr>
+      <w:r>
+        <w:rPr>
+          <w:rFonts w:ascii="Khmer OS Battambang" w:hAnsi="Khmer OS Battambang"/>
+          <w:b/>
+          <w:i w:val="0"/>
+          <w:color w:val="0F172A"/>
+          <w:sz w:val="21"/>
+          <w:rFonts w:ascii="Khmer OS Battambang" w:hAnsi="Khmer OS Battambang" w:cs="Khmer OS Battambang"/>
+        </w:rPr>
+        <w:t xml:space="preserve">ជំហានទី ៥៖ </w:t>
+      </w:r>
+      <w:r>
+        <w:rPr>
+          <w:rFonts w:ascii="Khmer OS Battambang" w:hAnsi="Khmer OS Battambang"/>
+          <w:b w:val="0"/>
+          <w:i w:val="0"/>
+          <w:color w:val="334155"/>
+          <w:sz w:val="21"/>
+          <w:rFonts w:ascii="Khmer OS Battambang" w:hAnsi="Khmer OS Battambang" w:cs="Khmer OS Battambang"/>
+        </w:rPr>
+        <w:t>ចុចប៊ូតុង «បោះពុម្ពវិញ្ញាបនបត្រ (Print Certificate)» ដើម្បីព្រីនជាក្រដាស A4 ឬរក្សាទុកជា PDF។</w:t>
+      </w:r>
+    </w:p>
+    <w:p>
+      <w:pPr>
+        <w:keepNext/>
+        <w:spacing w:before="280" w:after="80"/>
+      </w:pPr>
+      <w:r>
+        <w:rPr>
+          <w:rFonts w:ascii="Khmer OS Battambang" w:hAnsi="Khmer OS Battambang"/>
+          <w:b/>
+          <w:i w:val="0"/>
+          <w:color w:val="0284C7"/>
+          <w:sz w:val="24"/>
+          <w:rFonts w:ascii="Khmer OS Battambang" w:hAnsi="Khmer OS Battambang" w:cs="Khmer OS Battambang"/>
+        </w:rPr>
+        <w:t>១០.២. ប្រព័ន្ធ QR Code ផ្ទៀងផ្ទាត់សច្ចភាពអនឡាញ (Instant Online Verification)</w:t>
+      </w:r>
+    </w:p>
+    <w:p>
+      <w:pPr>
+        <w:spacing w:before="0" w:after="80" w:line="300" w:lineRule="auto"/>
+      </w:pPr>
+      <w:r>
+        <w:rPr>
+          <w:rFonts w:ascii="Khmer OS Battambang" w:hAnsi="Khmer OS Battambang"/>
+          <w:b w:val="0"/>
+          <w:i w:val="0"/>
+          <w:color w:val="334155"/>
+          <w:sz w:val="22"/>
+          <w:rFonts w:ascii="Khmer OS Battambang" w:hAnsi="Khmer OS Battambang" w:cs="Khmer OS Battambang"/>
+        </w:rPr>
+        <w:t>វិញ្ញាបនបត្រនីមួយៗមានបង្កប់នូវ QR Code ពិសេស៖</w:t>
+      </w:r>
+    </w:p>
+    <w:p>
+      <w:pPr>
+        <w:pStyle w:val="ListBullet"/>
+        <w:spacing w:before="20" w:after="60" w:line="300" w:lineRule="auto"/>
+      </w:pPr>
+      <w:r>
+        <w:rPr>
+          <w:rFonts w:ascii="Khmer OS Battambang" w:hAnsi="Khmer OS Battambang"/>
+          <w:b w:val="0"/>
+          <w:i w:val="0"/>
+          <w:color w:val="334155"/>
+          <w:sz w:val="21"/>
+          <w:rFonts w:ascii="Khmer OS Battambang" w:hAnsi="Khmer OS Battambang" w:cs="Khmer OS Battambang"/>
+        </w:rPr>
+        <w:t>អាណាព្យាបាល សិស្ស ឬស្ថាប័នពាក់ព័ន្ធ អាចយកទូរស័ព្ទដៃស្កេនលើ QR Code នោះ។</w:t>
+      </w:r>
+    </w:p>
+    <w:p>
+      <w:pPr>
+        <w:pStyle w:val="ListBullet"/>
+        <w:spacing w:before="20" w:after="60" w:line="300" w:lineRule="auto"/>
+      </w:pPr>
+      <w:r>
+        <w:rPr>
+          <w:rFonts w:ascii="Khmer OS Battambang" w:hAnsi="Khmer OS Battambang"/>
+          <w:b w:val="0"/>
+          <w:i w:val="0"/>
+          <w:color w:val="334155"/>
+          <w:sz w:val="21"/>
+          <w:rFonts w:ascii="Khmer OS Battambang" w:hAnsi="Khmer OS Battambang" w:cs="Khmer OS Battambang"/>
+        </w:rPr>
+        <w:t>ប្រព័ន្ធនឹងបើកទំព័រផ្លូវការ៖ https://class.mitpukae.com/certificate/verify/{serial} ភ្លាមៗ។</w:t>
+      </w:r>
+    </w:p>
+    <w:p>
+      <w:pPr>
+        <w:pStyle w:val="ListBullet"/>
+        <w:spacing w:before="20" w:after="60" w:line="300" w:lineRule="auto"/>
+      </w:pPr>
+      <w:r>
+        <w:rPr>
+          <w:rFonts w:ascii="Khmer OS Battambang" w:hAnsi="Khmer OS Battambang"/>
+          <w:b w:val="0"/>
+          <w:i w:val="0"/>
+          <w:color w:val="334155"/>
+          <w:sz w:val="21"/>
+          <w:rFonts w:ascii="Khmer OS Battambang" w:hAnsi="Khmer OS Battambang" w:cs="Khmer OS Battambang"/>
+        </w:rPr>
+        <w:t>ទំព័រផ្ទៀងផ្ទាត់នឹងបង្ហាញព័ត៌មានលម្អិតពិតប្រាកដរបស់សិស្ស ឈ្មោះសាលា ឆ្នាំសិក្សា ព្រមទាំងរូបភាពត្រា និងហត្ថលេខាដើម ដែលការពារការក្លែងបន្លំ ឬកែសម្រួលឯកសារខុសច្បាប់បាន ១០០%!</w:t>
+      </w:r>
+    </w:p>
+    <w:p>
+      <w:pPr>
+        <w:keepNext/>
+        <w:spacing w:before="400" w:after="120"/>
+        <w:pBdr>
+          <w:bottom w:val="single" w:sz="16" w:space="4" w:color="0284C7"/>
+        </w:pBdr>
+      </w:pPr>
+      <w:r>
+        <w:rPr>
+          <w:rFonts w:ascii="Khmer OS Muol Light" w:hAnsi="Khmer OS Muol Light"/>
+          <w:b/>
+          <w:i w:val="0"/>
+          <w:color w:val="0F172A"/>
+          <w:sz w:val="27"/>
+          <w:rFonts w:ascii="Khmer OS Muol Light" w:hAnsi="Khmer OS Muol Light" w:cs="Khmer OS Muol Light"/>
+        </w:rPr>
+        <w:t>ជំពូកទី ១១៖ ការគ្រប់គ្រងវិញ្ញាសា និងការប្រឡងអនឡាញ (Online Exams)</w:t>
       </w:r>
     </w:p>
     <w:p>
@@ -3885,7 +4684,7 @@
           <w:sz w:val="24"/>
           <w:rFonts w:ascii="Khmer OS Battambang" w:hAnsi="Khmer OS Battambang" w:cs="Khmer OS Battambang"/>
         </w:rPr>
-        <w:t>៩.១. របៀបដែលគ្រូបង្កើតវិញ្ញាសា</w:t>
+        <w:t>១១.១. របៀបដែលគ្រូបង្កើតវិញ្ញាសា</w:t>
       </w:r>
     </w:p>
     <w:p>
@@ -3941,7 +4740,7 @@
           <w:sz w:val="21"/>
           <w:rFonts w:ascii="Khmer OS Battambang" w:hAnsi="Khmer OS Battambang" w:cs="Khmer OS Battambang"/>
         </w:rPr>
-        <w:t>ជ្រើសរើស ខែប្រឡង (ឧទាហរណ៍៖ ខែវិច្ឆិកា ២០២៦) និង ថ្នាក់រៀន។</w:t>
+        <w:t>ជ្រើសរើស ខែប្រឡង និង ថ្នាក់រៀន។</w:t>
       </w:r>
     </w:p>
     <w:p>
@@ -4014,7 +4813,7 @@
           <w:sz w:val="24"/>
           <w:rFonts w:ascii="Khmer OS Battambang" w:hAnsi="Khmer OS Battambang" w:cs="Khmer OS Battambang"/>
         </w:rPr>
-        <w:t>៩.២. របៀបដែលសិស្សចូលប្រឡង (Student Exam Portal)</w:t>
+        <w:t>១១.២. របៀបដែលសិស្សចូលប្រឡង (Student Exam Portal)</w:t>
       </w:r>
     </w:p>
     <w:p>
@@ -4146,7 +4945,40 @@
           <w:sz w:val="27"/>
           <w:rFonts w:ascii="Khmer OS Muol Light" w:hAnsi="Khmer OS Muol Light" w:cs="Khmer OS Muol Light"/>
         </w:rPr>
-        <w:t>ជំពូកទី ១០៖ ការគ្រប់គ្រង និងចែករំលែកមេរៀន (Lesson Management)</w:t>
+        <w:t>ជំពូកទី ១២៖ ការគ្រប់គ្រងមេរៀន និងកាលវិភាគបង្រៀន (Lessons &amp; Schedules)</w:t>
+      </w:r>
+    </w:p>
+    <w:p>
+      <w:pPr>
+        <w:spacing w:before="0" w:after="80" w:line="300" w:lineRule="auto"/>
+      </w:pPr>
+      <w:r>
+        <w:rPr>
+          <w:rFonts w:ascii="Khmer OS Battambang" w:hAnsi="Khmer OS Battambang"/>
+          <w:b w:val="0"/>
+          <w:i w:val="0"/>
+          <w:color w:val="334155"/>
+          <w:sz w:val="22"/>
+          <w:rFonts w:ascii="Khmer OS Battambang" w:hAnsi="Khmer OS Battambang" w:cs="Khmer OS Battambang"/>
+        </w:rPr>
+        <w:t>សម្រួលដល់ការរៀបចំឯកសារបង្រៀន និងកាលវិភាគប្រចាំសប្តាហ៍ឱ្យមានរបៀបរៀបរយ។</w:t>
+      </w:r>
+    </w:p>
+    <w:p>
+      <w:pPr>
+        <w:keepNext/>
+        <w:spacing w:before="280" w:after="80"/>
+      </w:pPr>
+      <w:r>
+        <w:rPr>
+          <w:rFonts w:ascii="Khmer OS Battambang" w:hAnsi="Khmer OS Battambang"/>
+          <w:b/>
+          <w:i w:val="0"/>
+          <w:color w:val="0284C7"/>
+          <w:sz w:val="24"/>
+          <w:rFonts w:ascii="Khmer OS Battambang" w:hAnsi="Khmer OS Battambang" w:cs="Khmer OS Battambang"/>
+        </w:rPr>
+        <w:t>១២.១. ការគ្រប់គ្រង និងចែករំលែកមេរៀន (Lesson Management)</w:t>
       </w:r>
     </w:p>
     <w:p>
@@ -4202,21 +5034,18 @@
     <w:p>
       <w:pPr>
         <w:keepNext/>
-        <w:spacing w:before="400" w:after="120"/>
-        <w:pBdr>
-          <w:bottom w:val="single" w:sz="16" w:space="4" w:color="0284C7"/>
-        </w:pBdr>
+        <w:spacing w:before="280" w:after="80"/>
       </w:pPr>
       <w:r>
         <w:rPr>
-          <w:rFonts w:ascii="Khmer OS Muol Light" w:hAnsi="Khmer OS Muol Light"/>
+          <w:rFonts w:ascii="Khmer OS Battambang" w:hAnsi="Khmer OS Battambang"/>
           <w:b/>
           <w:i w:val="0"/>
-          <w:color w:val="0F172A"/>
-          <w:sz w:val="27"/>
-          <w:rFonts w:ascii="Khmer OS Muol Light" w:hAnsi="Khmer OS Muol Light" w:cs="Khmer OS Muol Light"/>
+          <w:color w:val="0284C7"/>
+          <w:sz w:val="24"/>
+          <w:rFonts w:ascii="Khmer OS Battambang" w:hAnsi="Khmer OS Battambang" w:cs="Khmer OS Battambang"/>
         </w:rPr>
-        <w:t>ជំពូកទី ១១៖ ការរៀបចំកាលវិភាគបង្រៀន (Teaching Schedule)</w:t>
+        <w:t>១២.២. ការរៀបចំកាលវិភាគបង្រៀន (Teaching Schedule)</w:t>
       </w:r>
     </w:p>
     <w:p>
@@ -4286,7 +5115,7 @@
           <w:sz w:val="27"/>
           <w:rFonts w:ascii="Khmer OS Muol Light" w:hAnsi="Khmer OS Muol Light" w:cs="Khmer OS Muol Light"/>
         </w:rPr>
-        <w:t>ជំពូកទី ១២៖ ការទាញយក និងបោះពុម្ពរបាយការណ៍សរុប (Reports &amp; Printing)</w:t>
+        <w:t>ជំពូកទី ១៣៖ ការទាញយក និងបោះពុម្ពរបាយការណ៍សរុប (Reports &amp; Printing)</w:t>
       </w:r>
     </w:p>
     <w:p>
@@ -4319,7 +5148,7 @@
           <w:sz w:val="24"/>
           <w:rFonts w:ascii="Khmer OS Battambang" w:hAnsi="Khmer OS Battambang" w:cs="Khmer OS Battambang"/>
         </w:rPr>
-        <w:t>១២.១. មាតិកាក្នុងតារាងរបាយការណ៍សរុប</w:t>
+        <w:t>១៣.១. មាតិកាក្នុងតារាងរបាយការណ៍សរុប</w:t>
       </w:r>
     </w:p>
     <w:p>
@@ -4387,7 +5216,7 @@
           <w:sz w:val="21"/>
           <w:rFonts w:ascii="Khmer OS Battambang" w:hAnsi="Khmer OS Battambang" w:cs="Khmer OS Battambang"/>
         </w:rPr>
-        <w:t>កំណត់ត្រាវត្តមាន៖ ចំនួនថ្ងៃមានវត្តមាន និងចំនួនថ្ងៃអវត្តមានសរុបក្នុងខែនោះ។</w:t>
+        <w:t>កំណត់ត្រាវត្តមាន៖ ចំនួនថ្ងៃមានវត្តមាន និងចំនួនអវត្តមាន (ច្បាប់ និងគ្មានច្បាប់) ក្នុងខែនោះ។</w:t>
       </w:r>
     </w:p>
     <w:p>
@@ -4404,7 +5233,7 @@
           <w:sz w:val="24"/>
           <w:rFonts w:ascii="Khmer OS Battambang" w:hAnsi="Khmer OS Battambang" w:cs="Khmer OS Battambang"/>
         </w:rPr>
-        <w:t>១២.២. ការបោះពុម្ពរបាយការណ៍ (Print Report) ជាក្រដាស A4 ឬ PDF</w:t>
+        <w:t>១៣.២. ការបោះពុម្ពរបាយការណ៍ជាក្រដាស A4 ឬ PDF</w:t>
       </w:r>
     </w:p>
     <w:p>
@@ -4633,7 +5462,7 @@
           <w:sz w:val="27"/>
           <w:rFonts w:ascii="Khmer OS Muol Light" w:hAnsi="Khmer OS Muol Light" w:cs="Khmer OS Muol Light"/>
         </w:rPr>
-        <w:t>ជំពូកទី ១៣៖ ផ្នែកទំនាក់ទំនង និងជំនួយបច្ចេកទេសតាម Telegram</w:t>
+        <w:t>ជំពូកទី ១៤៖ ការគ្រប់គ្រងគណនីគ្រូបង្រៀនសម្រាប់ Admin (Admin Accounts Management)</w:t>
       </w:r>
     </w:p>
     <w:p>
@@ -4649,7 +5478,7 @@
           <w:sz w:val="22"/>
           <w:rFonts w:ascii="Khmer OS Battambang" w:hAnsi="Khmer OS Battambang" w:cs="Khmer OS Battambang"/>
         </w:rPr>
-        <w:t>ដើម្បីផ្តល់ភាពកក់ក្តៅ និងភាពងាយស្រួលបំផុតដល់លោកគ្រូ-អ្នកគ្រូ ប្រព័ន្ធបានភ្ជាប់ទំនាក់ទំនងផ្ទាល់ជាមួយអ្នកគ្រប់គ្រង និងអ្នកអភិវឌ្ឍន៍ប្រព័ន្ធតាមរយៈ Telegram។</w:t>
+        <w:t>ផ្ទាំង «គ្រប់គ្រងគណនីគ្រូបង្រៀន (/admin/accounts)» ផ្តល់ជូនគណៈគ្រប់គ្រងសាលា និង Admin នូវលទ្ធភាពគ្រប់គ្រងបុគ្គលិកបង្រៀនទាំងអស់ក្នុងប្រព័ន្ធយ៉ាងពេញលេញ និងមានសុវត្ថិភាព។</w:t>
       </w:r>
     </w:p>
     <w:p>
@@ -4666,7 +5495,390 @@
           <w:sz w:val="24"/>
           <w:rFonts w:ascii="Khmer OS Battambang" w:hAnsi="Khmer OS Battambang" w:cs="Khmer OS Battambang"/>
         </w:rPr>
-        <w:t>១៣.១. ព័ត៌មានទំនាក់ទំនងផ្ទាល់</w:t>
+        <w:t>១៤.១. ការចូលកាន់ផ្ទាំង Admin</w:t>
+      </w:r>
+    </w:p>
+    <w:p>
+      <w:pPr>
+        <w:spacing w:before="0" w:after="80" w:line="300" w:lineRule="auto"/>
+      </w:pPr>
+      <w:r>
+        <w:rPr>
+          <w:rFonts w:ascii="Khmer OS Battambang" w:hAnsi="Khmer OS Battambang"/>
+          <w:b w:val="0"/>
+          <w:i w:val="0"/>
+          <w:color w:val="334155"/>
+          <w:sz w:val="22"/>
+          <w:rFonts w:ascii="Khmer OS Battambang" w:hAnsi="Khmer OS Battambang" w:cs="Khmer OS Battambang"/>
+        </w:rPr>
+        <w:t>មានតែគណនីដែលមានសិទ្ធិ ROLE_ADMIN ប៉ុណ្ណោះដែលអាចចូលប្រើប្រាស់ផ្ទាំងនេះបានតាមរយៈម៉ឺនុយ «គ្រប់គ្រងគណនី» ឬអាសយដ្ឋាន៖ https://class.mitpukae.com/admin/accounts</w:t>
+      </w:r>
+    </w:p>
+    <w:p>
+      <w:pPr>
+        <w:keepNext/>
+        <w:spacing w:before="280" w:after="80"/>
+      </w:pPr>
+      <w:r>
+        <w:rPr>
+          <w:rFonts w:ascii="Khmer OS Battambang" w:hAnsi="Khmer OS Battambang"/>
+          <w:b/>
+          <w:i w:val="0"/>
+          <w:color w:val="0284C7"/>
+          <w:sz w:val="24"/>
+          <w:rFonts w:ascii="Khmer OS Battambang" w:hAnsi="Khmer OS Battambang" w:cs="Khmer OS Battambang"/>
+        </w:rPr>
+        <w:t>១៤.២. តារាងព័ត៌មានលម្អិតរបស់គ្រូបង្រៀន</w:t>
+      </w:r>
+    </w:p>
+    <w:p>
+      <w:pPr>
+        <w:spacing w:before="0" w:after="80" w:line="300" w:lineRule="auto"/>
+      </w:pPr>
+      <w:r>
+        <w:rPr>
+          <w:rFonts w:ascii="Khmer OS Battambang" w:hAnsi="Khmer OS Battambang"/>
+          <w:b w:val="0"/>
+          <w:i w:val="0"/>
+          <w:color w:val="334155"/>
+          <w:sz w:val="22"/>
+          <w:rFonts w:ascii="Khmer OS Battambang" w:hAnsi="Khmer OS Battambang" w:cs="Khmer OS Battambang"/>
+        </w:rPr>
+        <w:t>តារាងគ្រប់គ្រងគណនីត្រូវបានកែលម្អយ៉ាងច្បាស់លាស់ ដោយបង្ហាញព័ត៌មានសំខាន់ៗ៖</w:t>
+      </w:r>
+    </w:p>
+    <w:p>
+      <w:pPr>
+        <w:pStyle w:val="ListBullet"/>
+        <w:spacing w:before="20" w:after="60" w:line="300" w:lineRule="auto"/>
+      </w:pPr>
+      <w:r>
+        <w:rPr>
+          <w:rFonts w:ascii="Khmer OS Battambang" w:hAnsi="Khmer OS Battambang"/>
+          <w:b w:val="0"/>
+          <w:i w:val="0"/>
+          <w:color w:val="334155"/>
+          <w:sz w:val="21"/>
+          <w:rFonts w:ascii="Khmer OS Battambang" w:hAnsi="Khmer OS Battambang" w:cs="Khmer OS Battambang"/>
+        </w:rPr>
+        <w:t>ឈ្មោះពេញ និងតួនាទី (FullName &amp; Role)។</w:t>
+      </w:r>
+    </w:p>
+    <w:p>
+      <w:pPr>
+        <w:pStyle w:val="ListBullet"/>
+        <w:spacing w:before="20" w:after="60" w:line="300" w:lineRule="auto"/>
+      </w:pPr>
+      <w:r>
+        <w:rPr>
+          <w:rFonts w:ascii="Khmer OS Battambang" w:hAnsi="Khmer OS Battambang"/>
+          <w:b w:val="0"/>
+          <w:i w:val="0"/>
+          <w:color w:val="334155"/>
+          <w:sz w:val="21"/>
+          <w:rFonts w:ascii="Khmer OS Battambang" w:hAnsi="Khmer OS Battambang" w:cs="Khmer OS Battambang"/>
+        </w:rPr>
+        <w:t>ឈ្មោះអ្នកប្រើប្រាស់ (Username)។</w:t>
+      </w:r>
+    </w:p>
+    <w:p>
+      <w:pPr>
+        <w:pStyle w:val="ListBullet"/>
+        <w:spacing w:before="20" w:after="60" w:line="300" w:lineRule="auto"/>
+      </w:pPr>
+      <w:r>
+        <w:rPr>
+          <w:rFonts w:ascii="Khmer OS Battambang" w:hAnsi="Khmer OS Battambang"/>
+          <w:b w:val="0"/>
+          <w:i w:val="0"/>
+          <w:color w:val="334155"/>
+          <w:sz w:val="21"/>
+          <w:rFonts w:ascii="Khmer OS Battambang" w:hAnsi="Khmer OS Battambang" w:cs="Khmer OS Battambang"/>
+        </w:rPr>
+        <w:t>មុខវិជ្ជាបង្រៀន (Teaching Subject)។</w:t>
+      </w:r>
+    </w:p>
+    <w:p>
+      <w:pPr>
+        <w:pStyle w:val="ListBullet"/>
+        <w:spacing w:before="20" w:after="60" w:line="300" w:lineRule="auto"/>
+      </w:pPr>
+      <w:r>
+        <w:rPr>
+          <w:rFonts w:ascii="Khmer OS Battambang" w:hAnsi="Khmer OS Battambang"/>
+          <w:b w:val="0"/>
+          <w:i w:val="0"/>
+          <w:color w:val="334155"/>
+          <w:sz w:val="21"/>
+          <w:rFonts w:ascii="Khmer OS Battambang" w:hAnsi="Khmer OS Battambang" w:cs="Khmer OS Battambang"/>
+        </w:rPr>
+        <w:t>ថ្នាក់បង្រៀន (Teaching Classes)។</w:t>
+      </w:r>
+    </w:p>
+    <w:p>
+      <w:pPr>
+        <w:pStyle w:val="ListBullet"/>
+        <w:spacing w:before="20" w:after="60" w:line="300" w:lineRule="auto"/>
+      </w:pPr>
+      <w:r>
+        <w:rPr>
+          <w:rFonts w:ascii="Khmer OS Battambang" w:hAnsi="Khmer OS Battambang"/>
+          <w:b w:val="0"/>
+          <w:i w:val="0"/>
+          <w:color w:val="334155"/>
+          <w:sz w:val="21"/>
+          <w:rFonts w:ascii="Khmer OS Battambang" w:hAnsi="Khmer OS Battambang" w:cs="Khmer OS Battambang"/>
+        </w:rPr>
+        <w:t>លេខទូរស័ព្ទ (Phone Number)។</w:t>
+      </w:r>
+    </w:p>
+    <w:p>
+      <w:pPr>
+        <w:pStyle w:val="ListBullet"/>
+        <w:spacing w:before="20" w:after="60" w:line="300" w:lineRule="auto"/>
+      </w:pPr>
+      <w:r>
+        <w:rPr>
+          <w:rFonts w:ascii="Khmer OS Battambang" w:hAnsi="Khmer OS Battambang"/>
+          <w:b w:val="0"/>
+          <w:i w:val="0"/>
+          <w:color w:val="334155"/>
+          <w:sz w:val="21"/>
+          <w:rFonts w:ascii="Khmer OS Battambang" w:hAnsi="Khmer OS Battambang" w:cs="Khmer OS Battambang"/>
+        </w:rPr>
+        <w:t>គណនី Telegram (Telegram Username/Link)។</w:t>
+      </w:r>
+    </w:p>
+    <w:p>
+      <w:pPr>
+        <w:pStyle w:val="ListBullet"/>
+        <w:spacing w:before="20" w:after="60" w:line="300" w:lineRule="auto"/>
+      </w:pPr>
+      <w:r>
+        <w:rPr>
+          <w:rFonts w:ascii="Khmer OS Battambang" w:hAnsi="Khmer OS Battambang"/>
+          <w:b w:val="0"/>
+          <w:i w:val="0"/>
+          <w:color w:val="334155"/>
+          <w:sz w:val="21"/>
+          <w:rFonts w:ascii="Khmer OS Battambang" w:hAnsi="Khmer OS Battambang" w:cs="Khmer OS Battambang"/>
+        </w:rPr>
+        <w:t>ស្ថានភាពគណនី (Status: Active ដំណើរការ ឬ Suspended ផ្អាក)។</w:t>
+      </w:r>
+    </w:p>
+    <w:p>
+      <w:pPr>
+        <w:keepNext/>
+        <w:spacing w:before="280" w:after="80"/>
+      </w:pPr>
+      <w:r>
+        <w:rPr>
+          <w:rFonts w:ascii="Khmer OS Battambang" w:hAnsi="Khmer OS Battambang"/>
+          <w:b/>
+          <w:i w:val="0"/>
+          <w:color w:val="0284C7"/>
+          <w:sz w:val="24"/>
+          <w:rFonts w:ascii="Khmer OS Battambang" w:hAnsi="Khmer OS Battambang" w:cs="Khmer OS Battambang"/>
+        </w:rPr>
+        <w:t>១៤.៣. ការបង្កើតគណនីគ្រូថ្មី និងការកំណត់លេខសម្ងាត់</w:t>
+      </w:r>
+    </w:p>
+    <w:p>
+      <w:pPr>
+        <w:pStyle w:val="ListBullet"/>
+        <w:spacing w:before="20" w:after="60" w:line="300" w:lineRule="auto"/>
+      </w:pPr>
+      <w:r>
+        <w:rPr>
+          <w:rFonts w:ascii="Khmer OS Battambang" w:hAnsi="Khmer OS Battambang"/>
+          <w:b/>
+          <w:i w:val="0"/>
+          <w:color w:val="0F172A"/>
+          <w:sz w:val="21"/>
+          <w:rFonts w:ascii="Khmer OS Battambang" w:hAnsi="Khmer OS Battambang" w:cs="Khmer OS Battambang"/>
+        </w:rPr>
+        <w:t xml:space="preserve">ជំហានទី ១៖ </w:t>
+      </w:r>
+      <w:r>
+        <w:rPr>
+          <w:rFonts w:ascii="Khmer OS Battambang" w:hAnsi="Khmer OS Battambang"/>
+          <w:b w:val="0"/>
+          <w:i w:val="0"/>
+          <w:color w:val="334155"/>
+          <w:sz w:val="21"/>
+          <w:rFonts w:ascii="Khmer OS Battambang" w:hAnsi="Khmer OS Battambang" w:cs="Khmer OS Battambang"/>
+        </w:rPr>
+        <w:t>ចុចលើប៊ូតុង «+ បង្កើតគណនីថ្មី»។</w:t>
+      </w:r>
+    </w:p>
+    <w:p>
+      <w:pPr>
+        <w:pStyle w:val="ListBullet"/>
+        <w:spacing w:before="20" w:after="60" w:line="300" w:lineRule="auto"/>
+      </w:pPr>
+      <w:r>
+        <w:rPr>
+          <w:rFonts w:ascii="Khmer OS Battambang" w:hAnsi="Khmer OS Battambang"/>
+          <w:b/>
+          <w:i w:val="0"/>
+          <w:color w:val="0F172A"/>
+          <w:sz w:val="21"/>
+          <w:rFonts w:ascii="Khmer OS Battambang" w:hAnsi="Khmer OS Battambang" w:cs="Khmer OS Battambang"/>
+        </w:rPr>
+        <w:t xml:space="preserve">ជំហានទី ២៖ </w:t>
+      </w:r>
+      <w:r>
+        <w:rPr>
+          <w:rFonts w:ascii="Khmer OS Battambang" w:hAnsi="Khmer OS Battambang"/>
+          <w:b w:val="0"/>
+          <w:i w:val="0"/>
+          <w:color w:val="334155"/>
+          <w:sz w:val="21"/>
+          <w:rFonts w:ascii="Khmer OS Battambang" w:hAnsi="Khmer OS Battambang" w:cs="Khmer OS Battambang"/>
+        </w:rPr>
+        <w:t>បំពេញព័ត៌មានគ្រូ៖ Username, Password, FullName, Subject, Classes, Phone, Telegram។</w:t>
+      </w:r>
+    </w:p>
+    <w:p>
+      <w:pPr>
+        <w:pStyle w:val="ListBullet"/>
+        <w:spacing w:before="20" w:after="60" w:line="300" w:lineRule="auto"/>
+      </w:pPr>
+      <w:r>
+        <w:rPr>
+          <w:rFonts w:ascii="Khmer OS Battambang" w:hAnsi="Khmer OS Battambang"/>
+          <w:b/>
+          <w:i w:val="0"/>
+          <w:color w:val="0F172A"/>
+          <w:sz w:val="21"/>
+          <w:rFonts w:ascii="Khmer OS Battambang" w:hAnsi="Khmer OS Battambang" w:cs="Khmer OS Battambang"/>
+        </w:rPr>
+        <w:t xml:space="preserve">ជំហានទី ៣៖ </w:t>
+      </w:r>
+      <w:r>
+        <w:rPr>
+          <w:rFonts w:ascii="Khmer OS Battambang" w:hAnsi="Khmer OS Battambang"/>
+          <w:b w:val="0"/>
+          <w:i w:val="0"/>
+          <w:color w:val="334155"/>
+          <w:sz w:val="21"/>
+          <w:rFonts w:ascii="Khmer OS Battambang" w:hAnsi="Khmer OS Battambang" w:cs="Khmer OS Battambang"/>
+        </w:rPr>
+        <w:t>ចុច «រក្សាទុក»។ គ្រូបង្រៀនអាចយក Username និង Password នោះទៅ Login បានភ្លាមៗ។</w:t>
+      </w:r>
+    </w:p>
+    <w:p>
+      <w:pPr>
+        <w:pStyle w:val="ListBullet"/>
+        <w:spacing w:before="20" w:after="60" w:line="300" w:lineRule="auto"/>
+      </w:pPr>
+      <w:r>
+        <w:rPr>
+          <w:rFonts w:ascii="Khmer OS Battambang" w:hAnsi="Khmer OS Battambang"/>
+          <w:b/>
+          <w:i w:val="0"/>
+          <w:color w:val="0F172A"/>
+          <w:sz w:val="21"/>
+          <w:rFonts w:ascii="Khmer OS Battambang" w:hAnsi="Khmer OS Battambang" w:cs="Khmer OS Battambang"/>
+        </w:rPr>
+        <w:t xml:space="preserve">ជំហានទី ៤៖ </w:t>
+      </w:r>
+      <w:r>
+        <w:rPr>
+          <w:rFonts w:ascii="Khmer OS Battambang" w:hAnsi="Khmer OS Battambang"/>
+          <w:b w:val="0"/>
+          <w:i w:val="0"/>
+          <w:color w:val="334155"/>
+          <w:sz w:val="21"/>
+          <w:rFonts w:ascii="Khmer OS Battambang" w:hAnsi="Khmer OS Battambang" w:cs="Khmer OS Battambang"/>
+        </w:rPr>
+        <w:t>ការប្តូរលេខសម្ងាត់ (Reset Password)៖ Admin អាចចុចលើប៊ូតុង «ប្តូរលេខសម្ងាត់» នៅជួរគ្រូនីមួយៗ ដើម្បីផ្តល់លេខសម្ងាត់ថ្មីជូនគ្រូករណីភ្លេច។</w:t>
+      </w:r>
+    </w:p>
+    <w:p>
+      <w:pPr>
+        <w:keepNext/>
+        <w:spacing w:before="280" w:after="80"/>
+      </w:pPr>
+      <w:r>
+        <w:rPr>
+          <w:rFonts w:ascii="Khmer OS Battambang" w:hAnsi="Khmer OS Battambang"/>
+          <w:b/>
+          <w:i w:val="0"/>
+          <w:color w:val="0284C7"/>
+          <w:sz w:val="24"/>
+          <w:rFonts w:ascii="Khmer OS Battambang" w:hAnsi="Khmer OS Battambang" w:cs="Khmer OS Battambang"/>
+        </w:rPr>
+        <w:t>១៤.៤. ការបើក ឬផ្អាកដំណើរការគណនី (Toggle Status)</w:t>
+      </w:r>
+    </w:p>
+    <w:p>
+      <w:pPr>
+        <w:spacing w:before="0" w:after="80" w:line="300" w:lineRule="auto"/>
+      </w:pPr>
+      <w:r>
+        <w:rPr>
+          <w:rFonts w:ascii="Khmer OS Battambang" w:hAnsi="Khmer OS Battambang"/>
+          <w:b w:val="0"/>
+          <w:i w:val="0"/>
+          <w:color w:val="334155"/>
+          <w:sz w:val="22"/>
+          <w:rFonts w:ascii="Khmer OS Battambang" w:hAnsi="Khmer OS Battambang" w:cs="Khmer OS Battambang"/>
+        </w:rPr>
+        <w:t>Admin អាចចុចប៊ូតុងបិទ/បើកសិទ្ធិ (Active / Suspended) ដោយគ្រាន់តែចុចមួយឃ្លីកប៉ុណ្ណោះ។ ប្រសិនបើគណនីត្រូវបានផ្អាក គ្រូនោះនឹងមិនអាច Login ចូលប្រព័ន្ធបានឡើយ។</w:t>
+      </w:r>
+    </w:p>
+    <w:p>
+      <w:pPr>
+        <w:keepNext/>
+        <w:spacing w:before="400" w:after="120"/>
+        <w:pBdr>
+          <w:bottom w:val="single" w:sz="16" w:space="4" w:color="0284C7"/>
+        </w:pBdr>
+      </w:pPr>
+      <w:r>
+        <w:rPr>
+          <w:rFonts w:ascii="Khmer OS Muol Light" w:hAnsi="Khmer OS Muol Light"/>
+          <w:b/>
+          <w:i w:val="0"/>
+          <w:color w:val="0F172A"/>
+          <w:sz w:val="27"/>
+          <w:rFonts w:ascii="Khmer OS Muol Light" w:hAnsi="Khmer OS Muol Light" w:cs="Khmer OS Muol Light"/>
+        </w:rPr>
+        <w:t>ជំពូកទី ១៥៖ ផ្នែកទំនាក់ទំនង ជំនួយបច្ចេកទេស និងសុវត្ថិភាព</w:t>
+      </w:r>
+    </w:p>
+    <w:p>
+      <w:pPr>
+        <w:spacing w:before="0" w:after="80" w:line="300" w:lineRule="auto"/>
+      </w:pPr>
+      <w:r>
+        <w:rPr>
+          <w:rFonts w:ascii="Khmer OS Battambang" w:hAnsi="Khmer OS Battambang"/>
+          <w:b w:val="0"/>
+          <w:i w:val="0"/>
+          <w:color w:val="334155"/>
+          <w:sz w:val="22"/>
+          <w:rFonts w:ascii="Khmer OS Battambang" w:hAnsi="Khmer OS Battambang" w:cs="Khmer OS Battambang"/>
+        </w:rPr>
+        <w:t>ដើម្បីធានាការប្រើប្រាស់ប្រកបដោយទំនុកចិត្ត និងដោះស្រាយរាល់ចម្ងល់បច្ចេកទេសបានទាន់ពេលវេលា ប្រព័ន្ធបានភ្ជាប់ទំនាក់ទំនងផ្ទាល់ជាមួយក្រុមការងារបច្ចេកទេស។</w:t>
+      </w:r>
+    </w:p>
+    <w:p>
+      <w:pPr>
+        <w:keepNext/>
+        <w:spacing w:before="280" w:after="80"/>
+      </w:pPr>
+      <w:r>
+        <w:rPr>
+          <w:rFonts w:ascii="Khmer OS Battambang" w:hAnsi="Khmer OS Battambang"/>
+          <w:b/>
+          <w:i w:val="0"/>
+          <w:color w:val="0284C7"/>
+          <w:sz w:val="24"/>
+          <w:rFonts w:ascii="Khmer OS Battambang" w:hAnsi="Khmer OS Battambang" w:cs="Khmer OS Battambang"/>
+        </w:rPr>
+        <w:t>១៥.១. ព័ត៌មានទំនាក់ទំនងជំនួយផ្ទាល់</w:t>
       </w:r>
     </w:p>
     <w:p>
@@ -4767,95 +5979,7 @@
           <w:sz w:val="24"/>
           <w:rFonts w:ascii="Khmer OS Battambang" w:hAnsi="Khmer OS Battambang" w:cs="Khmer OS Battambang"/>
         </w:rPr>
-        <w:t>១៣.២. ទីតាំងប៊ូតុង Telegram លើប្រព័ន្ធ</w:t>
-      </w:r>
-    </w:p>
-    <w:p>
-      <w:pPr>
-        <w:pStyle w:val="ListBullet"/>
-        <w:spacing w:before="20" w:after="60" w:line="300" w:lineRule="auto"/>
-      </w:pPr>
-      <w:r>
-        <w:rPr>
-          <w:rFonts w:ascii="Khmer OS Battambang" w:hAnsi="Khmer OS Battambang"/>
-          <w:b w:val="0"/>
-          <w:i w:val="0"/>
-          <w:color w:val="334155"/>
-          <w:sz w:val="21"/>
-          <w:rFonts w:ascii="Khmer OS Battambang" w:hAnsi="Khmer OS Battambang" w:cs="Khmer OS Battambang"/>
-        </w:rPr>
-        <w:t>នៅលើម៉ឺនុយចំហៀង (Sidebar)៖ មានប៊ូតុង «✈️ ទាក់ទងខ្ញុំ (Telegram)» នៅខាងក្រោម «របាយការណ៍» លើគ្រប់ទំព័រទាំងអស់។</w:t>
-      </w:r>
-    </w:p>
-    <w:p>
-      <w:pPr>
-        <w:pStyle w:val="ListBullet"/>
-        <w:spacing w:before="20" w:after="60" w:line="300" w:lineRule="auto"/>
-      </w:pPr>
-      <w:r>
-        <w:rPr>
-          <w:rFonts w:ascii="Khmer OS Battambang" w:hAnsi="Khmer OS Battambang"/>
-          <w:b w:val="0"/>
-          <w:i w:val="0"/>
-          <w:color w:val="334155"/>
-          <w:sz w:val="21"/>
-          <w:rFonts w:ascii="Khmer OS Battambang" w:hAnsi="Khmer OS Battambang" w:cs="Khmer OS Battambang"/>
-        </w:rPr>
-        <w:t>នៅខាងក្រោមតារាងរបាយការណ៍ (Report Page)៖ មានផ្ទាំងពណ៌ស គែមពណ៌ខៀវ «ផ្នែកទំនាក់ទំនង និងជំនួយផ្ទាល់ (Telegram Support)» ជាមួយប៊ូតុង «✈️ ផ្ញើសារតាម Telegram (@Kimchheng12)»។</w:t>
-      </w:r>
-    </w:p>
-    <w:p>
-      <w:pPr>
-        <w:pStyle w:val="ListBullet"/>
-        <w:spacing w:before="20" w:after="60" w:line="300" w:lineRule="auto"/>
-      </w:pPr>
-      <w:r>
-        <w:rPr>
-          <w:rFonts w:ascii="Khmer OS Battambang" w:hAnsi="Khmer OS Battambang"/>
-          <w:b w:val="0"/>
-          <w:i w:val="0"/>
-          <w:color w:val="334155"/>
-          <w:sz w:val="21"/>
-          <w:rFonts w:ascii="Khmer OS Battambang" w:hAnsi="Khmer OS Battambang" w:cs="Khmer OS Battambang"/>
-        </w:rPr>
-        <w:t>នៅលើផ្ទាំង Login និង Admin៖ មានតំណភ្ជាប់ទាក់ទងផ្ទាល់ផងដែរ។</w:t>
-      </w:r>
-    </w:p>
-    <w:p>
-      <w:pPr>
-        <w:keepNext/>
-        <w:spacing w:before="400" w:after="120"/>
-        <w:pBdr>
-          <w:bottom w:val="single" w:sz="16" w:space="4" w:color="0284C7"/>
-        </w:pBdr>
-      </w:pPr>
-      <w:r>
-        <w:rPr>
-          <w:rFonts w:ascii="Khmer OS Muol Light" w:hAnsi="Khmer OS Muol Light"/>
-          <w:b/>
-          <w:i w:val="0"/>
-          <w:color w:val="0F172A"/>
-          <w:sz w:val="27"/>
-          <w:rFonts w:ascii="Khmer OS Muol Light" w:hAnsi="Khmer OS Muol Light" w:cs="Khmer OS Muol Light"/>
-        </w:rPr>
-        <w:t>ជំពូកទី ១៤៖ សុវត្ថិភាពគណនី និងគន្លឹះដោះស្រាយបញ្ហាបច្ចេកទេស</w:t>
-      </w:r>
-    </w:p>
-    <w:p>
-      <w:pPr>
-        <w:keepNext/>
-        <w:spacing w:before="280" w:after="80"/>
-      </w:pPr>
-      <w:r>
-        <w:rPr>
-          <w:rFonts w:ascii="Khmer OS Battambang" w:hAnsi="Khmer OS Battambang"/>
-          <w:b/>
-          <w:i w:val="0"/>
-          <w:color w:val="0284C7"/>
-          <w:sz w:val="24"/>
-          <w:rFonts w:ascii="Khmer OS Battambang" w:hAnsi="Khmer OS Battambang" w:cs="Khmer OS Battambang"/>
-        </w:rPr>
-        <w:t>១៤.១. គន្លឹះសុវត្ថិភាពទិន្នន័យ</w:t>
+        <w:t>១៥.២. គន្លឹះសុវត្ថិភាពទិន្នន័យ</w:t>
       </w:r>
     </w:p>
     <w:p>
@@ -4906,7 +6030,7 @@
           <w:sz w:val="24"/>
           <w:rFonts w:ascii="Khmer OS Battambang" w:hAnsi="Khmer OS Battambang" w:cs="Khmer OS Battambang"/>
         </w:rPr>
-        <w:t>១៤.២. របៀបដោះស្រាយនៅពេលប្រព័ន្ធមិនទាន់បង្ហាញទិន្នន័យថ្មី</w:t>
+        <w:t>១៥.៣. របៀបដោះស្រាយនៅពេលប្រព័ន្ធមិនទាន់បង្ហាញទិន្នន័យថ្មី</w:t>
       </w:r>
     </w:p>
     <w:p>

</xml_diff>